<commit_message>
Rewrite the presentation script in plain everyday language
The first script spoke in the deck's academic register, which is hard
to deliver aloud and harder for a mixed audience to follow. Rewrite the
narration for all 21 slides in plain conversational Indonesian: short
sentences, each technical term named once and then explained in everyday
words, and the veil of ignorance, the act versus rule split, and Kant's
universal test each carried by a walkthrough the audience can picture.

The timing, the three-speaker split, the anticipated questions, and the
figures sheet keep their structure; the Q and A answers are rewritten in
the same plain register, and the delivery guide now reminds the speaker
to say each English theory name once and continue with its plain gloss.

Co-Authored-By: Claude Opus 5 <noreply@anthropic.com>
Claude-Session: https://claude.ai/code/session_01AfH2yvsTon6btbkPiZnykT
</commit_message>
<xml_diff>
--- a/business-ethics/Skrip-Presentasi-Business-Ethics-Hilirisasi-Nikel.docx
+++ b/business-ethics/Skrip-Presentasi-Business-Ethics-Hilirisasi-Nikel.docx
@@ -50,7 +50,7 @@
           <w:sz w:val="21"/>
           <w:szCs w:val="21"/>
         </w:rPr>
-        <w:t xml:space="preserve">Naskah pembawaan untuk 21 slide, dengan studi kasus hilirisasi nikel Indonesia</w:t>
+        <w:t xml:space="preserve">Naskah pembawaan 21 slide dalam bahasa sederhana, dengan studi kasus hilirisasi nikel Indonesia</w:t>
       </w:r>
     </w:p>
     <w:tbl>
@@ -441,7 +441,7 @@
                 <w:sz w:val="19"/>
                 <w:szCs w:val="19"/>
               </w:rPr>
-              <w:t xml:space="preserve">Jumlah slide</w:t>
+              <w:t xml:space="preserve">Gaya bahasa</w:t>
             </w:r>
           </w:p>
         </w:tc>
@@ -480,7 +480,7 @@
                 <w:sz w:val="19"/>
                 <w:szCs w:val="19"/>
               </w:rPr>
-              <w:t xml:space="preserve">21 slide</w:t>
+              <w:t xml:space="preserve">Bahasa sehari-hari yang mudah dipahami. Istilah teknis disebut sekali lalu langsung dijelaskan dengan kata sederhana</w:t>
             </w:r>
           </w:p>
         </w:tc>
@@ -532,7 +532,7 @@
           <w:sz w:val="22"/>
           <w:szCs w:val="22"/>
         </w:rPr>
-        <w:t xml:space="preserve">Pembagian di bawah ini menyeimbangkan durasi bicara ketiga anggota pada kisaran sepuluh menit. Susunannya dapat ditukar selama total waktunya tetap dan tiap pergantian pembicara jatuh pada batas bagian, bukan di tengah pembahasan satu teori.</w:t>
+        <w:t xml:space="preserve">Pembagian ini menyeimbangkan durasi bicara ketiga anggota pada kisaran sepuluh menit. Boleh ditukar, asalkan total waktunya tetap dan pergantian pembicara jatuh di batas bagian, bukan di tengah pembahasan satu teori.</w:t>
       </w:r>
     </w:p>
     <w:tbl>
@@ -1266,7 +1266,7 @@
           <w:sz w:val="22"/>
           <w:szCs w:val="22"/>
         </w:rPr>
-        <w:t xml:space="preserve">Naskah ini disusun pada kisaran 130 kata per menit. Bila terasa terburu-buru, yang dipangkas adalah contoh, bukan definisi.</w:t>
+        <w:t xml:space="preserve">Naskah disusun pada kisaran 130 kata per menit. Kalau terasa terburu-buru, pangkas contohnya, jangan pangkas penjelasan intinya.</w:t>
       </w:r>
     </w:p>
     <w:p>
@@ -1303,7 +1303,7 @@
           <w:sz w:val="22"/>
           <w:szCs w:val="22"/>
         </w:rPr>
-        <w:t xml:space="preserve">Slide memuat rumusan padat, naskah memuat kalimat penghubungnya. Bacakan naskah, tunjuk slide seperlunya.</w:t>
+        <w:t xml:space="preserve">Slide berisi rumusan padat, naskah berisi cerita penghubungnya. Bacakan naskah, tunjuk slide seperlunya.</w:t>
       </w:r>
     </w:p>
     <w:p>
@@ -1327,7 +1327,7 @@
           <w:sz w:val="22"/>
           <w:szCs w:val="22"/>
         </w:rPr>
-        <w:t xml:space="preserve">Nomor teori. </w:t>
+        <w:t xml:space="preserve">Istilah teknis. </w:t>
       </w:r>
       <w:r>
         <w:rPr>
@@ -1340,7 +1340,7 @@
           <w:sz w:val="22"/>
           <w:szCs w:val="22"/>
         </w:rPr>
-        <w:t xml:space="preserve">Sebutkan nomor urut setiap kali memperkenalkan teori. Nomor itu dipakai lagi pada matriks slide 19, sehingga pendengar dapat mengikutinya tanpa kembali ke belakang.</w:t>
+        <w:t xml:space="preserve">Sebut nama teorinya sekali dalam bahasa Inggris seperti di slide, lalu langsung jelaskan dengan kata sehari-hari. Setelah itu cukup pakai penjelasan sederhananya.</w:t>
       </w:r>
     </w:p>
     <w:p>
@@ -1364,7 +1364,7 @@
           <w:sz w:val="22"/>
           <w:szCs w:val="22"/>
         </w:rPr>
-        <w:t xml:space="preserve">Angka. </w:t>
+        <w:t xml:space="preserve">Nomor teori. </w:t>
       </w:r>
       <w:r>
         <w:rPr>
@@ -1377,7 +1377,7 @@
           <w:sz w:val="22"/>
           <w:szCs w:val="22"/>
         </w:rPr>
-        <w:t xml:space="preserve">Sebutkan angka utuh sekali saja, lalu rujuk dengan istilah pendek. Contoh, sebut 166 ribu pekerja sekali, selanjutnya cukup katakan penyerapan tenaga kerjanya.</w:t>
+        <w:t xml:space="preserve">Sebutkan nomor urut setiap kali membuka teori baru. Nomor yang sama muncul lagi di matriks slide 19, jadi pendengar mudah mengikuti.</w:t>
       </w:r>
     </w:p>
     <w:p>
@@ -1401,7 +1401,7 @@
           <w:sz w:val="22"/>
           <w:szCs w:val="22"/>
         </w:rPr>
-        <w:t xml:space="preserve">Serah terima. </w:t>
+        <w:t xml:space="preserve">Angka. </w:t>
       </w:r>
       <w:r>
         <w:rPr>
@@ -1414,7 +1414,7 @@
           <w:sz w:val="22"/>
           <w:szCs w:val="22"/>
         </w:rPr>
-        <w:t xml:space="preserve">Ada empat titik pergantian pembicara, yaitu setelah slide 5, 10, 14, dan 19, ditambah dua pergantian pendek pada slide 15 sampai 18. Sebutkan nama penerimanya secara singkat.</w:t>
+        <w:t xml:space="preserve">Sebutkan angka lengkap sekali saja, setelah itu rujuk dengan kata pendek. Contoh: sebut 166 ribu pekerja sekali, selanjutnya cukup bilang penyerapan kerjanya.</w:t>
       </w:r>
     </w:p>
     <w:p>
@@ -1438,7 +1438,7 @@
           <w:sz w:val="22"/>
           <w:szCs w:val="22"/>
         </w:rPr>
-        <w:t xml:space="preserve">Cadangan waktu. </w:t>
+        <w:t xml:space="preserve">Serah terima. </w:t>
       </w:r>
       <w:r>
         <w:rPr>
@@ -1451,7 +1451,44 @@
           <w:sz w:val="22"/>
           <w:szCs w:val="22"/>
         </w:rPr>
-        <w:t xml:space="preserve">Bila tersisa kurang dari dua menit ketika sampai slide 18, ringkas slide 18 menjadi dua kalimat per teori dan pertahankan slide 19 secara utuh.</w:t>
+        <w:t xml:space="preserve">Ada empat titik pergantian pembicara: setelah slide 5, 10, 14, dan 19, ditambah pergantian pendek di slide 15 sampai 18. Sebut nama penerimanya singkat saja.</w:t>
+      </w:r>
+    </w:p>
+    <w:p>
+      <w:pPr>
+        <w:pStyle w:val="ListParagraph"/>
+        <w:numPr>
+          <w:ilvl w:val="0"/>
+          <w:numId w:val="2"/>
+        </w:numPr>
+        <w:spacing w:after="80" w:line="288"/>
+        <w:jc w:val="both"/>
+      </w:pPr>
+      <w:r>
+        <w:rPr>
+          <w:rFonts w:ascii="Times New Roman" w:cs="Times New Roman" w:eastAsia="Times New Roman" w:hAnsi="Times New Roman"/>
+          <w:b/>
+          <w:bCs/>
+          <w:i w:val="false"/>
+          <w:iCs w:val="false"/>
+          <w:color w:val="16151F"/>
+          <w:sz w:val="22"/>
+          <w:szCs w:val="22"/>
+        </w:rPr>
+        <w:t xml:space="preserve">Cadangan waktu. </w:t>
+      </w:r>
+      <w:r>
+        <w:rPr>
+          <w:rFonts w:ascii="Times New Roman" w:cs="Times New Roman" w:eastAsia="Times New Roman" w:hAnsi="Times New Roman"/>
+          <w:b w:val="false"/>
+          <w:bCs w:val="false"/>
+          <w:i w:val="false"/>
+          <w:iCs w:val="false"/>
+          <w:color w:val="16151F"/>
+          <w:sz w:val="22"/>
+          <w:szCs w:val="22"/>
+        </w:rPr>
+        <w:t xml:space="preserve">Kalau sisa waktu kurang dari dua menit saat tiba di slide 18, ringkas slide 18 jadi dua kalimat per teori dan pertahankan slide 19 utuh.</w:t>
       </w:r>
     </w:p>
     <w:p>
@@ -1572,70 +1609,70 @@
           <w:sz w:val="21"/>
           <w:szCs w:val="21"/>
         </w:rPr>
-        <w:t xml:space="preserve">Selamat pagi Bapak Ibu dan teman-teman. Kami bertiga, Aslih Abnuri, Arfinal Diputra, dan Rohana Dwi Hardianti, akan membahas Bab 3 buku Crane dan Matten, Evaluating Business Ethics: Normative Ethical Theories.</w:t>
-      </w:r>
-    </w:p>
-    <w:p>
-      <w:pPr>
-        <w:keepNext w:val="false"/>
-        <w:spacing w:after="110" w:before="0" w:line="300"/>
-        <w:jc w:val="both"/>
-      </w:pPr>
-      <w:r>
-        <w:rPr>
-          <w:rFonts w:ascii="Times New Roman" w:cs="Times New Roman" w:eastAsia="Times New Roman" w:hAnsi="Times New Roman"/>
-          <w:b w:val="false"/>
-          <w:bCs w:val="false"/>
-          <w:i w:val="false"/>
-          <w:iCs w:val="false"/>
-          <w:caps w:val="false"/>
-          <w:color w:val="16151F"/>
-          <w:sz w:val="21"/>
-          <w:szCs w:val="21"/>
-        </w:rPr>
-        <w:t xml:space="preserve">Bab ini menjawab satu pertanyaan yang kelihatan sederhana. Ketika kita menyebut sebuah keputusan bisnis itu etis atau tidak etis, apa dasar penilaiannya. Dalam urusan pribadi intuisi biasanya sudah cukup. Dalam konteks bisnis, penilaian itu harus bisa dipertahankan di hadapan pemegang saham, regulator, pekerja, dan masyarakat sekitar.</w:t>
-      </w:r>
-    </w:p>
-    <w:p>
-      <w:pPr>
-        <w:keepNext w:val="false"/>
-        <w:spacing w:after="110" w:before="0" w:line="300"/>
-        <w:jc w:val="both"/>
-      </w:pPr>
-      <w:r>
-        <w:rPr>
-          <w:rFonts w:ascii="Times New Roman" w:cs="Times New Roman" w:eastAsia="Times New Roman" w:hAnsi="Times New Roman"/>
-          <w:b w:val="false"/>
-          <w:bCs w:val="false"/>
-          <w:i w:val="false"/>
-          <w:iCs w:val="false"/>
-          <w:caps w:val="false"/>
-          <w:color w:val="16151F"/>
-          <w:sz w:val="21"/>
-          <w:szCs w:val="21"/>
-        </w:rPr>
-        <w:t xml:space="preserve">Bab 3 memberikan sembilan kriteria penilaian. Sembilan kriteria itu yang akan kami pakai untuk menguji satu kebijakan yang masih berjalan sampai hari ini, yaitu hilirisasi nikel Indonesia.</w:t>
-      </w:r>
-    </w:p>
-    <w:p>
-      <w:pPr>
-        <w:keepNext w:val="false"/>
-        <w:spacing w:after="110" w:before="0" w:line="300"/>
-        <w:jc w:val="both"/>
-      </w:pPr>
-      <w:r>
-        <w:rPr>
-          <w:rFonts w:ascii="Times New Roman" w:cs="Times New Roman" w:eastAsia="Times New Roman" w:hAnsi="Times New Roman"/>
-          <w:b w:val="false"/>
-          <w:bCs w:val="false"/>
-          <w:i w:val="false"/>
-          <w:iCs w:val="false"/>
-          <w:caps w:val="false"/>
-          <w:color w:val="16151F"/>
-          <w:sz w:val="21"/>
-          <w:szCs w:val="21"/>
-        </w:rPr>
-        <w:t xml:space="preserve">Waktu kami tiga puluh menit, dengan pembagian tujuh belas menit untuk teori, sebelas menit untuk kasus, dan dua menit untuk penutup.</w:t>
+        <w:t xml:space="preserve">Selamat pagi Bapak Ibu dan teman-teman. Kami bertiga: saya Aslih, lalu Arfinal, dan Rohana. Hari ini kami membawakan Bab 3 dari buku Crane dan Matten, judulnya Evaluating Business Ethics.</w:t>
+      </w:r>
+    </w:p>
+    <w:p>
+      <w:pPr>
+        <w:keepNext w:val="false"/>
+        <w:spacing w:after="110" w:before="0" w:line="300"/>
+        <w:jc w:val="both"/>
+      </w:pPr>
+      <w:r>
+        <w:rPr>
+          <w:rFonts w:ascii="Times New Roman" w:cs="Times New Roman" w:eastAsia="Times New Roman" w:hAnsi="Times New Roman"/>
+          <w:b w:val="false"/>
+          <w:bCs w:val="false"/>
+          <w:i w:val="false"/>
+          <w:iCs w:val="false"/>
+          <w:caps w:val="false"/>
+          <w:color w:val="16151F"/>
+          <w:sz w:val="21"/>
+          <w:szCs w:val="21"/>
+        </w:rPr>
+        <w:t xml:space="preserve">Bab ini sebenarnya menjawab satu pertanyaan sederhana. Kalau kita bilang sebuah keputusan bisnis itu etis atau tidak etis, dasarnya apa? Kalau urusan pribadi, perasaan kita biasanya sudah cukup. Tapi keputusan perusahaan berbeda. Keputusan itu harus bisa dijelaskan ke banyak pihak: pemegang saham, pemerintah, pekerja, sampai warga di sekitar pabrik.</w:t>
+      </w:r>
+    </w:p>
+    <w:p>
+      <w:pPr>
+        <w:keepNext w:val="false"/>
+        <w:spacing w:after="110" w:before="0" w:line="300"/>
+        <w:jc w:val="both"/>
+      </w:pPr>
+      <w:r>
+        <w:rPr>
+          <w:rFonts w:ascii="Times New Roman" w:cs="Times New Roman" w:eastAsia="Times New Roman" w:hAnsi="Times New Roman"/>
+          <w:b w:val="false"/>
+          <w:bCs w:val="false"/>
+          <w:i w:val="false"/>
+          <w:iCs w:val="false"/>
+          <w:caps w:val="false"/>
+          <w:color w:val="16151F"/>
+          <w:sz w:val="21"/>
+          <w:szCs w:val="21"/>
+        </w:rPr>
+        <w:t xml:space="preserve">Bab 3 memberi kita sembilan alat uji. Nanti kesembilan alat itu kami pakai untuk menguji satu kebijakan yang masih berjalan sampai sekarang, yaitu hilirisasi nikel Indonesia.</w:t>
+      </w:r>
+    </w:p>
+    <w:p>
+      <w:pPr>
+        <w:keepNext w:val="false"/>
+        <w:spacing w:after="110" w:before="0" w:line="300"/>
+        <w:jc w:val="both"/>
+      </w:pPr>
+      <w:r>
+        <w:rPr>
+          <w:rFonts w:ascii="Times New Roman" w:cs="Times New Roman" w:eastAsia="Times New Roman" w:hAnsi="Times New Roman"/>
+          <w:b w:val="false"/>
+          <w:bCs w:val="false"/>
+          <w:i w:val="false"/>
+          <w:iCs w:val="false"/>
+          <w:caps w:val="false"/>
+          <w:color w:val="16151F"/>
+          <w:sz w:val="21"/>
+          <w:szCs w:val="21"/>
+        </w:rPr>
+        <w:t xml:space="preserve">Waktu kami 30 menit. Kurang lebih 17 menit untuk teori, 11 menit untuk kasus, dan 2 menit penutup.</w:t>
       </w:r>
     </w:p>
     <w:tbl>
@@ -1712,7 +1749,7 @@
                 <w:sz w:val="20"/>
                 <w:szCs w:val="20"/>
               </w:rPr>
-              <w:t xml:space="preserve">Lanjut ke slide 2 sambil mengatakan: sebelum masuk, saya sampaikan dulu alur pembahasannya.</w:t>
+              <w:t xml:space="preserve">Lanjut ke slide 2 sambil bilang: sebelum masuk, ini dulu peta jalannya.</w:t>
             </w:r>
           </w:p>
         </w:tc>
@@ -1802,49 +1839,49 @@
           <w:sz w:val="21"/>
           <w:szCs w:val="21"/>
         </w:rPr>
-        <w:t xml:space="preserve">Presentasi ini terbagi dua. Bagian pertama membangun kerangka penilaian: peran teori normatif, posisi absolutisme sampai pluralisme, klasifikasi sembilan teori, lima teori modernis Barat, keterbatasannya, lalu empat teori alternatif.</w:t>
-      </w:r>
-    </w:p>
-    <w:p>
-      <w:pPr>
-        <w:keepNext w:val="false"/>
-        <w:spacing w:after="110" w:before="0" w:line="300"/>
-        <w:jc w:val="both"/>
-      </w:pPr>
-      <w:r>
-        <w:rPr>
-          <w:rFonts w:ascii="Times New Roman" w:cs="Times New Roman" w:eastAsia="Times New Roman" w:hAnsi="Times New Roman"/>
-          <w:b w:val="false"/>
-          <w:bCs w:val="false"/>
-          <w:i w:val="false"/>
-          <w:iCs w:val="false"/>
-          <w:caps w:val="false"/>
-          <w:color w:val="16151F"/>
-          <w:sz w:val="21"/>
-          <w:szCs w:val="21"/>
-        </w:rPr>
-        <w:t xml:space="preserve">Bagian kedua menerapkan kerangka itu pada hilirisasi nikel: anatomi kebijakan dan sengketanya, dua narasi atas fakta yang sama, penilaian sembilan teori, sintesis, dan implikasi manajerial.</w:t>
-      </w:r>
-    </w:p>
-    <w:p>
-      <w:pPr>
-        <w:keepNext w:val="false"/>
-        <w:spacing w:after="110" w:before="0" w:line="300"/>
-        <w:jc w:val="both"/>
-      </w:pPr>
-      <w:r>
-        <w:rPr>
-          <w:rFonts w:ascii="Times New Roman" w:cs="Times New Roman" w:eastAsia="Times New Roman" w:hAnsi="Times New Roman"/>
-          <w:b w:val="false"/>
-          <w:bCs w:val="false"/>
-          <w:i w:val="false"/>
-          <w:iCs w:val="false"/>
-          <w:caps w:val="false"/>
-          <w:color w:val="16151F"/>
-          <w:sz w:val="21"/>
-          <w:szCs w:val="21"/>
-        </w:rPr>
-        <w:t xml:space="preserve">Urutan ini kami pilih dengan sengaja. Kalau kasusnya dibahas lebih dulu, diskusi biasanya berhenti pada adu data. Teori memberi alat untuk menilai data yang sama secara berbeda.</w:t>
+        <w:t xml:space="preserve">Presentasi ini ada dua bagian. Bagian satu kita siapkan dulu alat ujinya: apa itu teori etika, ada berapa macam, apa kelebihan dan kekurangannya.</w:t>
+      </w:r>
+    </w:p>
+    <w:p>
+      <w:pPr>
+        <w:keepNext w:val="false"/>
+        <w:spacing w:after="110" w:before="0" w:line="300"/>
+        <w:jc w:val="both"/>
+      </w:pPr>
+      <w:r>
+        <w:rPr>
+          <w:rFonts w:ascii="Times New Roman" w:cs="Times New Roman" w:eastAsia="Times New Roman" w:hAnsi="Times New Roman"/>
+          <w:b w:val="false"/>
+          <w:bCs w:val="false"/>
+          <w:i w:val="false"/>
+          <w:iCs w:val="false"/>
+          <w:caps w:val="false"/>
+          <w:color w:val="16151F"/>
+          <w:sz w:val="21"/>
+          <w:szCs w:val="21"/>
+        </w:rPr>
+        <w:t xml:space="preserve">Bagian dua baru kita pakai alat itu untuk membedah kasus nikel: kebijakannya seperti apa, faktanya bagaimana, lalu apa kata sembilan teori tadi.</w:t>
+      </w:r>
+    </w:p>
+    <w:p>
+      <w:pPr>
+        <w:keepNext w:val="false"/>
+        <w:spacing w:after="110" w:before="0" w:line="300"/>
+        <w:jc w:val="both"/>
+      </w:pPr>
+      <w:r>
+        <w:rPr>
+          <w:rFonts w:ascii="Times New Roman" w:cs="Times New Roman" w:eastAsia="Times New Roman" w:hAnsi="Times New Roman"/>
+          <w:b w:val="false"/>
+          <w:bCs w:val="false"/>
+          <w:i w:val="false"/>
+          <w:iCs w:val="false"/>
+          <w:caps w:val="false"/>
+          <w:color w:val="16151F"/>
+          <w:sz w:val="21"/>
+          <w:szCs w:val="21"/>
+        </w:rPr>
+        <w:t xml:space="preserve">Kenapa teorinya duluan? Karena kalau kasusnya duluan, biasanya diskusi berhenti di adu angka. Teori memberi kita cara menilai angka yang sama dari sudut yang berbeda.</w:t>
       </w:r>
     </w:p>
     <w:tbl>
@@ -1921,7 +1958,7 @@
                 <w:sz w:val="20"/>
                 <w:szCs w:val="20"/>
               </w:rPr>
-              <w:t xml:space="preserve">Jangan berlama-lama di slide ini. Cukup tunjukkan peta jalannya, lalu langsung lanjut.</w:t>
+              <w:t xml:space="preserve">Jangan lama-lama di sini. Tunjukkan alurnya, langsung lanjut.</w:t>
             </w:r>
           </w:p>
         </w:tc>
@@ -2011,91 +2048,112 @@
           <w:sz w:val="21"/>
           <w:szCs w:val="21"/>
         </w:rPr>
-        <w:t xml:space="preserve">Crane dan Matten mendefinisikan teori etika normatif sebagai aturan, pedoman, prinsip, dan pendekatan yang menentukan benar dan salah. Ada tiga alasan mengapa teori semacam ini diperlukan.</w:t>
-      </w:r>
-    </w:p>
-    <w:p>
-      <w:pPr>
-        <w:keepNext w:val="false"/>
-        <w:spacing w:after="110" w:before="0" w:line="300"/>
-        <w:jc w:val="both"/>
-      </w:pPr>
-      <w:r>
-        <w:rPr>
-          <w:rFonts w:ascii="Times New Roman" w:cs="Times New Roman" w:eastAsia="Times New Roman" w:hAnsi="Times New Roman"/>
-          <w:b w:val="false"/>
-          <w:bCs w:val="false"/>
-          <w:i w:val="false"/>
-          <w:iCs w:val="false"/>
-          <w:caps w:val="false"/>
-          <w:color w:val="16151F"/>
-          <w:sz w:val="21"/>
-          <w:szCs w:val="21"/>
-        </w:rPr>
-        <w:t xml:space="preserve">Pertama, rasionalisasi intuisi moral. Teori tidak menggantikan intuisi, ia merapikannya. Kita sudah punya perasaan tentang mana yang benar dan mana yang salah, dan teori membantu menjelaskan mengapa perasaan itu muncul.</w:t>
-      </w:r>
-    </w:p>
-    <w:p>
-      <w:pPr>
-        <w:keepNext w:val="false"/>
-        <w:spacing w:after="110" w:before="0" w:line="300"/>
-        <w:jc w:val="both"/>
-      </w:pPr>
-      <w:r>
-        <w:rPr>
-          <w:rFonts w:ascii="Times New Roman" w:cs="Times New Roman" w:eastAsia="Times New Roman" w:hAnsi="Times New Roman"/>
-          <w:b w:val="false"/>
-          <w:bCs w:val="false"/>
-          <w:i w:val="false"/>
-          <w:iCs w:val="false"/>
-          <w:caps w:val="false"/>
-          <w:color w:val="16151F"/>
-          <w:sz w:val="21"/>
-          <w:szCs w:val="21"/>
-        </w:rPr>
-        <w:t xml:space="preserve">Kedua, dasar diskusi rasional. Ketika dua pihak berangkat dari nilai yang berbeda, teori memungkinkan keduanya berdebat pada tataran argumen, bukan berhenti pada tataran selera.</w:t>
-      </w:r>
-    </w:p>
-    <w:p>
-      <w:pPr>
-        <w:keepNext w:val="false"/>
-        <w:spacing w:after="110" w:before="0" w:line="300"/>
-        <w:jc w:val="both"/>
-      </w:pPr>
-      <w:r>
-        <w:rPr>
-          <w:rFonts w:ascii="Times New Roman" w:cs="Times New Roman" w:eastAsia="Times New Roman" w:hAnsi="Times New Roman"/>
-          <w:b w:val="false"/>
-          <w:bCs w:val="false"/>
-          <w:i w:val="false"/>
-          <w:iCs w:val="false"/>
-          <w:caps w:val="false"/>
-          <w:color w:val="16151F"/>
-          <w:sz w:val="21"/>
-          <w:szCs w:val="21"/>
-        </w:rPr>
-        <w:t xml:space="preserve">Ketiga, justifikasi keputusan bisnis. Keputusan perusahaan menuntut dasar yang sistematis dan dapat dipertanggungjawabkan kepada pemangku kepentingan.</w:t>
-      </w:r>
-    </w:p>
-    <w:p>
-      <w:pPr>
-        <w:keepNext w:val="false"/>
-        <w:spacing w:after="110" w:before="0" w:line="300"/>
-        <w:jc w:val="both"/>
-      </w:pPr>
-      <w:r>
-        <w:rPr>
-          <w:rFonts w:ascii="Times New Roman" w:cs="Times New Roman" w:eastAsia="Times New Roman" w:hAnsi="Times New Roman"/>
-          <w:b w:val="false"/>
-          <w:bCs w:val="false"/>
-          <w:i w:val="false"/>
-          <w:iCs w:val="false"/>
-          <w:caps w:val="false"/>
-          <w:color w:val="16151F"/>
-          <w:sz w:val="21"/>
-          <w:szCs w:val="21"/>
-        </w:rPr>
-        <w:t xml:space="preserve">Satu pembeda yang penting di sini. Ada bedanya antara mengatakan praktik di negara lain itu berbeda, dengan mengatakan praktik itu salah. Yang pertama pengamatan, yang kedua penilaian. Teori normatif bekerja pada yang kedua.</w:t>
+        <w:t xml:space="preserve">Pertama, apa sih teori etika normatif itu? Sederhananya: seperangkat aturan dan cara berpikir untuk menentukan mana yang benar dan mana yang salah. Itu definisi dari Crane dan Matten.</w:t>
+      </w:r>
+    </w:p>
+    <w:p>
+      <w:pPr>
+        <w:keepNext w:val="false"/>
+        <w:spacing w:after="110" w:before="0" w:line="300"/>
+        <w:jc w:val="both"/>
+      </w:pPr>
+      <w:r>
+        <w:rPr>
+          <w:rFonts w:ascii="Times New Roman" w:cs="Times New Roman" w:eastAsia="Times New Roman" w:hAnsi="Times New Roman"/>
+          <w:b w:val="false"/>
+          <w:bCs w:val="false"/>
+          <w:i w:val="false"/>
+          <w:iCs w:val="false"/>
+          <w:caps w:val="false"/>
+          <w:color w:val="16151F"/>
+          <w:sz w:val="21"/>
+          <w:szCs w:val="21"/>
+        </w:rPr>
+        <w:t xml:space="preserve">Buat apa repot-repot pakai teori? Ada tiga alasan.</w:t>
+      </w:r>
+    </w:p>
+    <w:p>
+      <w:pPr>
+        <w:keepNext w:val="false"/>
+        <w:spacing w:after="110" w:before="0" w:line="300"/>
+        <w:jc w:val="both"/>
+      </w:pPr>
+      <w:r>
+        <w:rPr>
+          <w:rFonts w:ascii="Times New Roman" w:cs="Times New Roman" w:eastAsia="Times New Roman" w:hAnsi="Times New Roman"/>
+          <w:b w:val="false"/>
+          <w:bCs w:val="false"/>
+          <w:i w:val="false"/>
+          <w:iCs w:val="false"/>
+          <w:caps w:val="false"/>
+          <w:color w:val="16151F"/>
+          <w:sz w:val="21"/>
+          <w:szCs w:val="21"/>
+        </w:rPr>
+        <w:t xml:space="preserve">Satu, teori merapikan perasaan kita. Kita sering merasa sesuatu itu salah tapi susah menjelaskan kenapa. Teori membantu mengubah perasaan itu jadi alasan yang jelas.</w:t>
+      </w:r>
+    </w:p>
+    <w:p>
+      <w:pPr>
+        <w:keepNext w:val="false"/>
+        <w:spacing w:after="110" w:before="0" w:line="300"/>
+        <w:jc w:val="both"/>
+      </w:pPr>
+      <w:r>
+        <w:rPr>
+          <w:rFonts w:ascii="Times New Roman" w:cs="Times New Roman" w:eastAsia="Times New Roman" w:hAnsi="Times New Roman"/>
+          <w:b w:val="false"/>
+          <w:bCs w:val="false"/>
+          <w:i w:val="false"/>
+          <w:iCs w:val="false"/>
+          <w:caps w:val="false"/>
+          <w:color w:val="16151F"/>
+          <w:sz w:val="21"/>
+          <w:szCs w:val="21"/>
+        </w:rPr>
+        <w:t xml:space="preserve">Dua, teori membuat diskusi jadi mungkin. Kalau dua orang punya nilai yang berbeda, tanpa teori ujungnya cuma selera lawan selera. Dengan teori, keduanya bisa beradu argumen.</w:t>
+      </w:r>
+    </w:p>
+    <w:p>
+      <w:pPr>
+        <w:keepNext w:val="false"/>
+        <w:spacing w:after="110" w:before="0" w:line="300"/>
+        <w:jc w:val="both"/>
+      </w:pPr>
+      <w:r>
+        <w:rPr>
+          <w:rFonts w:ascii="Times New Roman" w:cs="Times New Roman" w:eastAsia="Times New Roman" w:hAnsi="Times New Roman"/>
+          <w:b w:val="false"/>
+          <w:bCs w:val="false"/>
+          <w:i w:val="false"/>
+          <w:iCs w:val="false"/>
+          <w:caps w:val="false"/>
+          <w:color w:val="16151F"/>
+          <w:sz w:val="21"/>
+          <w:szCs w:val="21"/>
+        </w:rPr>
+        <w:t xml:space="preserve">Tiga, keputusan bisnis butuh pertanggungjawaban. Perusahaan harus bisa menjelaskan alasannya secara masuk akal ke semua pihak yang terkena dampak.</w:t>
+      </w:r>
+    </w:p>
+    <w:p>
+      <w:pPr>
+        <w:keepNext w:val="false"/>
+        <w:spacing w:after="110" w:before="0" w:line="300"/>
+        <w:jc w:val="both"/>
+      </w:pPr>
+      <w:r>
+        <w:rPr>
+          <w:rFonts w:ascii="Times New Roman" w:cs="Times New Roman" w:eastAsia="Times New Roman" w:hAnsi="Times New Roman"/>
+          <w:b w:val="false"/>
+          <w:bCs w:val="false"/>
+          <w:i w:val="false"/>
+          <w:iCs w:val="false"/>
+          <w:caps w:val="false"/>
+          <w:color w:val="16151F"/>
+          <w:sz w:val="21"/>
+          <w:szCs w:val="21"/>
+        </w:rPr>
+        <w:t xml:space="preserve">Satu hal penting sebelum lanjut. Bilang praktik di negara lain itu berbeda, itu pengamatan. Bilang praktik itu salah, itu penilaian. Teori bekerja di yang kedua.</w:t>
       </w:r>
     </w:p>
     <w:tbl>
@@ -2172,7 +2230,7 @@
                 <w:sz w:val="20"/>
                 <w:szCs w:val="20"/>
               </w:rPr>
-              <w:t xml:space="preserve">Kalimat pembeda di akhir adalah pemantik. Beri jeda sebentar sebelum pindah slide.</w:t>
+              <w:t xml:space="preserve">Kalimat terakhir itu pemantik. Beri jeda dua detik sebelum pindah.</w:t>
             </w:r>
           </w:p>
         </w:tc>
@@ -2262,91 +2320,112 @@
           <w:sz w:val="21"/>
           <w:szCs w:val="21"/>
         </w:rPr>
-        <w:t xml:space="preserve">Sebelum menerapkan teori apa pun, ada satu hal yang perlu ditetapkan lebih dulu, yaitu seberapa luas klaim keberlakuan yang diajukan teori itu.</w:t>
-      </w:r>
-    </w:p>
-    <w:p>
-      <w:pPr>
-        <w:keepNext w:val="false"/>
-        <w:spacing w:after="110" w:before="0" w:line="300"/>
-        <w:jc w:val="both"/>
-      </w:pPr>
-      <w:r>
-        <w:rPr>
-          <w:rFonts w:ascii="Times New Roman" w:cs="Times New Roman" w:eastAsia="Times New Roman" w:hAnsi="Times New Roman"/>
-          <w:b w:val="false"/>
-          <w:bCs w:val="false"/>
-          <w:i w:val="false"/>
-          <w:iCs w:val="false"/>
-          <w:caps w:val="false"/>
-          <w:color w:val="16151F"/>
-          <w:sz w:val="21"/>
-          <w:szCs w:val="21"/>
-        </w:rPr>
-        <w:t xml:space="preserve">Absolutisme etis berpandangan ada prinsip moral yang universal dan abadi. Benar dan salah adalah kualitas objektif yang ditentukan lewat nalar, terlepas dari keadaan. Hampir seluruh teori modernis Barat berada di posisi ini.</w:t>
-      </w:r>
-    </w:p>
-    <w:p>
-      <w:pPr>
-        <w:keepNext w:val="false"/>
-        <w:spacing w:after="110" w:before="0" w:line="300"/>
-        <w:jc w:val="both"/>
-      </w:pPr>
-      <w:r>
-        <w:rPr>
-          <w:rFonts w:ascii="Times New Roman" w:cs="Times New Roman" w:eastAsia="Times New Roman" w:hAnsi="Times New Roman"/>
-          <w:b w:val="false"/>
-          <w:bCs w:val="false"/>
-          <w:i w:val="false"/>
-          <w:iCs w:val="false"/>
-          <w:caps w:val="false"/>
-          <w:color w:val="16151F"/>
-          <w:sz w:val="21"/>
-          <w:szCs w:val="21"/>
-        </w:rPr>
-        <w:t xml:space="preserve">Relativisme etis mengambil posisi sebaliknya. Tidak ada benar dan salah yang universal. Semuanya bergantung pada tradisi, keyakinan, dan praktik pihak yang memutuskan.</w:t>
-      </w:r>
-    </w:p>
-    <w:p>
-      <w:pPr>
-        <w:keepNext w:val="false"/>
-        <w:spacing w:after="110" w:before="0" w:line="300"/>
-        <w:jc w:val="both"/>
-      </w:pPr>
-      <w:r>
-        <w:rPr>
-          <w:rFonts w:ascii="Times New Roman" w:cs="Times New Roman" w:eastAsia="Times New Roman" w:hAnsi="Times New Roman"/>
-          <w:b w:val="false"/>
-          <w:bCs w:val="false"/>
-          <w:i w:val="false"/>
-          <w:iCs w:val="false"/>
-          <w:caps w:val="false"/>
-          <w:color w:val="16151F"/>
-          <w:sz w:val="21"/>
-          <w:szCs w:val="21"/>
-        </w:rPr>
-        <w:t xml:space="preserve">Crane dan Matten sendiri memilih posisi ketiga, yaitu pluralisme etis. Nilai yang bertentangan dapat sama sahnya. Pluralisme tidak menyamaratakan seluruh perspektif, tetapi juga tidak mengunggulkan satu di atas yang lain.</w:t>
-      </w:r>
-    </w:p>
-    <w:p>
-      <w:pPr>
-        <w:keepNext w:val="false"/>
-        <w:spacing w:after="110" w:before="0" w:line="300"/>
-        <w:jc w:val="both"/>
-      </w:pPr>
-      <w:r>
-        <w:rPr>
-          <w:rFonts w:ascii="Times New Roman" w:cs="Times New Roman" w:eastAsia="Times New Roman" w:hAnsi="Times New Roman"/>
-          <w:b w:val="false"/>
-          <w:bCs w:val="false"/>
-          <w:i w:val="false"/>
-          <w:iCs w:val="false"/>
-          <w:caps w:val="false"/>
-          <w:color w:val="16151F"/>
-          <w:sz w:val="21"/>
-          <w:szCs w:val="21"/>
-        </w:rPr>
-        <w:t xml:space="preserve">Contoh yang biasa dipakai adalah suap. Absolutis mengatakan selalu salah. Relativis mengatakan tergantung negaranya. Pluralis bertanya kriteria mana yang paling kuat menanggung beban argumen dalam situasi tersebut.</w:t>
+        <w:t xml:space="preserve">Sebelum pakai teorinya, kita tentukan dulu sikap dasar. Ada tiga pilihan.</w:t>
+      </w:r>
+    </w:p>
+    <w:p>
+      <w:pPr>
+        <w:keepNext w:val="false"/>
+        <w:spacing w:after="110" w:before="0" w:line="300"/>
+        <w:jc w:val="both"/>
+      </w:pPr>
+      <w:r>
+        <w:rPr>
+          <w:rFonts w:ascii="Times New Roman" w:cs="Times New Roman" w:eastAsia="Times New Roman" w:hAnsi="Times New Roman"/>
+          <w:b w:val="false"/>
+          <w:bCs w:val="false"/>
+          <w:i w:val="false"/>
+          <w:iCs w:val="false"/>
+          <w:caps w:val="false"/>
+          <w:color w:val="16151F"/>
+          <w:sz w:val="21"/>
+          <w:szCs w:val="21"/>
+        </w:rPr>
+        <w:t xml:space="preserve">Absolutisme bilang: ada aturan moral yang berlaku untuk semua orang, di mana pun, kapan pun. Benar ya benar, salah ya salah.</w:t>
+      </w:r>
+    </w:p>
+    <w:p>
+      <w:pPr>
+        <w:keepNext w:val="false"/>
+        <w:spacing w:after="110" w:before="0" w:line="300"/>
+        <w:jc w:val="both"/>
+      </w:pPr>
+      <w:r>
+        <w:rPr>
+          <w:rFonts w:ascii="Times New Roman" w:cs="Times New Roman" w:eastAsia="Times New Roman" w:hAnsi="Times New Roman"/>
+          <w:b w:val="false"/>
+          <w:bCs w:val="false"/>
+          <w:i w:val="false"/>
+          <w:iCs w:val="false"/>
+          <w:caps w:val="false"/>
+          <w:color w:val="16151F"/>
+          <w:sz w:val="21"/>
+          <w:szCs w:val="21"/>
+        </w:rPr>
+        <w:t xml:space="preserve">Relativisme bilang sebaliknya: tidak ada benar salah yang universal. Semua tergantung budaya dan kebiasaan masing-masing tempat.</w:t>
+      </w:r>
+    </w:p>
+    <w:p>
+      <w:pPr>
+        <w:keepNext w:val="false"/>
+        <w:spacing w:after="110" w:before="0" w:line="300"/>
+        <w:jc w:val="both"/>
+      </w:pPr>
+      <w:r>
+        <w:rPr>
+          <w:rFonts w:ascii="Times New Roman" w:cs="Times New Roman" w:eastAsia="Times New Roman" w:hAnsi="Times New Roman"/>
+          <w:b w:val="false"/>
+          <w:bCs w:val="false"/>
+          <w:i w:val="false"/>
+          <w:iCs w:val="false"/>
+          <w:caps w:val="false"/>
+          <w:color w:val="16151F"/>
+          <w:sz w:val="21"/>
+          <w:szCs w:val="21"/>
+        </w:rPr>
+        <w:t xml:space="preserve">Crane dan Matten mengambil jalan tengah, namanya pluralisme. Nilai yang bertentangan bisa sama-sama masuk akal. Kita tidak bilang semua pendapat benar, tapi kita juga tidak memaksakan satu pendapat sebagai satu-satunya kebenaran.</w:t>
+      </w:r>
+    </w:p>
+    <w:p>
+      <w:pPr>
+        <w:keepNext w:val="false"/>
+        <w:spacing w:after="110" w:before="0" w:line="300"/>
+        <w:jc w:val="both"/>
+      </w:pPr>
+      <w:r>
+        <w:rPr>
+          <w:rFonts w:ascii="Times New Roman" w:cs="Times New Roman" w:eastAsia="Times New Roman" w:hAnsi="Times New Roman"/>
+          <w:b w:val="false"/>
+          <w:bCs w:val="false"/>
+          <w:i w:val="false"/>
+          <w:iCs w:val="false"/>
+          <w:caps w:val="false"/>
+          <w:color w:val="16151F"/>
+          <w:sz w:val="21"/>
+          <w:szCs w:val="21"/>
+        </w:rPr>
+        <w:t xml:space="preserve">Contoh gampangnya: suap. Orang absolutis bilang suap selalu salah. Orang relativis bilang tergantung negaranya. Orang pluralis bertanya: alasan mana yang paling kuat kalau diadu?</w:t>
+      </w:r>
+    </w:p>
+    <w:p>
+      <w:pPr>
+        <w:keepNext w:val="false"/>
+        <w:spacing w:after="110" w:before="0" w:line="300"/>
+        <w:jc w:val="both"/>
+      </w:pPr>
+      <w:r>
+        <w:rPr>
+          <w:rFonts w:ascii="Times New Roman" w:cs="Times New Roman" w:eastAsia="Times New Roman" w:hAnsi="Times New Roman"/>
+          <w:b w:val="false"/>
+          <w:bCs w:val="false"/>
+          <w:i w:val="false"/>
+          <w:iCs w:val="false"/>
+          <w:caps w:val="false"/>
+          <w:color w:val="16151F"/>
+          <w:sz w:val="21"/>
+          <w:szCs w:val="21"/>
+        </w:rPr>
+        <w:t xml:space="preserve">Sikap pluralis inilah yang kami pakai sepanjang presentasi ini.</w:t>
       </w:r>
     </w:p>
     <w:tbl>
@@ -2423,7 +2502,7 @@
                 <w:sz w:val="20"/>
                 <w:szCs w:val="20"/>
               </w:rPr>
-              <w:t xml:space="preserve">Posisi pluralis ini penting, karena seluruh bagian kasus nanti berdiri di atasnya.</w:t>
+              <w:t xml:space="preserve">Contoh suap biasanya langsung nyambung ke kelas. Santai saja bawakannya.</w:t>
             </w:r>
           </w:p>
         </w:tc>
@@ -2513,91 +2592,91 @@
           <w:sz w:val="21"/>
           <w:szCs w:val="21"/>
         </w:rPr>
-        <w:t xml:space="preserve">Sembilan teori dalam Bab 3 dibagi ke dalam dua klasifikasi.</w:t>
-      </w:r>
-    </w:p>
-    <w:p>
-      <w:pPr>
-        <w:keepNext w:val="false"/>
-        <w:spacing w:after="110" w:before="0" w:line="300"/>
-        <w:jc w:val="both"/>
-      </w:pPr>
-      <w:r>
-        <w:rPr>
-          <w:rFonts w:ascii="Times New Roman" w:cs="Times New Roman" w:eastAsia="Times New Roman" w:hAnsi="Times New Roman"/>
-          <w:b w:val="false"/>
-          <w:bCs w:val="false"/>
-          <w:i w:val="false"/>
-          <w:iCs w:val="false"/>
-          <w:caps w:val="false"/>
-          <w:color w:val="16151F"/>
-          <w:sz w:val="21"/>
-          <w:szCs w:val="21"/>
-        </w:rPr>
-        <w:t xml:space="preserve">Klasifikasi pertama adalah teori modernis Barat. Berakar pada Pencerahan abad kedelapan belas, bersifat absolutis, dan menawarkan aturan yang dapat diterapkan pada situasi apa pun. Di dalamnya ada dua kelompok. Kelompok konsekuensialis atau teleologis menilai akibat tindakan, isinya egoism dan utilitarianism. Kelompok berbasis prinsip atau deontologis menilai kewajiban, isinya ethics of duty, ethics of rights, serta justice dan social contract.</w:t>
-      </w:r>
-    </w:p>
-    <w:p>
-      <w:pPr>
-        <w:keepNext w:val="false"/>
-        <w:spacing w:after="110" w:before="0" w:line="300"/>
-        <w:jc w:val="both"/>
-      </w:pPr>
-      <w:r>
-        <w:rPr>
-          <w:rFonts w:ascii="Times New Roman" w:cs="Times New Roman" w:eastAsia="Times New Roman" w:hAnsi="Times New Roman"/>
-          <w:b w:val="false"/>
-          <w:bCs w:val="false"/>
-          <w:i w:val="false"/>
-          <w:iCs w:val="false"/>
-          <w:caps w:val="false"/>
-          <w:color w:val="16151F"/>
-          <w:sz w:val="21"/>
-          <w:szCs w:val="21"/>
-        </w:rPr>
-        <w:t xml:space="preserve">Klasifikasi kedua adalah teori alternatif. Cenderung relativis dan lahir dari keberatan atas klasifikasi pertama. Isinya virtue ethics yang menilai karakter pelaku, ethic of care yang menilai relasi, discourse ethics yang menilai prosedur, dan postmodern ethics yang menilai bahasa.</w:t>
-      </w:r>
-    </w:p>
-    <w:p>
-      <w:pPr>
-        <w:keepNext w:val="false"/>
-        <w:spacing w:after="110" w:before="0" w:line="300"/>
-        <w:jc w:val="both"/>
-      </w:pPr>
-      <w:r>
-        <w:rPr>
-          <w:rFonts w:ascii="Times New Roman" w:cs="Times New Roman" w:eastAsia="Times New Roman" w:hAnsi="Times New Roman"/>
-          <w:b w:val="false"/>
-          <w:bCs w:val="false"/>
-          <w:i w:val="false"/>
-          <w:iCs w:val="false"/>
-          <w:caps w:val="false"/>
-          <w:color w:val="16151F"/>
-          <w:sz w:val="21"/>
-          <w:szCs w:val="21"/>
-        </w:rPr>
-        <w:t xml:space="preserve">Satu catatan yang perlu digarisbawahi. Kesembilan teori ini bersifat normatif karena berangkat dari asumsi tentang hakikat dunia dan hakikat manusia. Menerima kesimpulannya berarti menerima asumsinya terlebih dahulu.</w:t>
-      </w:r>
-    </w:p>
-    <w:p>
-      <w:pPr>
-        <w:keepNext w:val="false"/>
-        <w:spacing w:after="110" w:before="0" w:line="300"/>
-        <w:jc w:val="both"/>
-      </w:pPr>
-      <w:r>
-        <w:rPr>
-          <w:rFonts w:ascii="Times New Roman" w:cs="Times New Roman" w:eastAsia="Times New Roman" w:hAnsi="Times New Roman"/>
-          <w:b w:val="false"/>
-          <w:bCs w:val="false"/>
-          <w:i w:val="false"/>
-          <w:iCs w:val="false"/>
-          <w:caps w:val="false"/>
-          <w:color w:val="16151F"/>
-          <w:sz w:val="21"/>
-          <w:szCs w:val="21"/>
-        </w:rPr>
-        <w:t xml:space="preserve">Mohon nomor urut satu sampai sembilan ini diingat, karena matriks pada bagian kasus memakai nomor yang sama.</w:t>
+        <w:t xml:space="preserve">Sembilan teori di Bab 3 terbagi dua kelompok besar.</w:t>
+      </w:r>
+    </w:p>
+    <w:p>
+      <w:pPr>
+        <w:keepNext w:val="false"/>
+        <w:spacing w:after="110" w:before="0" w:line="300"/>
+        <w:jc w:val="both"/>
+      </w:pPr>
+      <w:r>
+        <w:rPr>
+          <w:rFonts w:ascii="Times New Roman" w:cs="Times New Roman" w:eastAsia="Times New Roman" w:hAnsi="Times New Roman"/>
+          <w:b w:val="false"/>
+          <w:bCs w:val="false"/>
+          <w:i w:val="false"/>
+          <w:iCs w:val="false"/>
+          <w:caps w:val="false"/>
+          <w:color w:val="16151F"/>
+          <w:sz w:val="21"/>
+          <w:szCs w:val="21"/>
+        </w:rPr>
+        <w:t xml:space="preserve">Kelompok pertama: teori modernis Barat. Umurnya sudah ratusan tahun dan sifatnya seperti rumus, bisa dipakai di situasi apa pun. Isinya lima teori. Dua menilai hasil akhir sebuah tindakan, yaitu egoism dan utilitarianism. Tiga menilai prinsipnya, yaitu ethics of duty, ethics of rights, dan justice.</w:t>
+      </w:r>
+    </w:p>
+    <w:p>
+      <w:pPr>
+        <w:keepNext w:val="false"/>
+        <w:spacing w:after="110" w:before="0" w:line="300"/>
+        <w:jc w:val="both"/>
+      </w:pPr>
+      <w:r>
+        <w:rPr>
+          <w:rFonts w:ascii="Times New Roman" w:cs="Times New Roman" w:eastAsia="Times New Roman" w:hAnsi="Times New Roman"/>
+          <w:b w:val="false"/>
+          <w:bCs w:val="false"/>
+          <w:i w:val="false"/>
+          <w:iCs w:val="false"/>
+          <w:caps w:val="false"/>
+          <w:color w:val="16151F"/>
+          <w:sz w:val="21"/>
+          <w:szCs w:val="21"/>
+        </w:rPr>
+        <w:t xml:space="preserve">Kelompok kedua: teori alternatif. Ini lahir belakangan karena orang tidak puas dengan kelompok pertama. Isinya empat: virtue ethics menilai karakter orangnya, ethic of care menilai hubungan antarpihak, discourse ethics menilai prosesnya, dan postmodern ethics menilai bahasanya.</w:t>
+      </w:r>
+    </w:p>
+    <w:p>
+      <w:pPr>
+        <w:keepNext w:val="false"/>
+        <w:spacing w:after="110" w:before="0" w:line="300"/>
+        <w:jc w:val="both"/>
+      </w:pPr>
+      <w:r>
+        <w:rPr>
+          <w:rFonts w:ascii="Times New Roman" w:cs="Times New Roman" w:eastAsia="Times New Roman" w:hAnsi="Times New Roman"/>
+          <w:b w:val="false"/>
+          <w:bCs w:val="false"/>
+          <w:i w:val="false"/>
+          <w:iCs w:val="false"/>
+          <w:caps w:val="false"/>
+          <w:color w:val="16151F"/>
+          <w:sz w:val="21"/>
+          <w:szCs w:val="21"/>
+        </w:rPr>
+        <w:t xml:space="preserve">Satu catatan: semua teori ini berangkat dari asumsi tertentu tentang manusia. Kalau kita terima asumsinya, kita terima kesimpulannya.</w:t>
+      </w:r>
+    </w:p>
+    <w:p>
+      <w:pPr>
+        <w:keepNext w:val="false"/>
+        <w:spacing w:after="110" w:before="0" w:line="300"/>
+        <w:jc w:val="both"/>
+      </w:pPr>
+      <w:r>
+        <w:rPr>
+          <w:rFonts w:ascii="Times New Roman" w:cs="Times New Roman" w:eastAsia="Times New Roman" w:hAnsi="Times New Roman"/>
+          <w:b w:val="false"/>
+          <w:bCs w:val="false"/>
+          <w:i w:val="false"/>
+          <w:iCs w:val="false"/>
+          <w:caps w:val="false"/>
+          <w:color w:val="16151F"/>
+          <w:sz w:val="21"/>
+          <w:szCs w:val="21"/>
+        </w:rPr>
+        <w:t xml:space="preserve">Tolong ingat nomor satu sampai sembilan ini ya, karena di bagian kasus nanti kami pakai nomor yang sama.</w:t>
       </w:r>
     </w:p>
     <w:tbl>
@@ -2674,7 +2753,7 @@
                 <w:sz w:val="20"/>
                 <w:szCs w:val="20"/>
               </w:rPr>
-              <w:t xml:space="preserve">Serah terima ke Arfinal. Kalimat penyerahan: kelima teori modernis akan dibahas oleh Arfinal.</w:t>
+              <w:t xml:space="preserve">Serah terima: lima teori pertama akan dibawakan Arfinal.</w:t>
             </w:r>
           </w:p>
         </w:tc>
@@ -2764,112 +2843,112 @@
           <w:sz w:val="21"/>
           <w:szCs w:val="21"/>
         </w:rPr>
-        <w:t xml:space="preserve">Teori nomor satu, ethical egoism. Ini teori tertua sekaligus yang paling diperdebatkan, sampai sebagian penulis menolak mengategorikannya sebagai teori moral.</w:t>
-      </w:r>
-    </w:p>
-    <w:p>
-      <w:pPr>
-        <w:keepNext w:val="false"/>
-        <w:spacing w:after="110" w:before="0" w:line="300"/>
-        <w:jc w:val="both"/>
-      </w:pPr>
-      <w:r>
-        <w:rPr>
-          <w:rFonts w:ascii="Times New Roman" w:cs="Times New Roman" w:eastAsia="Times New Roman" w:hAnsi="Times New Roman"/>
-          <w:b w:val="false"/>
-          <w:bCs w:val="false"/>
-          <w:i w:val="false"/>
-          <w:iCs w:val="false"/>
-          <w:caps w:val="false"/>
-          <w:color w:val="16151F"/>
-          <w:sz w:val="21"/>
-          <w:szCs w:val="21"/>
-        </w:rPr>
-        <w:t xml:space="preserve">Definisinya, sebuah tindakan benar secara moral jika dalam situasi tersebut semua pengambil keputusan secara bebas memilih mengejar keinginan jangka pendek atau kepentingan jangka panjangnya.</w:t>
-      </w:r>
-    </w:p>
-    <w:p>
-      <w:pPr>
-        <w:keepNext w:val="false"/>
-        <w:spacing w:after="110" w:before="0" w:line="300"/>
-        <w:jc w:val="both"/>
-      </w:pPr>
-      <w:r>
-        <w:rPr>
-          <w:rFonts w:ascii="Times New Roman" w:cs="Times New Roman" w:eastAsia="Times New Roman" w:hAnsi="Times New Roman"/>
-          <w:b w:val="false"/>
-          <w:bCs w:val="false"/>
-          <w:i w:val="false"/>
-          <w:iCs w:val="false"/>
-          <w:caps w:val="false"/>
-          <w:color w:val="16151F"/>
-          <w:sz w:val="21"/>
-          <w:szCs w:val="21"/>
-        </w:rPr>
-        <w:t xml:space="preserve">Yang sering tertukar, egoisme bukan keserakahan. Pelaku egois masih dapat tergerak oleh rasa iba. Pelaku serakah tidak peka pada kepentingan pihak lain sama sekali.</w:t>
-      </w:r>
-    </w:p>
-    <w:p>
-      <w:pPr>
-        <w:keepNext w:val="false"/>
-        <w:spacing w:after="110" w:before="0" w:line="300"/>
-        <w:jc w:val="both"/>
-      </w:pPr>
-      <w:r>
-        <w:rPr>
-          <w:rFonts w:ascii="Times New Roman" w:cs="Times New Roman" w:eastAsia="Times New Roman" w:hAnsi="Times New Roman"/>
-          <w:b w:val="false"/>
-          <w:bCs w:val="false"/>
-          <w:i w:val="false"/>
-          <w:iCs w:val="false"/>
-          <w:caps w:val="false"/>
-          <w:color w:val="16151F"/>
-          <w:sz w:val="21"/>
-          <w:szCs w:val="21"/>
-        </w:rPr>
-        <w:t xml:space="preserve">Tokohnya Thomas Hobbes dalam Leviathan, yang menyebut keadaan alamiah sebagai perang semua melawan semua, dan Ayn Rand dalam The Virtue of Selfishness.</w:t>
-      </w:r>
-    </w:p>
-    <w:p>
-      <w:pPr>
-        <w:keepNext w:val="false"/>
-        <w:spacing w:after="110" w:before="0" w:line="300"/>
-        <w:jc w:val="both"/>
-      </w:pPr>
-      <w:r>
-        <w:rPr>
-          <w:rFonts w:ascii="Times New Roman" w:cs="Times New Roman" w:eastAsia="Times New Roman" w:hAnsi="Times New Roman"/>
-          <w:b w:val="false"/>
-          <w:bCs w:val="false"/>
-          <w:i w:val="false"/>
-          <w:iCs w:val="false"/>
-          <w:caps w:val="false"/>
-          <w:color w:val="16151F"/>
-          <w:sz w:val="21"/>
-          <w:szCs w:val="21"/>
-        </w:rPr>
-        <w:t xml:space="preserve">Keterbatasannya, teori ini hanya berlaku bila pasar mencegah satu pelaku merugikan pelaku lain. Ia gugur pada kegagalan pasar dan isu keberlanjutan, sebab korban penipisan sumber daya adalah generasi mendatang yang belum dapat ikut bertransaksi.</w:t>
-      </w:r>
-    </w:p>
-    <w:p>
-      <w:pPr>
-        <w:keepNext w:val="false"/>
-        <w:spacing w:after="110" w:before="0" w:line="300"/>
-        <w:jc w:val="both"/>
-      </w:pPr>
-      <w:r>
-        <w:rPr>
-          <w:rFonts w:ascii="Times New Roman" w:cs="Times New Roman" w:eastAsia="Times New Roman" w:hAnsi="Times New Roman"/>
-          <w:b w:val="false"/>
-          <w:bCs w:val="false"/>
-          <w:i w:val="false"/>
-          <w:iCs w:val="false"/>
-          <w:caps w:val="false"/>
-          <w:color w:val="16151F"/>
-          <w:sz w:val="21"/>
-          <w:szCs w:val="21"/>
-        </w:rPr>
-        <w:t xml:space="preserve">Saya minta jangan buru-buru menolak teori ini. Versi jangka panjangnya, yang disebut enlightened egoism, justru memberi kritik paling tajam pada kasus nikel nanti.</w:t>
+        <w:t xml:space="preserve">Teori nomor satu: ethical egoism. Ini teori paling tua dan paling sering disalahpahami.</w:t>
+      </w:r>
+    </w:p>
+    <w:p>
+      <w:pPr>
+        <w:keepNext w:val="false"/>
+        <w:spacing w:after="110" w:before="0" w:line="300"/>
+        <w:jc w:val="both"/>
+      </w:pPr>
+      <w:r>
+        <w:rPr>
+          <w:rFonts w:ascii="Times New Roman" w:cs="Times New Roman" w:eastAsia="Times New Roman" w:hAnsi="Times New Roman"/>
+          <w:b w:val="false"/>
+          <w:bCs w:val="false"/>
+          <w:i w:val="false"/>
+          <w:iCs w:val="false"/>
+          <w:caps w:val="false"/>
+          <w:color w:val="16151F"/>
+          <w:sz w:val="21"/>
+          <w:szCs w:val="21"/>
+        </w:rPr>
+        <w:t xml:space="preserve">Intinya begini: sebuah tindakan itu benar kalau semua orang bebas mengejar kepentingannya sendiri, baik yang jangka pendek maupun jangka panjang.</w:t>
+      </w:r>
+    </w:p>
+    <w:p>
+      <w:pPr>
+        <w:keepNext w:val="false"/>
+        <w:spacing w:after="110" w:before="0" w:line="300"/>
+        <w:jc w:val="both"/>
+      </w:pPr>
+      <w:r>
+        <w:rPr>
+          <w:rFonts w:ascii="Times New Roman" w:cs="Times New Roman" w:eastAsia="Times New Roman" w:hAnsi="Times New Roman"/>
+          <w:b w:val="false"/>
+          <w:bCs w:val="false"/>
+          <w:i w:val="false"/>
+          <w:iCs w:val="false"/>
+          <w:caps w:val="false"/>
+          <w:color w:val="16151F"/>
+          <w:sz w:val="21"/>
+          <w:szCs w:val="21"/>
+        </w:rPr>
+        <w:t xml:space="preserve">Yang sering keliru: egois itu bukan serakah. Orang egois masih bisa peduli pada orang lain. Orang serakah sudah tidak peduli sama sekali.</w:t>
+      </w:r>
+    </w:p>
+    <w:p>
+      <w:pPr>
+        <w:keepNext w:val="false"/>
+        <w:spacing w:after="110" w:before="0" w:line="300"/>
+        <w:jc w:val="both"/>
+      </w:pPr>
+      <w:r>
+        <w:rPr>
+          <w:rFonts w:ascii="Times New Roman" w:cs="Times New Roman" w:eastAsia="Times New Roman" w:hAnsi="Times New Roman"/>
+          <w:b w:val="false"/>
+          <w:bCs w:val="false"/>
+          <w:i w:val="false"/>
+          <w:iCs w:val="false"/>
+          <w:caps w:val="false"/>
+          <w:color w:val="16151F"/>
+          <w:sz w:val="21"/>
+          <w:szCs w:val="21"/>
+        </w:rPr>
+        <w:t xml:space="preserve">Tokohnya Thomas Hobbes dan Ayn Rand.</w:t>
+      </w:r>
+    </w:p>
+    <w:p>
+      <w:pPr>
+        <w:keepNext w:val="false"/>
+        <w:spacing w:after="110" w:before="0" w:line="300"/>
+        <w:jc w:val="both"/>
+      </w:pPr>
+      <w:r>
+        <w:rPr>
+          <w:rFonts w:ascii="Times New Roman" w:cs="Times New Roman" w:eastAsia="Times New Roman" w:hAnsi="Times New Roman"/>
+          <w:b w:val="false"/>
+          <w:bCs w:val="false"/>
+          <w:i w:val="false"/>
+          <w:iCs w:val="false"/>
+          <w:caps w:val="false"/>
+          <w:color w:val="16151F"/>
+          <w:sz w:val="21"/>
+          <w:szCs w:val="21"/>
+        </w:rPr>
+        <w:t xml:space="preserve">Kelemahannya: teori ini cuma jalan kalau pasar berfungsi baik, saat tidak ada yang bisa seenaknya merugikan orang lain. Begitu bicara lingkungan dan generasi mendatang, teori ini macet. Kenapa? Karena korban kerusakan lingkungan adalah anak cucu kita, dan mereka belum bisa ikut menawar hari ini.</w:t>
+      </w:r>
+    </w:p>
+    <w:p>
+      <w:pPr>
+        <w:keepNext w:val="false"/>
+        <w:spacing w:after="110" w:before="0" w:line="300"/>
+        <w:jc w:val="both"/>
+      </w:pPr>
+      <w:r>
+        <w:rPr>
+          <w:rFonts w:ascii="Times New Roman" w:cs="Times New Roman" w:eastAsia="Times New Roman" w:hAnsi="Times New Roman"/>
+          <w:b w:val="false"/>
+          <w:bCs w:val="false"/>
+          <w:i w:val="false"/>
+          <w:iCs w:val="false"/>
+          <w:caps w:val="false"/>
+          <w:color w:val="16151F"/>
+          <w:sz w:val="21"/>
+          <w:szCs w:val="21"/>
+        </w:rPr>
+        <w:t xml:space="preserve">Tapi jangan buru-buru membuang teori ini. Versi jangka panjangnya justru nanti memberi kritik paling tajam ke kasus nikel: perusahaan yang benar-benar cerdas menghitung untung ruginya sampai jauh ke depan.</w:t>
       </w:r>
     </w:p>
     <w:tbl>
@@ -2946,7 +3025,7 @@
                 <w:sz w:val="20"/>
                 <w:szCs w:val="20"/>
               </w:rPr>
-              <w:t xml:space="preserve">Nada bicara jangan defensif. Egoism di sini istilah teknis, bukan celaan.</w:t>
+              <w:t xml:space="preserve">Nada santai. Egoism di sini istilah teknis, bukan hinaan.</w:t>
             </w:r>
           </w:p>
         </w:tc>
@@ -3036,91 +3115,91 @@
           <w:sz w:val="21"/>
           <w:szCs w:val="21"/>
         </w:rPr>
-        <w:t xml:space="preserve">Teori nomor dua, utilitarianism. Ini teori yang paling lazim diterapkan dalam bisnis karena kompatibel dengan metodologi kuantitatif ekonomi.</w:t>
-      </w:r>
-    </w:p>
-    <w:p>
-      <w:pPr>
-        <w:keepNext w:val="false"/>
-        <w:spacing w:after="110" w:before="0" w:line="300"/>
-        <w:jc w:val="both"/>
-      </w:pPr>
-      <w:r>
-        <w:rPr>
-          <w:rFonts w:ascii="Times New Roman" w:cs="Times New Roman" w:eastAsia="Times New Roman" w:hAnsi="Times New Roman"/>
-          <w:b w:val="false"/>
-          <w:bCs w:val="false"/>
-          <w:i w:val="false"/>
-          <w:iCs w:val="false"/>
-          <w:caps w:val="false"/>
-          <w:color w:val="16151F"/>
-          <w:sz w:val="21"/>
-          <w:szCs w:val="21"/>
-        </w:rPr>
-        <w:t xml:space="preserve">Definisinya dari Bentham dan Mill. Sebuah tindakan benar secara moral jika menghasilkan kebaikan terbesar bagi jumlah orang terbesar yang terkena dampaknya.</w:t>
-      </w:r>
-    </w:p>
-    <w:p>
-      <w:pPr>
-        <w:keepNext w:val="false"/>
-        <w:spacing w:after="110" w:before="0" w:line="300"/>
-        <w:jc w:val="both"/>
-      </w:pPr>
-      <w:r>
-        <w:rPr>
-          <w:rFonts w:ascii="Times New Roman" w:cs="Times New Roman" w:eastAsia="Times New Roman" w:hAnsi="Times New Roman"/>
-          <w:b w:val="false"/>
-          <w:bCs w:val="false"/>
-          <w:i w:val="false"/>
-          <w:iCs w:val="false"/>
-          <w:caps w:val="false"/>
-          <w:color w:val="16151F"/>
-          <w:sz w:val="21"/>
-          <w:szCs w:val="21"/>
-        </w:rPr>
-        <w:t xml:space="preserve">Ada empat ciri pokok. Consequentialism, yang dinilai akibatnya. Hedonism, kebaikan diukur sebagai pleasure dikurangi pain. Maximalism, yang dicari akibat bersih terbesar. Universalism, akibat bagi semua pihak wajib ikut dihitung.</w:t>
-      </w:r>
-    </w:p>
-    <w:p>
-      <w:pPr>
-        <w:keepNext w:val="false"/>
-        <w:spacing w:after="110" w:before="0" w:line="300"/>
-        <w:jc w:val="both"/>
-      </w:pPr>
-      <w:r>
-        <w:rPr>
-          <w:rFonts w:ascii="Times New Roman" w:cs="Times New Roman" w:eastAsia="Times New Roman" w:hAnsi="Times New Roman"/>
-          <w:b w:val="false"/>
-          <w:bCs w:val="false"/>
-          <w:i w:val="false"/>
-          <w:iCs w:val="false"/>
-          <w:caps w:val="false"/>
-          <w:color w:val="16151F"/>
-          <w:sz w:val="21"/>
-          <w:szCs w:val="21"/>
-        </w:rPr>
-        <w:t xml:space="preserve">Bagian terpenting dari slide ini adalah pembedaan act dan rule. Act utilitarianism menilai satu tindakan tunggal. Rule utilitarianism menilai kelas tindakan dan prinsip di baliknya dalam jangka panjang. Keduanya sama-sama utilitarianism, tetapi keduanya dapat menghasilkan kesimpulan yang berlawanan atas fakta yang sama. Mohon diingat, karena persis itu yang terjadi pada kasus nikel.</w:t>
-      </w:r>
-    </w:p>
-    <w:p>
-      <w:pPr>
-        <w:keepNext w:val="false"/>
-        <w:spacing w:after="110" w:before="0" w:line="300"/>
-        <w:jc w:val="both"/>
-      </w:pPr>
-      <w:r>
-        <w:rPr>
-          <w:rFonts w:ascii="Times New Roman" w:cs="Times New Roman" w:eastAsia="Times New Roman" w:hAnsi="Times New Roman"/>
-          <w:b w:val="false"/>
-          <w:bCs w:val="false"/>
-          <w:i w:val="false"/>
-          <w:iCs w:val="false"/>
-          <w:caps w:val="false"/>
-          <w:color w:val="16151F"/>
-          <w:sz w:val="21"/>
-          <w:szCs w:val="21"/>
-        </w:rPr>
-        <w:t xml:space="preserve">Keberatannya ada empat. Subjektivitas dalam menilai utilitas, pembobotan yang menyamakan semua orang, kesulitan kuantifikasi, dan distribusi utilitas yang mengabaikan minoritas serta generasi mendatang.</w:t>
+        <w:t xml:space="preserve">Teori nomor dua: utilitarianism. Ini teori favorit dunia bisnis karena mirip hitung-hitungan untung rugi.</w:t>
+      </w:r>
+    </w:p>
+    <w:p>
+      <w:pPr>
+        <w:keepNext w:val="false"/>
+        <w:spacing w:after="110" w:before="0" w:line="300"/>
+        <w:jc w:val="both"/>
+      </w:pPr>
+      <w:r>
+        <w:rPr>
+          <w:rFonts w:ascii="Times New Roman" w:cs="Times New Roman" w:eastAsia="Times New Roman" w:hAnsi="Times New Roman"/>
+          <w:b w:val="false"/>
+          <w:bCs w:val="false"/>
+          <w:i w:val="false"/>
+          <w:iCs w:val="false"/>
+          <w:caps w:val="false"/>
+          <w:color w:val="16151F"/>
+          <w:sz w:val="21"/>
+          <w:szCs w:val="21"/>
+        </w:rPr>
+        <w:t xml:space="preserve">Aturannya satu kalimat: tindakan yang benar adalah yang memberi manfaat terbesar untuk orang sebanyak-banyaknya.</w:t>
+      </w:r>
+    </w:p>
+    <w:p>
+      <w:pPr>
+        <w:keepNext w:val="false"/>
+        <w:spacing w:after="110" w:before="0" w:line="300"/>
+        <w:jc w:val="both"/>
+      </w:pPr>
+      <w:r>
+        <w:rPr>
+          <w:rFonts w:ascii="Times New Roman" w:cs="Times New Roman" w:eastAsia="Times New Roman" w:hAnsi="Times New Roman"/>
+          <w:b w:val="false"/>
+          <w:bCs w:val="false"/>
+          <w:i w:val="false"/>
+          <w:iCs w:val="false"/>
+          <w:caps w:val="false"/>
+          <w:color w:val="16151F"/>
+          <w:sz w:val="21"/>
+          <w:szCs w:val="21"/>
+        </w:rPr>
+        <w:t xml:space="preserve">Cara kerjanya: jumlahkan semua manfaat, kurangi semua kerugian, dan semua orang yang kena dampak harus ikut dihitung, bukan cuma diri kita.</w:t>
+      </w:r>
+    </w:p>
+    <w:p>
+      <w:pPr>
+        <w:keepNext w:val="false"/>
+        <w:spacing w:after="110" w:before="0" w:line="300"/>
+        <w:jc w:val="both"/>
+      </w:pPr>
+      <w:r>
+        <w:rPr>
+          <w:rFonts w:ascii="Times New Roman" w:cs="Times New Roman" w:eastAsia="Times New Roman" w:hAnsi="Times New Roman"/>
+          <w:b w:val="false"/>
+          <w:bCs w:val="false"/>
+          <w:i w:val="false"/>
+          <w:iCs w:val="false"/>
+          <w:caps w:val="false"/>
+          <w:color w:val="16151F"/>
+          <w:sz w:val="21"/>
+          <w:szCs w:val="21"/>
+        </w:rPr>
+        <w:t xml:space="preserve">Nah, ini bagian paling penting di slide ini: bedanya act dan rule. Act utilitarianism menilai satu kejadian saja. Rule utilitarianism bertanya lebih jauh: kalau semua orang melakukan hal yang sama, dunia jadi lebih baik atau lebih buruk? Dua-duanya utilitarianism, tapi jawabannya bisa bertolak belakang untuk kasus yang sama. Tolong diingat, karena persis itu yang terjadi di kasus nikel nanti.</w:t>
+      </w:r>
+    </w:p>
+    <w:p>
+      <w:pPr>
+        <w:keepNext w:val="false"/>
+        <w:spacing w:after="110" w:before="0" w:line="300"/>
+        <w:jc w:val="both"/>
+      </w:pPr>
+      <w:r>
+        <w:rPr>
+          <w:rFonts w:ascii="Times New Roman" w:cs="Times New Roman" w:eastAsia="Times New Roman" w:hAnsi="Times New Roman"/>
+          <w:b w:val="false"/>
+          <w:bCs w:val="false"/>
+          <w:i w:val="false"/>
+          <w:iCs w:val="false"/>
+          <w:caps w:val="false"/>
+          <w:color w:val="16151F"/>
+          <w:sz w:val="21"/>
+          <w:szCs w:val="21"/>
+        </w:rPr>
+        <w:t xml:space="preserve">Kelemahannya: manfaat itu susah diukur, semua orang dihitung sama rata, dan kelompok kecil bisa terlindas. Angka total yang bagus bisa menyembunyikan penderitaan segelintir orang.</w:t>
       </w:r>
     </w:p>
     <w:tbl>
@@ -3197,7 +3276,7 @@
                 <w:sz w:val="20"/>
                 <w:szCs w:val="20"/>
               </w:rPr>
-              <w:t xml:space="preserve">Beri penekanan suara pada kalimat act dan rule. Ini titik yang akan dipanggil kembali di slide 17.</w:t>
+              <w:t xml:space="preserve">Tekankan suara di bagian act dan rule. Ini dipanggil lagi di slide 17.</w:t>
             </w:r>
           </w:p>
         </w:tc>
@@ -3287,112 +3366,112 @@
           <w:sz w:val="21"/>
           <w:szCs w:val="21"/>
         </w:rPr>
-        <w:t xml:space="preserve">Teori nomor tiga, ethics of duty dari Immanuel Kant. Di sini yang dinilai bukan akibat, melainkan prinsip di balik tindakan dan motivasi pelakunya.</w:t>
-      </w:r>
-    </w:p>
-    <w:p>
-      <w:pPr>
-        <w:keepNext w:val="false"/>
-        <w:spacing w:after="110" w:before="0" w:line="300"/>
-        <w:jc w:val="both"/>
-      </w:pPr>
-      <w:r>
-        <w:rPr>
-          <w:rFonts w:ascii="Times New Roman" w:cs="Times New Roman" w:eastAsia="Times New Roman" w:hAnsi="Times New Roman"/>
-          <w:b w:val="false"/>
-          <w:bCs w:val="false"/>
-          <w:i w:val="false"/>
-          <w:iCs w:val="false"/>
-          <w:caps w:val="false"/>
-          <w:color w:val="16151F"/>
-          <w:sz w:val="21"/>
-          <w:szCs w:val="21"/>
-        </w:rPr>
-        <w:t xml:space="preserve">Kewajiban dalam pengertian Kant bersifat abstrak dan tidak berubah, dirumuskan lewat aturan moral a priori yang dideduksi secara rasional dan berlaku pada semua persoalan etis.</w:t>
-      </w:r>
-    </w:p>
-    <w:p>
-      <w:pPr>
-        <w:keepNext w:val="false"/>
-        <w:spacing w:after="110" w:before="0" w:line="300"/>
-        <w:jc w:val="both"/>
-      </w:pPr>
-      <w:r>
-        <w:rPr>
-          <w:rFonts w:ascii="Times New Roman" w:cs="Times New Roman" w:eastAsia="Times New Roman" w:hAnsi="Times New Roman"/>
-          <w:b w:val="false"/>
-          <w:bCs w:val="false"/>
-          <w:i w:val="false"/>
-          <w:iCs w:val="false"/>
-          <w:caps w:val="false"/>
-          <w:color w:val="16151F"/>
-          <w:sz w:val="21"/>
-          <w:szCs w:val="21"/>
-        </w:rPr>
-        <w:t xml:space="preserve">Formulasi pertama, universal acceptability. Terima sebuah hukum moral hanya bila semua makhluk berakal budi juga dapat menerimanya. Contoh dari Kant sendiri adalah mengingkari utang. Bila semua orang boleh mengingkari utang, lembaga utang piutang bubar, sehingga maksimnya membatalkan dirinya sendiri.</w:t>
-      </w:r>
-    </w:p>
-    <w:p>
-      <w:pPr>
-        <w:keepNext w:val="false"/>
-        <w:spacing w:after="110" w:before="0" w:line="300"/>
-        <w:jc w:val="both"/>
-      </w:pPr>
-      <w:r>
-        <w:rPr>
-          <w:rFonts w:ascii="Times New Roman" w:cs="Times New Roman" w:eastAsia="Times New Roman" w:hAnsi="Times New Roman"/>
-          <w:b w:val="false"/>
-          <w:bCs w:val="false"/>
-          <w:i w:val="false"/>
-          <w:iCs w:val="false"/>
-          <w:caps w:val="false"/>
-          <w:color w:val="16151F"/>
-          <w:sz w:val="21"/>
-          <w:szCs w:val="21"/>
-        </w:rPr>
-        <w:t xml:space="preserve">Formulasi kedua, respect for persons. Perlakukan manusia sebagai tujuan, jangan pernah sekadar sebagai sarana. Inilah dasar etis dari stakeholder theory.</w:t>
-      </w:r>
-    </w:p>
-    <w:p>
-      <w:pPr>
-        <w:keepNext w:val="false"/>
-        <w:spacing w:after="110" w:before="0" w:line="300"/>
-        <w:jc w:val="both"/>
-      </w:pPr>
-      <w:r>
-        <w:rPr>
-          <w:rFonts w:ascii="Times New Roman" w:cs="Times New Roman" w:eastAsia="Times New Roman" w:hAnsi="Times New Roman"/>
-          <w:b w:val="false"/>
-          <w:bCs w:val="false"/>
-          <w:i w:val="false"/>
-          <w:iCs w:val="false"/>
-          <w:caps w:val="false"/>
-          <w:color w:val="16151F"/>
-          <w:sz w:val="21"/>
-          <w:szCs w:val="21"/>
-        </w:rPr>
-        <w:t xml:space="preserve">Cara cepat memakai Kant, sebutkan maksim tindakannya dalam satu kalimat, lalu universalkan. Bila maksimnya membatalkan dirinya sendiri, tindakan itu gagal.</w:t>
-      </w:r>
-    </w:p>
-    <w:p>
-      <w:pPr>
-        <w:keepNext w:val="false"/>
-        <w:spacing w:after="110" w:before="0" w:line="300"/>
-        <w:jc w:val="both"/>
-      </w:pPr>
-      <w:r>
-        <w:rPr>
-          <w:rFonts w:ascii="Times New Roman" w:cs="Times New Roman" w:eastAsia="Times New Roman" w:hAnsi="Times New Roman"/>
-          <w:b w:val="false"/>
-          <w:bCs w:val="false"/>
-          <w:i w:val="false"/>
-          <w:iCs w:val="false"/>
-          <w:caps w:val="false"/>
-          <w:color w:val="16151F"/>
-          <w:sz w:val="21"/>
-          <w:szCs w:val="21"/>
-        </w:rPr>
-        <w:t xml:space="preserve">Keberatannya ada tiga. Kriteria motivasinya terlalu sempit, akibat diabaikan sepenuhnya, dan asumsi rasionalitas penuh bersifat idealistis.</w:t>
+        <w:t xml:space="preserve">Teori nomor tiga dari Immanuel Kant. Kalau dua teori tadi melihat hasil, Kant justru bilang: hasil itu tidak penting. Yang penting niat dan prinsipnya.</w:t>
+      </w:r>
+    </w:p>
+    <w:p>
+      <w:pPr>
+        <w:keepNext w:val="false"/>
+        <w:spacing w:after="110" w:before="0" w:line="300"/>
+        <w:jc w:val="both"/>
+      </w:pPr>
+      <w:r>
+        <w:rPr>
+          <w:rFonts w:ascii="Times New Roman" w:cs="Times New Roman" w:eastAsia="Times New Roman" w:hAnsi="Times New Roman"/>
+          <w:b w:val="false"/>
+          <w:bCs w:val="false"/>
+          <w:i w:val="false"/>
+          <w:iCs w:val="false"/>
+          <w:caps w:val="false"/>
+          <w:color w:val="16151F"/>
+          <w:sz w:val="21"/>
+          <w:szCs w:val="21"/>
+        </w:rPr>
+        <w:t xml:space="preserve">Kant memberi dua alat uji yang gampang dipakai.</w:t>
+      </w:r>
+    </w:p>
+    <w:p>
+      <w:pPr>
+        <w:keepNext w:val="false"/>
+        <w:spacing w:after="110" w:before="0" w:line="300"/>
+        <w:jc w:val="both"/>
+      </w:pPr>
+      <w:r>
+        <w:rPr>
+          <w:rFonts w:ascii="Times New Roman" w:cs="Times New Roman" w:eastAsia="Times New Roman" w:hAnsi="Times New Roman"/>
+          <w:b w:val="false"/>
+          <w:bCs w:val="false"/>
+          <w:i w:val="false"/>
+          <w:iCs w:val="false"/>
+          <w:caps w:val="false"/>
+          <w:color w:val="16151F"/>
+          <w:sz w:val="21"/>
+          <w:szCs w:val="21"/>
+        </w:rPr>
+        <w:t xml:space="preserve">Uji pertama: bisakah aturan ini berlaku untuk semua orang? Contohnya janji palsu. Kalau semua orang boleh ingkar janji, tidak ada lagi yang percaya pada janji, dan janji itu sendiri jadi tidak ada artinya. Aturannya menghancurkan dirinya sendiri. Berarti salah.</w:t>
+      </w:r>
+    </w:p>
+    <w:p>
+      <w:pPr>
+        <w:keepNext w:val="false"/>
+        <w:spacing w:after="110" w:before="0" w:line="300"/>
+        <w:jc w:val="both"/>
+      </w:pPr>
+      <w:r>
+        <w:rPr>
+          <w:rFonts w:ascii="Times New Roman" w:cs="Times New Roman" w:eastAsia="Times New Roman" w:hAnsi="Times New Roman"/>
+          <w:b w:val="false"/>
+          <w:bCs w:val="false"/>
+          <w:i w:val="false"/>
+          <w:iCs w:val="false"/>
+          <w:caps w:val="false"/>
+          <w:color w:val="16151F"/>
+          <w:sz w:val="21"/>
+          <w:szCs w:val="21"/>
+        </w:rPr>
+        <w:t xml:space="preserve">Uji kedua: apakah kita memperlakukan manusia sebagai manusia? Orang tidak boleh dipakai sekadar sebagai alat untuk tujuan kita. Dari sinilah lahir ide bahwa perusahaan harus peduli pada semua pemangku kepentingannya.</w:t>
+      </w:r>
+    </w:p>
+    <w:p>
+      <w:pPr>
+        <w:keepNext w:val="false"/>
+        <w:spacing w:after="110" w:before="0" w:line="300"/>
+        <w:jc w:val="both"/>
+      </w:pPr>
+      <w:r>
+        <w:rPr>
+          <w:rFonts w:ascii="Times New Roman" w:cs="Times New Roman" w:eastAsia="Times New Roman" w:hAnsi="Times New Roman"/>
+          <w:b w:val="false"/>
+          <w:bCs w:val="false"/>
+          <w:i w:val="false"/>
+          <w:iCs w:val="false"/>
+          <w:caps w:val="false"/>
+          <w:color w:val="16151F"/>
+          <w:sz w:val="21"/>
+          <w:szCs w:val="21"/>
+        </w:rPr>
+        <w:t xml:space="preserve">Jadi cara pakai Kant itu singkat: tulis aturannya satu kalimat, lalu bayangkan semua orang melakukannya. Kalau kacau, berarti salah.</w:t>
+      </w:r>
+    </w:p>
+    <w:p>
+      <w:pPr>
+        <w:keepNext w:val="false"/>
+        <w:spacing w:after="110" w:before="0" w:line="300"/>
+        <w:jc w:val="both"/>
+      </w:pPr>
+      <w:r>
+        <w:rPr>
+          <w:rFonts w:ascii="Times New Roman" w:cs="Times New Roman" w:eastAsia="Times New Roman" w:hAnsi="Times New Roman"/>
+          <w:b w:val="false"/>
+          <w:bCs w:val="false"/>
+          <w:i w:val="false"/>
+          <w:iCs w:val="false"/>
+          <w:caps w:val="false"/>
+          <w:color w:val="16151F"/>
+          <w:sz w:val="21"/>
+          <w:szCs w:val="21"/>
+        </w:rPr>
+        <w:t xml:space="preserve">Kelemahannya: hasil sama sekali tidak dihitung, dan Kant menganggap semua orang selalu berpikir jernih. Kenyataannya kan tidak.</w:t>
       </w:r>
     </w:p>
     <w:tbl>
@@ -3469,7 +3548,7 @@
                 <w:sz w:val="20"/>
                 <w:szCs w:val="20"/>
               </w:rPr>
-              <w:t xml:space="preserve">Cara cepat memakai Kant sebaiknya diucapkan pelan, karena akan dipakai langsung pada slide 17.</w:t>
+              <w:t xml:space="preserve">Contoh janji palsu ucapkan pelan-pelan. Alat uji ini dipakai langsung di slide 17.</w:t>
             </w:r>
           </w:p>
         </w:tc>
@@ -3559,91 +3638,91 @@
           <w:sz w:val="21"/>
           <w:szCs w:val="21"/>
         </w:rPr>
-        <w:t xml:space="preserve">Teori nomor empat, ethics of rights. Pendekatan ini yang paling banyak dipakai secara praktis karena sudah melembaga dalam instrumen internasional.</w:t>
-      </w:r>
-    </w:p>
-    <w:p>
-      <w:pPr>
-        <w:keepNext w:val="false"/>
-        <w:spacing w:after="110" w:before="0" w:line="300"/>
-        <w:jc w:val="both"/>
-      </w:pPr>
-      <w:r>
-        <w:rPr>
-          <w:rFonts w:ascii="Times New Roman" w:cs="Times New Roman" w:eastAsia="Times New Roman" w:hAnsi="Times New Roman"/>
-          <w:b w:val="false"/>
-          <w:bCs w:val="false"/>
-          <w:i w:val="false"/>
-          <w:iCs w:val="false"/>
-          <w:caps w:val="false"/>
-          <w:color w:val="16151F"/>
-          <w:sz w:val="21"/>
-          <w:szCs w:val="21"/>
-        </w:rPr>
-        <w:t xml:space="preserve">Hak asasi didefinisikan sebagai hak dasar yang melekat, tidak dapat dicabut, dan tidak bersyarat, yang dimiliki semua manusia tanpa kecuali. John Locke merumuskan natural rights atas hidup, kebebasan, dan milik.</w:t>
-      </w:r>
-    </w:p>
-    <w:p>
-      <w:pPr>
-        <w:keepNext w:val="false"/>
-        <w:spacing w:after="110" w:before="0" w:line="300"/>
-        <w:jc w:val="both"/>
-      </w:pPr>
-      <w:r>
-        <w:rPr>
-          <w:rFonts w:ascii="Times New Roman" w:cs="Times New Roman" w:eastAsia="Times New Roman" w:hAnsi="Times New Roman"/>
-          <w:b w:val="false"/>
-          <w:bCs w:val="false"/>
-          <w:i w:val="false"/>
-          <w:iCs w:val="false"/>
-          <w:caps w:val="false"/>
-          <w:color w:val="16151F"/>
-          <w:sz w:val="21"/>
-          <w:szCs w:val="21"/>
-        </w:rPr>
-        <w:t xml:space="preserve">Satu hal yang sering terlewat, hak seseorang selalu menimbulkan kewajiban pada pihak lain. Hak atas air bersih berarti ada pihak yang berkewajiban tidak mencemari.</w:t>
-      </w:r>
-    </w:p>
-    <w:p>
-      <w:pPr>
-        <w:keepNext w:val="false"/>
-        <w:spacing w:after="110" w:before="0" w:line="300"/>
-        <w:jc w:val="both"/>
-      </w:pPr>
-      <w:r>
-        <w:rPr>
-          <w:rFonts w:ascii="Times New Roman" w:cs="Times New Roman" w:eastAsia="Times New Roman" w:hAnsi="Times New Roman"/>
-          <w:b w:val="false"/>
-          <w:bCs w:val="false"/>
-          <w:i w:val="false"/>
-          <w:iCs w:val="false"/>
-          <w:caps w:val="false"/>
-          <w:color w:val="16151F"/>
-          <w:sz w:val="21"/>
-          <w:szCs w:val="21"/>
-        </w:rPr>
-        <w:t xml:space="preserve">Dalam praktik bisnis rujukannya adalah UN Guiding Principles tahun 2011. Negara melindungi, bisnis menghormati, dan peradilan menyediakan pemulihan bagi korban.</w:t>
-      </w:r>
-    </w:p>
-    <w:p>
-      <w:pPr>
-        <w:keepNext w:val="false"/>
-        <w:spacing w:after="110" w:before="0" w:line="300"/>
-        <w:jc w:val="both"/>
-      </w:pPr>
-      <w:r>
-        <w:rPr>
-          <w:rFonts w:ascii="Times New Roman" w:cs="Times New Roman" w:eastAsia="Times New Roman" w:hAnsi="Times New Roman"/>
-          <w:b w:val="false"/>
-          <w:bCs w:val="false"/>
-          <w:i w:val="false"/>
-          <w:iCs w:val="false"/>
-          <w:caps w:val="false"/>
-          <w:color w:val="16151F"/>
-          <w:sz w:val="21"/>
-          <w:szCs w:val="21"/>
-        </w:rPr>
-        <w:t xml:space="preserve">Yang menentukan untuk kasus kami adalah soal cakupan. Perusahaan wajib meredakan dampak buruk yang terkait lewat relasi bisnisnya, sekalipun ia tidak ikut menyebabkannya. Pemasok termasuk di dalamnya. Inilah yang menghubungkan pembeli kendaraan listrik di Eropa dengan apa yang terjadi di Halmahera.</w:t>
+        <w:t xml:space="preserve">Teori nomor empat: hak asasi manusia. Ini teori yang paling sering dipakai di dunia nyata karena sudah jadi aturan resmi di mana-mana.</w:t>
+      </w:r>
+    </w:p>
+    <w:p>
+      <w:pPr>
+        <w:keepNext w:val="false"/>
+        <w:spacing w:after="110" w:before="0" w:line="300"/>
+        <w:jc w:val="both"/>
+      </w:pPr>
+      <w:r>
+        <w:rPr>
+          <w:rFonts w:ascii="Times New Roman" w:cs="Times New Roman" w:eastAsia="Times New Roman" w:hAnsi="Times New Roman"/>
+          <w:b w:val="false"/>
+          <w:bCs w:val="false"/>
+          <w:i w:val="false"/>
+          <w:iCs w:val="false"/>
+          <w:caps w:val="false"/>
+          <w:color w:val="16151F"/>
+          <w:sz w:val="21"/>
+          <w:szCs w:val="21"/>
+        </w:rPr>
+        <w:t xml:space="preserve">Idenya sederhana: setiap manusia lahir dengan hak dasar yang tidak bisa dicabut siapa pun. Hak hidup, hak atas kebebasan, hak atas milik.</w:t>
+      </w:r>
+    </w:p>
+    <w:p>
+      <w:pPr>
+        <w:keepNext w:val="false"/>
+        <w:spacing w:after="110" w:before="0" w:line="300"/>
+        <w:jc w:val="both"/>
+      </w:pPr>
+      <w:r>
+        <w:rPr>
+          <w:rFonts w:ascii="Times New Roman" w:cs="Times New Roman" w:eastAsia="Times New Roman" w:hAnsi="Times New Roman"/>
+          <w:b w:val="false"/>
+          <w:bCs w:val="false"/>
+          <w:i w:val="false"/>
+          <w:iCs w:val="false"/>
+          <w:caps w:val="false"/>
+          <w:color w:val="16151F"/>
+          <w:sz w:val="21"/>
+          <w:szCs w:val="21"/>
+        </w:rPr>
+        <w:t xml:space="preserve">Yang sering dilupakan: setiap hak selalu menciptakan kewajiban di pihak lain. Kalau warga punya hak atas air bersih, berarti ada pihak yang wajib tidak mencemari sungainya.</w:t>
+      </w:r>
+    </w:p>
+    <w:p>
+      <w:pPr>
+        <w:keepNext w:val="false"/>
+        <w:spacing w:after="110" w:before="0" w:line="300"/>
+        <w:jc w:val="both"/>
+      </w:pPr>
+      <w:r>
+        <w:rPr>
+          <w:rFonts w:ascii="Times New Roman" w:cs="Times New Roman" w:eastAsia="Times New Roman" w:hAnsi="Times New Roman"/>
+          <w:b w:val="false"/>
+          <w:bCs w:val="false"/>
+          <w:i w:val="false"/>
+          <w:iCs w:val="false"/>
+          <w:caps w:val="false"/>
+          <w:color w:val="16151F"/>
+          <w:sz w:val="21"/>
+          <w:szCs w:val="21"/>
+        </w:rPr>
+        <w:t xml:space="preserve">Untuk bisnis, aturan mainnya ada di pedoman PBB tahun 2011. Pembagiannya jelas: negara melindungi, perusahaan menghormati, dan korban harus bisa menuntut pemulihan.</w:t>
+      </w:r>
+    </w:p>
+    <w:p>
+      <w:pPr>
+        <w:keepNext w:val="false"/>
+        <w:spacing w:after="110" w:before="0" w:line="300"/>
+        <w:jc w:val="both"/>
+      </w:pPr>
+      <w:r>
+        <w:rPr>
+          <w:rFonts w:ascii="Times New Roman" w:cs="Times New Roman" w:eastAsia="Times New Roman" w:hAnsi="Times New Roman"/>
+          <w:b w:val="false"/>
+          <w:bCs w:val="false"/>
+          <w:i w:val="false"/>
+          <w:iCs w:val="false"/>
+          <w:caps w:val="false"/>
+          <w:color w:val="16151F"/>
+          <w:sz w:val="21"/>
+          <w:szCs w:val="21"/>
+        </w:rPr>
+        <w:t xml:space="preserve">Satu poin yang nanti penting sekali untuk kasus kita: tanggung jawab perusahaan ikut mengalir lewat rantai bisnisnya. Perusahaan tetap wajib peduli pada masalah di pemasoknya, walaupun bukan dia yang membuat masalah itu. Inilah yang menghubungkan pembeli mobil listrik di Eropa dengan kondisi di Halmahera.</w:t>
       </w:r>
     </w:p>
     <w:tbl>
@@ -3720,7 +3799,7 @@
                 <w:sz w:val="20"/>
                 <w:szCs w:val="20"/>
               </w:rPr>
-              <w:t xml:space="preserve">Kalimat terakhir menjembatani teori ke kasus. Ucapkan dengan tempo agak lambat.</w:t>
+              <w:t xml:space="preserve">Kalimat terakhir jembatan ke kasus. Bawakan dengan tempo lambat.</w:t>
             </w:r>
           </w:p>
         </w:tc>
@@ -3810,112 +3889,91 @@
           <w:sz w:val="21"/>
           <w:szCs w:val="21"/>
         </w:rPr>
-        <w:t xml:space="preserve">Teori nomor lima, justice. Di sini pertanyaannya bergeser, dari benar atau salah menjadi susunan seperti apa yang layak disepakati bersama.</w:t>
-      </w:r>
-    </w:p>
-    <w:p>
-      <w:pPr>
-        <w:keepNext w:val="false"/>
-        <w:spacing w:after="110" w:before="0" w:line="300"/>
-        <w:jc w:val="both"/>
-      </w:pPr>
-      <w:r>
-        <w:rPr>
-          <w:rFonts w:ascii="Times New Roman" w:cs="Times New Roman" w:eastAsia="Times New Roman" w:hAnsi="Times New Roman"/>
-          <w:b w:val="false"/>
-          <w:bCs w:val="false"/>
-          <w:i w:val="false"/>
-          <w:iCs w:val="false"/>
-          <w:caps w:val="false"/>
-          <w:color w:val="16151F"/>
-          <w:sz w:val="21"/>
-          <w:szCs w:val="21"/>
-        </w:rPr>
-        <w:t xml:space="preserve">Keadilan didefinisikan sebagai perlakuan yang adil terhadap setiap orang dalam satu situasi, sehingga semua pihak memperoleh apa yang memang menjadi haknya.</w:t>
-      </w:r>
-    </w:p>
-    <w:p>
-      <w:pPr>
-        <w:keepNext w:val="false"/>
-        <w:spacing w:after="110" w:before="0" w:line="300"/>
-        <w:jc w:val="both"/>
-      </w:pPr>
-      <w:r>
-        <w:rPr>
-          <w:rFonts w:ascii="Times New Roman" w:cs="Times New Roman" w:eastAsia="Times New Roman" w:hAnsi="Times New Roman"/>
-          <w:b w:val="false"/>
-          <w:bCs w:val="false"/>
-          <w:i w:val="false"/>
-          <w:iCs w:val="false"/>
-          <w:caps w:val="false"/>
-          <w:color w:val="16151F"/>
-          <w:sz w:val="21"/>
-          <w:szCs w:val="21"/>
-        </w:rPr>
-        <w:t xml:space="preserve">Ada dua dimensi. Keadilan prosedural menilai siapa yang berhak turut memutuskan. Keadilan distributif menilai ke mana manfaat mengalir dan siapa yang menanggung bebannya.</w:t>
-      </w:r>
-    </w:p>
-    <w:p>
-      <w:pPr>
-        <w:keepNext w:val="false"/>
-        <w:spacing w:after="110" w:before="0" w:line="300"/>
-        <w:jc w:val="both"/>
-      </w:pPr>
-      <w:r>
-        <w:rPr>
-          <w:rFonts w:ascii="Times New Roman" w:cs="Times New Roman" w:eastAsia="Times New Roman" w:hAnsi="Times New Roman"/>
-          <w:b w:val="false"/>
-          <w:bCs w:val="false"/>
-          <w:i w:val="false"/>
-          <w:iCs w:val="false"/>
-          <w:caps w:val="false"/>
-          <w:color w:val="16151F"/>
-          <w:sz w:val="21"/>
-          <w:szCs w:val="21"/>
-        </w:rPr>
-        <w:t xml:space="preserve">John Rawls memberi dua prinsip. Pertama, kebebasan dasar yang setara bagi semua. Kedua, ketimpangan hanya dibenarkan bila susunan itu paling menguntungkan pihak yang paling tidak diuntungkan.</w:t>
-      </w:r>
-    </w:p>
-    <w:p>
-      <w:pPr>
-        <w:keepNext w:val="false"/>
-        <w:spacing w:after="110" w:before="0" w:line="300"/>
-        <w:jc w:val="both"/>
-      </w:pPr>
-      <w:r>
-        <w:rPr>
-          <w:rFonts w:ascii="Times New Roman" w:cs="Times New Roman" w:eastAsia="Times New Roman" w:hAnsi="Times New Roman"/>
-          <w:b w:val="false"/>
-          <w:bCs w:val="false"/>
-          <w:i w:val="false"/>
-          <w:iCs w:val="false"/>
-          <w:caps w:val="false"/>
-          <w:color w:val="16151F"/>
-          <w:sz w:val="21"/>
-          <w:szCs w:val="21"/>
-        </w:rPr>
-        <w:t xml:space="preserve">Alat yang paling mudah dipakai adalah veil of ignorance. Bayangkan Anda harus memilih kebijakan tanpa mengetahui Anda akan lahir sebagai pemegang saham smelter atau sebagai warga di hilir sungai. Kebijakan mana yang Anda pilih?</w:t>
-      </w:r>
-    </w:p>
-    <w:p>
-      <w:pPr>
-        <w:keepNext w:val="false"/>
-        <w:spacing w:after="110" w:before="0" w:line="300"/>
-        <w:jc w:val="both"/>
-      </w:pPr>
-      <w:r>
-        <w:rPr>
-          <w:rFonts w:ascii="Times New Roman" w:cs="Times New Roman" w:eastAsia="Times New Roman" w:hAnsi="Times New Roman"/>
-          <w:b w:val="false"/>
-          <w:bCs w:val="false"/>
-          <w:i w:val="false"/>
-          <w:iCs w:val="false"/>
-          <w:caps w:val="false"/>
-          <w:color w:val="16151F"/>
-          <w:sz w:val="21"/>
-          <w:szCs w:val="21"/>
-        </w:rPr>
-        <w:t xml:space="preserve">Turunan lainnya adalah teori kontrak sosial dari Hobbes, Locke, dan Rousseau. Versi bisnisnya Integrative Social Contracts Theory dari Donaldson dan Dunfee, yang memadukan hypernorms dengan kontrak mikro komunitas.</w:t>
+        <w:t xml:space="preserve">Teori nomor lima: keadilan. Pertanyaannya bergeser. Bukan lagi ini benar atau salah, tapi: pembagiannya adil atau tidak?</w:t>
+      </w:r>
+    </w:p>
+    <w:p>
+      <w:pPr>
+        <w:keepNext w:val="false"/>
+        <w:spacing w:after="110" w:before="0" w:line="300"/>
+        <w:jc w:val="both"/>
+      </w:pPr>
+      <w:r>
+        <w:rPr>
+          <w:rFonts w:ascii="Times New Roman" w:cs="Times New Roman" w:eastAsia="Times New Roman" w:hAnsi="Times New Roman"/>
+          <w:b w:val="false"/>
+          <w:bCs w:val="false"/>
+          <w:i w:val="false"/>
+          <w:iCs w:val="false"/>
+          <w:caps w:val="false"/>
+          <w:color w:val="16151F"/>
+          <w:sz w:val="21"/>
+          <w:szCs w:val="21"/>
+        </w:rPr>
+        <w:t xml:space="preserve">Keadilan itu dua macam. Pertama soal proses: siapa yang boleh ikut memutuskan? Kedua soal pembagian: enaknya ke mana, sakitnya ke siapa?</w:t>
+      </w:r>
+    </w:p>
+    <w:p>
+      <w:pPr>
+        <w:keepNext w:val="false"/>
+        <w:spacing w:after="110" w:before="0" w:line="300"/>
+        <w:jc w:val="both"/>
+      </w:pPr>
+      <w:r>
+        <w:rPr>
+          <w:rFonts w:ascii="Times New Roman" w:cs="Times New Roman" w:eastAsia="Times New Roman" w:hAnsi="Times New Roman"/>
+          <w:b w:val="false"/>
+          <w:bCs w:val="false"/>
+          <w:i w:val="false"/>
+          <w:iCs w:val="false"/>
+          <w:caps w:val="false"/>
+          <w:color w:val="16151F"/>
+          <w:sz w:val="21"/>
+          <w:szCs w:val="21"/>
+        </w:rPr>
+        <w:t xml:space="preserve">Tokoh utamanya John Rawls, dan dia punya alat uji yang sangat mudah dipakai, namanya selubung ketidaktahuan. Begini caranya. Bayangkan Anda harus memilih sebuah kebijakan, tapi Anda belum tahu akan lahir jadi siapa. Bisa jadi pemilik smelter, bisa jadi warga di pinggir sungai yang tercemar. Nah, kebijakan seperti apa yang akan Anda pilih? Kebijakan yang Anda pilih dalam kondisi buta seperti itu, itulah yang adil.</w:t>
+      </w:r>
+    </w:p>
+    <w:p>
+      <w:pPr>
+        <w:keepNext w:val="false"/>
+        <w:spacing w:after="110" w:before="0" w:line="300"/>
+        <w:jc w:val="both"/>
+      </w:pPr>
+      <w:r>
+        <w:rPr>
+          <w:rFonts w:ascii="Times New Roman" w:cs="Times New Roman" w:eastAsia="Times New Roman" w:hAnsi="Times New Roman"/>
+          <w:b w:val="false"/>
+          <w:bCs w:val="false"/>
+          <w:i w:val="false"/>
+          <w:iCs w:val="false"/>
+          <w:caps w:val="false"/>
+          <w:color w:val="16151F"/>
+          <w:sz w:val="21"/>
+          <w:szCs w:val="21"/>
+        </w:rPr>
+        <w:t xml:space="preserve">Rawls juga bilang: ketimpangan boleh saja ada, asal ketimpangan itu paling menguntungkan orang yang paling lemah.</w:t>
+      </w:r>
+    </w:p>
+    <w:p>
+      <w:pPr>
+        <w:keepNext w:val="false"/>
+        <w:spacing w:after="110" w:before="0" w:line="300"/>
+        <w:jc w:val="both"/>
+      </w:pPr>
+      <w:r>
+        <w:rPr>
+          <w:rFonts w:ascii="Times New Roman" w:cs="Times New Roman" w:eastAsia="Times New Roman" w:hAnsi="Times New Roman"/>
+          <w:b w:val="false"/>
+          <w:bCs w:val="false"/>
+          <w:i w:val="false"/>
+          <w:iCs w:val="false"/>
+          <w:caps w:val="false"/>
+          <w:color w:val="16151F"/>
+          <w:sz w:val="21"/>
+          <w:szCs w:val="21"/>
+        </w:rPr>
+        <w:t xml:space="preserve">Turunannya adalah teori kontrak sosial, versi bisnisnya menggabungkan prinsip universal dengan kesepakatan lokal di tiap komunitas.</w:t>
       </w:r>
     </w:p>
     <w:tbl>
@@ -3992,7 +4050,7 @@
                 <w:sz w:val="20"/>
                 <w:szCs w:val="20"/>
               </w:rPr>
-              <w:t xml:space="preserve">Pertanyaan veil of ignorance boleh dilempar ke kelas, tetapi jangan tunggu jawaban. Serah terima ke Rohana.</w:t>
+              <w:t xml:space="preserve">Pertanyaan selubung ketidaktahuan boleh dilempar ke kelas, tapi jangan tunggu jawaban. Serah terima ke Rohana.</w:t>
             </w:r>
           </w:p>
         </w:tc>
@@ -4082,154 +4140,70 @@
           <w:sz w:val="21"/>
           <w:szCs w:val="21"/>
         </w:rPr>
-        <w:t xml:space="preserve">Kelima teori tadi memiliki enam keberatan yang tercatat dalam bab ini.</w:t>
-      </w:r>
-    </w:p>
-    <w:p>
-      <w:pPr>
-        <w:keepNext w:val="false"/>
-        <w:spacing w:after="110" w:before="0" w:line="300"/>
-        <w:jc w:val="both"/>
-      </w:pPr>
-      <w:r>
-        <w:rPr>
-          <w:rFonts w:ascii="Times New Roman" w:cs="Times New Roman" w:eastAsia="Times New Roman" w:hAnsi="Times New Roman"/>
-          <w:b w:val="false"/>
-          <w:bCs w:val="false"/>
-          <w:i w:val="false"/>
-          <w:iCs w:val="false"/>
-          <w:caps w:val="false"/>
-          <w:color w:val="16151F"/>
-          <w:sz w:val="21"/>
-          <w:szCs w:val="21"/>
-        </w:rPr>
-        <w:t xml:space="preserve">Satu, abstraksi berlebih. Prinsipnya beroperasi pada tataran yang jauh dari persoalan konkret yang dihadapi manajer.</w:t>
-      </w:r>
-    </w:p>
-    <w:p>
-      <w:pPr>
-        <w:keepNext w:val="false"/>
-        <w:spacing w:after="110" w:before="0" w:line="300"/>
-        <w:jc w:val="both"/>
-      </w:pPr>
-      <w:r>
-        <w:rPr>
-          <w:rFonts w:ascii="Times New Roman" w:cs="Times New Roman" w:eastAsia="Times New Roman" w:hAnsi="Times New Roman"/>
-          <w:b w:val="false"/>
-          <w:bCs w:val="false"/>
-          <w:i w:val="false"/>
-          <w:iCs w:val="false"/>
-          <w:caps w:val="false"/>
-          <w:color w:val="16151F"/>
-          <w:sz w:val="21"/>
-          <w:szCs w:val="21"/>
-        </w:rPr>
-        <w:t xml:space="preserve">Dua, reduksionisme. Setiap teori menonjolkan satu dimensi moralitas dan memperlakukannya sebagai keseluruhan.</w:t>
-      </w:r>
-    </w:p>
-    <w:p>
-      <w:pPr>
-        <w:keepNext w:val="false"/>
-        <w:spacing w:after="110" w:before="0" w:line="300"/>
-        <w:jc w:val="both"/>
-      </w:pPr>
-      <w:r>
-        <w:rPr>
-          <w:rFonts w:ascii="Times New Roman" w:cs="Times New Roman" w:eastAsia="Times New Roman" w:hAnsi="Times New Roman"/>
-          <w:b w:val="false"/>
-          <w:bCs w:val="false"/>
-          <w:i w:val="false"/>
-          <w:iCs w:val="false"/>
-          <w:caps w:val="false"/>
-          <w:color w:val="16151F"/>
-          <w:sz w:val="21"/>
-          <w:szCs w:val="21"/>
-        </w:rPr>
-        <w:t xml:space="preserve">Tiga, objektivisme elitis. Kebenaran moral ditentukan melalui deduksi ahli, bukan melalui pengalaman pihak yang terlibat.</w:t>
-      </w:r>
-    </w:p>
-    <w:p>
-      <w:pPr>
-        <w:keepNext w:val="false"/>
-        <w:spacing w:after="110" w:before="0" w:line="300"/>
-        <w:jc w:val="both"/>
-      </w:pPr>
-      <w:r>
-        <w:rPr>
-          <w:rFonts w:ascii="Times New Roman" w:cs="Times New Roman" w:eastAsia="Times New Roman" w:hAnsi="Times New Roman"/>
-          <w:b w:val="false"/>
-          <w:bCs w:val="false"/>
-          <w:i w:val="false"/>
-          <w:iCs w:val="false"/>
-          <w:caps w:val="false"/>
-          <w:color w:val="16151F"/>
-          <w:sz w:val="21"/>
-          <w:szCs w:val="21"/>
-        </w:rPr>
-        <w:t xml:space="preserve">Empat, impersonalitas. Ikatan personal dan tanggung jawab pada pihak tertentu justru diposisikan sebagai pengganggu penilaian.</w:t>
-      </w:r>
-    </w:p>
-    <w:p>
-      <w:pPr>
-        <w:keepNext w:val="false"/>
-        <w:spacing w:after="110" w:before="0" w:line="300"/>
-        <w:jc w:val="both"/>
-      </w:pPr>
-      <w:r>
-        <w:rPr>
-          <w:rFonts w:ascii="Times New Roman" w:cs="Times New Roman" w:eastAsia="Times New Roman" w:hAnsi="Times New Roman"/>
-          <w:b w:val="false"/>
-          <w:bCs w:val="false"/>
-          <w:i w:val="false"/>
-          <w:iCs w:val="false"/>
-          <w:caps w:val="false"/>
-          <w:color w:val="16151F"/>
-          <w:sz w:val="21"/>
-          <w:szCs w:val="21"/>
-        </w:rPr>
-        <w:t xml:space="preserve">Lima, rasionalisme terkodifikasi. Peran perasaan, empati, dan dorongan moral diabaikan dalam perumusan penilaian etis.</w:t>
-      </w:r>
-    </w:p>
-    <w:p>
-      <w:pPr>
-        <w:keepNext w:val="false"/>
-        <w:spacing w:after="110" w:before="0" w:line="300"/>
-        <w:jc w:val="both"/>
-      </w:pPr>
-      <w:r>
-        <w:rPr>
-          <w:rFonts w:ascii="Times New Roman" w:cs="Times New Roman" w:eastAsia="Times New Roman" w:hAnsi="Times New Roman"/>
-          <w:b w:val="false"/>
-          <w:bCs w:val="false"/>
-          <w:i w:val="false"/>
-          <w:iCs w:val="false"/>
-          <w:caps w:val="false"/>
-          <w:color w:val="16151F"/>
-          <w:sz w:val="21"/>
-          <w:szCs w:val="21"/>
-        </w:rPr>
-        <w:t xml:space="preserve">Enam, imperialisme kultural. Pengalaman dan tradisi intelektual Barat diposisikan sebagai ukuran yang berlaku universal.</w:t>
-      </w:r>
-    </w:p>
-    <w:p>
-      <w:pPr>
-        <w:keepNext w:val="false"/>
-        <w:spacing w:after="110" w:before="0" w:line="300"/>
-        <w:jc w:val="both"/>
-      </w:pPr>
-      <w:r>
-        <w:rPr>
-          <w:rFonts w:ascii="Times New Roman" w:cs="Times New Roman" w:eastAsia="Times New Roman" w:hAnsi="Times New Roman"/>
-          <w:b w:val="false"/>
-          <w:bCs w:val="false"/>
-          <w:i w:val="false"/>
-          <w:iCs w:val="false"/>
-          <w:caps w:val="false"/>
-          <w:color w:val="16151F"/>
-          <w:sz w:val="21"/>
-          <w:szCs w:val="21"/>
-        </w:rPr>
-        <w:t xml:space="preserve">Keberatan nomor tiga sampai lima yang paling menentukan bagi kasus nikel, karena warga terdampak memang tidak pernah menjadi pihak dalam perumusan kebijakan.</w:t>
+        <w:t xml:space="preserve">Lima teori tadi hebat, tapi punya enam kelemahan yang diakui bukunya sendiri. Saya bacakan cepat.</w:t>
+      </w:r>
+    </w:p>
+    <w:p>
+      <w:pPr>
+        <w:keepNext w:val="false"/>
+        <w:spacing w:after="110" w:before="0" w:line="300"/>
+        <w:jc w:val="both"/>
+      </w:pPr>
+      <w:r>
+        <w:rPr>
+          <w:rFonts w:ascii="Times New Roman" w:cs="Times New Roman" w:eastAsia="Times New Roman" w:hAnsi="Times New Roman"/>
+          <w:b w:val="false"/>
+          <w:bCs w:val="false"/>
+          <w:i w:val="false"/>
+          <w:iCs w:val="false"/>
+          <w:caps w:val="false"/>
+          <w:color w:val="16151F"/>
+          <w:sz w:val="21"/>
+          <w:szCs w:val="21"/>
+        </w:rPr>
+        <w:t xml:space="preserve">Satu, terlalu melayang: prinsipnya jauh dari masalah nyata seorang manajer. Dua, terlalu menyederhanakan: tiap teori cuma melihat satu sisi tapi merasa melihat semuanya. Tiga, terlalu elitis: kebenaran ditentukan para ahli, bukan orang yang mengalami langsung. Empat, terlalu dingin: hubungan pribadi malah dianggap mengganggu penilaian. Lima, terlalu mendewakan logika: peran empati dan perasaan dibuang. Enam, terlalu Barat: pengalaman Eropa dianggap berlaku untuk seluruh dunia.</w:t>
+      </w:r>
+    </w:p>
+    <w:p>
+      <w:pPr>
+        <w:keepNext w:val="false"/>
+        <w:spacing w:after="110" w:before="0" w:line="300"/>
+        <w:jc w:val="both"/>
+      </w:pPr>
+      <w:r>
+        <w:rPr>
+          <w:rFonts w:ascii="Times New Roman" w:cs="Times New Roman" w:eastAsia="Times New Roman" w:hAnsi="Times New Roman"/>
+          <w:b w:val="false"/>
+          <w:bCs w:val="false"/>
+          <w:i w:val="false"/>
+          <w:iCs w:val="false"/>
+          <w:caps w:val="false"/>
+          <w:color w:val="16151F"/>
+          <w:sz w:val="21"/>
+          <w:szCs w:val="21"/>
+        </w:rPr>
+        <w:t xml:space="preserve">Untuk kasus nikel, kelemahan nomor tiga sampai lima itu yang paling terasa, karena warga yang terdampak memang tidak pernah diajak bicara.</w:t>
+      </w:r>
+    </w:p>
+    <w:p>
+      <w:pPr>
+        <w:keepNext w:val="false"/>
+        <w:spacing w:after="110" w:before="0" w:line="300"/>
+        <w:jc w:val="both"/>
+      </w:pPr>
+      <w:r>
+        <w:rPr>
+          <w:rFonts w:ascii="Times New Roman" w:cs="Times New Roman" w:eastAsia="Times New Roman" w:hAnsi="Times New Roman"/>
+          <w:b w:val="false"/>
+          <w:bCs w:val="false"/>
+          <w:i w:val="false"/>
+          <w:iCs w:val="false"/>
+          <w:caps w:val="false"/>
+          <w:color w:val="16151F"/>
+          <w:sz w:val="21"/>
+          <w:szCs w:val="21"/>
+        </w:rPr>
+        <w:t xml:space="preserve">Dari kelemahan-kelemahan inilah lahir empat teori alternatif berikut.</w:t>
       </w:r>
     </w:p>
     <w:tbl>
@@ -4306,7 +4280,7 @@
                 <w:sz w:val="20"/>
                 <w:szCs w:val="20"/>
               </w:rPr>
-              <w:t xml:space="preserve">Enam butir ini cukup dibacakan cepat. Yang penting kalimat penutupnya.</w:t>
+              <w:t xml:space="preserve">Enam butir dibaca cepat saja. Yang penting kalimat penutupnya.</w:t>
             </w:r>
           </w:p>
         </w:tc>
@@ -4396,70 +4370,70 @@
           <w:sz w:val="21"/>
           <w:szCs w:val="21"/>
         </w:rPr>
-        <w:t xml:space="preserve">Dari keberatan tadi lahir empat teori alternatif. Dua yang pertama menggeser objek penilaian.</w:t>
-      </w:r>
-    </w:p>
-    <w:p>
-      <w:pPr>
-        <w:keepNext w:val="false"/>
-        <w:spacing w:after="110" w:before="0" w:line="300"/>
-        <w:jc w:val="both"/>
-      </w:pPr>
-      <w:r>
-        <w:rPr>
-          <w:rFonts w:ascii="Times New Roman" w:cs="Times New Roman" w:eastAsia="Times New Roman" w:hAnsi="Times New Roman"/>
-          <w:b w:val="false"/>
-          <w:bCs w:val="false"/>
-          <w:i w:val="false"/>
-          <w:iCs w:val="false"/>
-          <w:caps w:val="false"/>
-          <w:color w:val="16151F"/>
-          <w:sz w:val="21"/>
-          <w:szCs w:val="21"/>
-        </w:rPr>
-        <w:t xml:space="preserve">Virtue ethics, teori nomor enam. Pertanyaannya bukan tindakan mana yang benar, melainkan pelaku seperti apa yang layak disebut baik pada posisi ini. Akarnya Aristoteles dalam Nicomachean Ethics, lalu MacIntyre dan Solomon. Moralitas lahir dari karakter yang dibentuk lewat pembiasaan, bukan dari aturan, dan tujuannya eudaimonia, hidup yang baik. Dalam bisnis, perusahaan dipandang sebagai komunitas praktik dengan keutamaan berupa kejujuran, keadilan, kepercayaan, dan ketangguhan. Keterbatasannya, keutamaan selalu ditentukan komunitas tertentu sehingga sulit dijadikan ukuran lintas budaya.</w:t>
-      </w:r>
-    </w:p>
-    <w:p>
-      <w:pPr>
-        <w:keepNext w:val="false"/>
-        <w:spacing w:after="110" w:before="0" w:line="300"/>
-        <w:jc w:val="both"/>
-      </w:pPr>
-      <w:r>
-        <w:rPr>
-          <w:rFonts w:ascii="Times New Roman" w:cs="Times New Roman" w:eastAsia="Times New Roman" w:hAnsi="Times New Roman"/>
-          <w:b w:val="false"/>
-          <w:bCs w:val="false"/>
-          <w:i w:val="false"/>
-          <w:iCs w:val="false"/>
-          <w:caps w:val="false"/>
-          <w:color w:val="16151F"/>
-          <w:sz w:val="21"/>
-          <w:szCs w:val="21"/>
-        </w:rPr>
-        <w:t xml:space="preserve">Virtue ethics sering disalahpahami sebagai sekadar imbauan moral. Sebenarnya ia mengajukan satu pertanyaan yang tajam: dibandingkan dengan apa kita menyebut sesuatu sudah cukup baik?</w:t>
-      </w:r>
-    </w:p>
-    <w:p>
-      <w:pPr>
-        <w:keepNext w:val="false"/>
-        <w:spacing w:after="110" w:before="0" w:line="300"/>
-        <w:jc w:val="both"/>
-      </w:pPr>
-      <w:r>
-        <w:rPr>
-          <w:rFonts w:ascii="Times New Roman" w:cs="Times New Roman" w:eastAsia="Times New Roman" w:hAnsi="Times New Roman"/>
-          <w:b w:val="false"/>
-          <w:bCs w:val="false"/>
-          <w:i w:val="false"/>
-          <w:iCs w:val="false"/>
-          <w:caps w:val="false"/>
-          <w:color w:val="16151F"/>
-          <w:sz w:val="21"/>
-          <w:szCs w:val="21"/>
-        </w:rPr>
-        <w:t xml:space="preserve">Ethic of care, teori nomor tujuh, dari Carol Gilligan dan Nel Noddings, berakar pada etika feminis. Manusia dipandang sebagai makhluk yang saling bergantung dan terjalin dalam relasi, bukan individu rasional yang terpisah. Yang dituntut empati, keselarasan, menghindari kerugian, dan tanggung jawab konkret pada orang tertentu, bukan aturan yang seragam. Keterbatasannya, prioritas pada pihak terdekat berisiko mengabaikan pihak yang jauh.</w:t>
+        <w:t xml:space="preserve">Teori nomor enam: virtue ethics, etika keutamaan. Pertanyaannya bukan lagi tindakan mana yang benar, tapi: orang seperti apa yang pantas disebut baik di posisi ini? Akarnya dari Aristoteles. Karakter yang baik dibentuk dari kebiasaan, bukan dari hafalan aturan. Di dunia bisnis wujudnya jujur, adil, bisa dipercaya, dan tangguh.</w:t>
+      </w:r>
+    </w:p>
+    <w:p>
+      <w:pPr>
+        <w:keepNext w:val="false"/>
+        <w:spacing w:after="110" w:before="0" w:line="300"/>
+        <w:jc w:val="both"/>
+      </w:pPr>
+      <w:r>
+        <w:rPr>
+          <w:rFonts w:ascii="Times New Roman" w:cs="Times New Roman" w:eastAsia="Times New Roman" w:hAnsi="Times New Roman"/>
+          <w:b w:val="false"/>
+          <w:bCs w:val="false"/>
+          <w:i w:val="false"/>
+          <w:iCs w:val="false"/>
+          <w:caps w:val="false"/>
+          <w:color w:val="16151F"/>
+          <w:sz w:val="21"/>
+          <w:szCs w:val="21"/>
+        </w:rPr>
+        <w:t xml:space="preserve">Teori ini sering dikira cuma nasihat moral. Padahal dia punya satu pertanyaan yang tajam sekali: kalau kita bilang sesuatu sudah cukup baik, cukup baik dibanding apa? Simpan pertanyaan itu, nanti terpakai di kasus.</w:t>
+      </w:r>
+    </w:p>
+    <w:p>
+      <w:pPr>
+        <w:keepNext w:val="false"/>
+        <w:spacing w:after="110" w:before="0" w:line="300"/>
+        <w:jc w:val="both"/>
+      </w:pPr>
+      <w:r>
+        <w:rPr>
+          <w:rFonts w:ascii="Times New Roman" w:cs="Times New Roman" w:eastAsia="Times New Roman" w:hAnsi="Times New Roman"/>
+          <w:b w:val="false"/>
+          <w:bCs w:val="false"/>
+          <w:i w:val="false"/>
+          <w:iCs w:val="false"/>
+          <w:caps w:val="false"/>
+          <w:color w:val="16151F"/>
+          <w:sz w:val="21"/>
+          <w:szCs w:val="21"/>
+        </w:rPr>
+        <w:t xml:space="preserve">Teori nomor tujuh: ethic of care, etika kepedulian. Pandangannya: manusia itu tidak hidup sendiri-sendiri, kita saling terhubung dan saling bergantung. Maka yang dinilai adalah bagaimana kita menjaga hubungan dengan orang yang terdampak, secara nyata, bukan lewat aturan seragam.</w:t>
+      </w:r>
+    </w:p>
+    <w:p>
+      <w:pPr>
+        <w:keepNext w:val="false"/>
+        <w:spacing w:after="110" w:before="0" w:line="300"/>
+        <w:jc w:val="both"/>
+      </w:pPr>
+      <w:r>
+        <w:rPr>
+          <w:rFonts w:ascii="Times New Roman" w:cs="Times New Roman" w:eastAsia="Times New Roman" w:hAnsi="Times New Roman"/>
+          <w:b w:val="false"/>
+          <w:bCs w:val="false"/>
+          <w:i w:val="false"/>
+          <w:iCs w:val="false"/>
+          <w:caps w:val="false"/>
+          <w:color w:val="16151F"/>
+          <w:sz w:val="21"/>
+          <w:szCs w:val="21"/>
+        </w:rPr>
+        <w:t xml:space="preserve">Kelemahan keduanya mirip: baik itu menurut ukuran komunitas mana, dan kepedulian pada orang dekat bisa membuat kita lupa pada orang jauh.</w:t>
       </w:r>
     </w:p>
     <w:tbl>
@@ -4536,7 +4510,7 @@
                 <w:sz w:val="20"/>
                 <w:szCs w:val="20"/>
               </w:rPr>
-              <w:t xml:space="preserve">Pertanyaan pembanding pada virtue ethics akan dipakai lagi di slide 18. Tandai.</w:t>
+              <w:t xml:space="preserve">Pertanyaan dibanding apa itu kail untuk slide 18. Tandai.</w:t>
             </w:r>
           </w:p>
         </w:tc>
@@ -4626,70 +4600,49 @@
           <w:sz w:val="21"/>
           <w:szCs w:val="21"/>
         </w:rPr>
-        <w:t xml:space="preserve">Dua teori alternatif berikutnya menggeser objek penilaian lebih jauh lagi.</w:t>
-      </w:r>
-    </w:p>
-    <w:p>
-      <w:pPr>
-        <w:keepNext w:val="false"/>
-        <w:spacing w:after="110" w:before="0" w:line="300"/>
-        <w:jc w:val="both"/>
-      </w:pPr>
-      <w:r>
-        <w:rPr>
-          <w:rFonts w:ascii="Times New Roman" w:cs="Times New Roman" w:eastAsia="Times New Roman" w:hAnsi="Times New Roman"/>
-          <w:b w:val="false"/>
-          <w:bCs w:val="false"/>
-          <w:i w:val="false"/>
-          <w:iCs w:val="false"/>
-          <w:caps w:val="false"/>
-          <w:color w:val="16151F"/>
-          <w:sz w:val="21"/>
-          <w:szCs w:val="21"/>
-        </w:rPr>
-        <w:t xml:space="preserve">Discourse ethics, teori nomor delapan, dari Jurgen Habermas bersama Karl Otto Apel. Norma tidak ditetapkan filsuf dari luar, melainkan dihasilkan dialog rasional antara semua pihak terdampak. Syaratnya disebut ideal speech situation. Semua pihak boleh ikut, bebas paksaan, dan argumen dinilai dari kekuatannya sendiri, bukan dari kekuasaan pengusulnya. Orientasinya penyelesaian konflik secara damai, bukan pembuktian satu kebenaran.</w:t>
-      </w:r>
-    </w:p>
-    <w:p>
-      <w:pPr>
-        <w:keepNext w:val="false"/>
-        <w:spacing w:after="110" w:before="0" w:line="300"/>
-        <w:jc w:val="both"/>
-      </w:pPr>
-      <w:r>
-        <w:rPr>
-          <w:rFonts w:ascii="Times New Roman" w:cs="Times New Roman" w:eastAsia="Times New Roman" w:hAnsi="Times New Roman"/>
-          <w:b w:val="false"/>
-          <w:bCs w:val="false"/>
-          <w:i w:val="false"/>
-          <w:iCs w:val="false"/>
-          <w:caps w:val="false"/>
-          <w:color w:val="16151F"/>
-          <w:sz w:val="21"/>
-          <w:szCs w:val="21"/>
-        </w:rPr>
-        <w:t xml:space="preserve">Konsekuensinya penting. Prosedur yang cacat sudah cukup untuk membatalkan hasilnya, sekalipun hasil itu tampak baik.</w:t>
-      </w:r>
-    </w:p>
-    <w:p>
-      <w:pPr>
-        <w:keepNext w:val="false"/>
-        <w:spacing w:after="110" w:before="0" w:line="300"/>
-        <w:jc w:val="both"/>
-      </w:pPr>
-      <w:r>
-        <w:rPr>
-          <w:rFonts w:ascii="Times New Roman" w:cs="Times New Roman" w:eastAsia="Times New Roman" w:hAnsi="Times New Roman"/>
-          <w:b w:val="false"/>
-          <w:bCs w:val="false"/>
-          <w:i w:val="false"/>
-          <w:iCs w:val="false"/>
-          <w:caps w:val="false"/>
-          <w:color w:val="16151F"/>
-          <w:sz w:val="21"/>
-          <w:szCs w:val="21"/>
-        </w:rPr>
-        <w:t xml:space="preserve">Postmodern ethics, teori nomor sembilan, dari Zygmunt Bauman dengan latar pemikiran Derrida dan Lyotard. Dorongan moral dan perasaan didahulukan atas perhitungan rasional. Kritiknya diarahkan pada organisasi. Prosedur, pembagian tugas, dan jarak birokratis menciptakan jarak moral yang menumpulkan dorongan itu. Sikap yang dituntut adalah mempertanyakan bahasa dan asumsi yang sudah dianggap wajar, lalu bertindak pada skala lokal tempat akibatnya dirasakan.</w:t>
+        <w:t xml:space="preserve">Teori nomor delapan: discourse ethics, dari Habermas. Idenya menarik: aturan yang baik itu tidak diturunkan dari atas, tapi lahir dari musyawarah semua pihak yang terkena dampak. Syarat musyawarahnya ketat: semua boleh ikut, tidak ada yang menekan, dan yang menang adalah argumen terkuat, bukan orang terkuat.</w:t>
+      </w:r>
+    </w:p>
+    <w:p>
+      <w:pPr>
+        <w:keepNext w:val="false"/>
+        <w:spacing w:after="110" w:before="0" w:line="300"/>
+        <w:jc w:val="both"/>
+      </w:pPr>
+      <w:r>
+        <w:rPr>
+          <w:rFonts w:ascii="Times New Roman" w:cs="Times New Roman" w:eastAsia="Times New Roman" w:hAnsi="Times New Roman"/>
+          <w:b w:val="false"/>
+          <w:bCs w:val="false"/>
+          <w:i w:val="false"/>
+          <w:iCs w:val="false"/>
+          <w:caps w:val="false"/>
+          <w:color w:val="16151F"/>
+          <w:sz w:val="21"/>
+          <w:szCs w:val="21"/>
+        </w:rPr>
+        <w:t xml:space="preserve">Akibatnya penting sekali: kalau prosesnya cacat, hasilnya batal. Sebagus apa pun hasilnya, kalau pihak terdampak tidak pernah diajak bicara, keputusannya tidak sah secara etis.</w:t>
+      </w:r>
+    </w:p>
+    <w:p>
+      <w:pPr>
+        <w:keepNext w:val="false"/>
+        <w:spacing w:after="110" w:before="0" w:line="300"/>
+        <w:jc w:val="both"/>
+      </w:pPr>
+      <w:r>
+        <w:rPr>
+          <w:rFonts w:ascii="Times New Roman" w:cs="Times New Roman" w:eastAsia="Times New Roman" w:hAnsi="Times New Roman"/>
+          <w:b w:val="false"/>
+          <w:bCs w:val="false"/>
+          <w:i w:val="false"/>
+          <w:iCs w:val="false"/>
+          <w:caps w:val="false"/>
+          <w:color w:val="16151F"/>
+          <w:sz w:val="21"/>
+          <w:szCs w:val="21"/>
+        </w:rPr>
+        <w:t xml:space="preserve">Teori nomor sembilan: postmodern ethics, dari Bauman. Teori ini curiga pada kata-kata. Pertanyaannya: istilah yang dipakai itu menguntungkan siapa? Kata yang sama bisa dibungkus untuk kesan yang berbeda.</w:t>
       </w:r>
     </w:p>
     <w:p>
@@ -4787,7 +4740,7 @@
                 <w:sz w:val="20"/>
                 <w:szCs w:val="20"/>
               </w:rPr>
-              <w:t xml:space="preserve">Kalimat penutup adalah kail untuk slide 18 dan 19. Ucapkan dengan jelas.</w:t>
+              <w:t xml:space="preserve">Kalimat penutup adalah kail untuk slide 18 dan 19. Ucapkan jelas.</w:t>
             </w:r>
           </w:p>
         </w:tc>
@@ -4877,28 +4830,28 @@
           <w:sz w:val="21"/>
           <w:szCs w:val="21"/>
         </w:rPr>
-        <w:t xml:space="preserve">Sebelum masuk ke kasus, kami rangkum kesembilan teori menjadi sembilan pertanyaan penilaian. Silakan difoto, karena selama bagian kasus teman-teman dapat menandai sendiri jawabannya sebelum kami bahas.</w:t>
-      </w:r>
-    </w:p>
-    <w:p>
-      <w:pPr>
-        <w:keepNext w:val="false"/>
-        <w:spacing w:after="110" w:before="0" w:line="300"/>
-        <w:jc w:val="both"/>
-      </w:pPr>
-      <w:r>
-        <w:rPr>
-          <w:rFonts w:ascii="Times New Roman" w:cs="Times New Roman" w:eastAsia="Times New Roman" w:hAnsi="Times New Roman"/>
-          <w:b w:val="false"/>
-          <w:bCs w:val="false"/>
-          <w:i w:val="false"/>
-          <w:iCs w:val="false"/>
-          <w:caps w:val="false"/>
-          <w:color w:val="16151F"/>
-          <w:sz w:val="21"/>
-          <w:szCs w:val="21"/>
-        </w:rPr>
-        <w:t xml:space="preserve">Intinya, tidak ada satu teori yang memberikan jawaban lengkap. Pendekatan pluralis Bab 3 menghasilkan sembilan penilaian atas rangkaian fakta yang identik, lalu yang dicari adalah arah konvergensinya, bukan satu jawaban tunggal.</w:t>
+        <w:t xml:space="preserve">Supaya gampang dipakai, kami ringkas sembilan teori tadi jadi sembilan pertanyaan di slide ini. Silakan difoto dulu.</w:t>
+      </w:r>
+    </w:p>
+    <w:p>
+      <w:pPr>
+        <w:keepNext w:val="false"/>
+        <w:spacing w:after="110" w:before="0" w:line="300"/>
+        <w:jc w:val="both"/>
+      </w:pPr>
+      <w:r>
+        <w:rPr>
+          <w:rFonts w:ascii="Times New Roman" w:cs="Times New Roman" w:eastAsia="Times New Roman" w:hAnsi="Times New Roman"/>
+          <w:b w:val="false"/>
+          <w:bCs w:val="false"/>
+          <w:i w:val="false"/>
+          <w:iCs w:val="false"/>
+          <w:caps w:val="false"/>
+          <w:color w:val="16151F"/>
+          <w:sz w:val="21"/>
+          <w:szCs w:val="21"/>
+        </w:rPr>
+        <w:t xml:space="preserve">Ingat, tidak ada satu teori yang bisa menjawab semuanya. Yang kita cari bukan satu jawaban benar, tapi arah yang sama dari sembilan penilaian yang berbeda. Kalau sembilan sudut pandang yang berbeda menunjuk ke arah yang sama, kesimpulan kita jadi kuat sekali.</w:t>
       </w:r>
     </w:p>
     <w:tbl>
@@ -4975,7 +4928,7 @@
                 <w:sz w:val="20"/>
                 <w:szCs w:val="20"/>
               </w:rPr>
-              <w:t xml:space="preserve">Beri jeda tiga detik supaya kelas sempat memotret. Serah terima ke Aslih.</w:t>
+              <w:t xml:space="preserve">Jeda tiga detik untuk memotret. Serah terima ke Aslih.</w:t>
             </w:r>
           </w:p>
         </w:tc>
@@ -5065,91 +5018,70 @@
           <w:sz w:val="21"/>
           <w:szCs w:val="21"/>
         </w:rPr>
-        <w:t xml:space="preserve">Masuk ke bagian kedua. Kebijakannya hanya satu instrumen regulasi, tetapi mengubah struktur industri nikel nasional.</w:t>
-      </w:r>
-    </w:p>
-    <w:p>
-      <w:pPr>
-        <w:keepNext w:val="false"/>
-        <w:spacing w:after="110" w:before="0" w:line="300"/>
-        <w:jc w:val="both"/>
-      </w:pPr>
-      <w:r>
-        <w:rPr>
-          <w:rFonts w:ascii="Times New Roman" w:cs="Times New Roman" w:eastAsia="Times New Roman" w:hAnsi="Times New Roman"/>
-          <w:b w:val="false"/>
-          <w:bCs w:val="false"/>
-          <w:i w:val="false"/>
-          <w:iCs w:val="false"/>
-          <w:caps w:val="false"/>
-          <w:color w:val="16151F"/>
-          <w:sz w:val="21"/>
-          <w:szCs w:val="21"/>
-        </w:rPr>
-        <w:t xml:space="preserve">Instrumennya Peraturan Menteri ESDM Nomor 11 Tahun 2019, yang melarang ekspor bijih nikel dan berlaku efektif 1 Januari 2020. Mekanismenya, bijih wajib diolah di dalam negeri dan kepemilikan smelter menjadi syarat masuk kawasan industri. Sengketanya, panel WTO memutus kebijakan ini melanggar aturan perdagangan pada November 2022.</w:t>
-      </w:r>
-    </w:p>
-    <w:p>
-      <w:pPr>
-        <w:keepNext w:val="false"/>
-        <w:spacing w:after="110" w:before="0" w:line="300"/>
-        <w:jc w:val="both"/>
-      </w:pPr>
-      <w:r>
-        <w:rPr>
-          <w:rFonts w:ascii="Times New Roman" w:cs="Times New Roman" w:eastAsia="Times New Roman" w:hAnsi="Times New Roman"/>
-          <w:b w:val="false"/>
-          <w:bCs w:val="false"/>
-          <w:i w:val="false"/>
-          <w:iCs w:val="false"/>
-          <w:caps w:val="false"/>
-          <w:color w:val="16151F"/>
-          <w:sz w:val="21"/>
-          <w:szCs w:val="21"/>
-        </w:rPr>
-        <w:t xml:space="preserve">Kronologinya, larangan pertama sudah ada pada 2014 lalu direlaksasi, Permen ESDM Nomor 11 terbit pada 2019, berlaku efektif pada 2020, panel WTO memenangkan Uni Eropa pada 2022, dan pada 2025 nilai ekspor produk olahan mencapai 40 miliar dolar.</w:t>
-      </w:r>
-    </w:p>
-    <w:p>
-      <w:pPr>
-        <w:keepNext w:val="false"/>
-        <w:spacing w:after="110" w:before="0" w:line="300"/>
-        <w:jc w:val="both"/>
-      </w:pPr>
-      <w:r>
-        <w:rPr>
-          <w:rFonts w:ascii="Times New Roman" w:cs="Times New Roman" w:eastAsia="Times New Roman" w:hAnsi="Times New Roman"/>
-          <w:b w:val="false"/>
-          <w:bCs w:val="false"/>
-          <w:i w:val="false"/>
-          <w:iCs w:val="false"/>
-          <w:caps w:val="false"/>
-          <w:color w:val="16151F"/>
-          <w:sz w:val="21"/>
-          <w:szCs w:val="21"/>
-        </w:rPr>
-        <w:t xml:space="preserve">Yang membuat kasus ini layak dibahas dalam mata kuliah etika bisnis adalah struktur biayanya. Manfaatnya besar, terukur, dan terkonsentrasi. Bebannya tersebar, tertunda, dan sulit dikuantifikasi. Persoalan dengan struktur seperti ini tidak dapat diselesaikan melalui satu kriteria penilaian saja.</w:t>
-      </w:r>
-    </w:p>
-    <w:p>
-      <w:pPr>
-        <w:keepNext w:val="false"/>
-        <w:spacing w:after="110" w:before="0" w:line="300"/>
-        <w:jc w:val="both"/>
-      </w:pPr>
-      <w:r>
-        <w:rPr>
-          <w:rFonts w:ascii="Times New Roman" w:cs="Times New Roman" w:eastAsia="Times New Roman" w:hAnsi="Times New Roman"/>
-          <w:b w:val="false"/>
-          <w:bCs w:val="false"/>
-          <w:i w:val="false"/>
-          <w:iCs w:val="false"/>
-          <w:caps w:val="false"/>
-          <w:color w:val="16151F"/>
-          <w:sz w:val="21"/>
-          <w:szCs w:val="21"/>
-        </w:rPr>
-        <w:t xml:space="preserve">Perlu kami sampaikan juga, kebijakannya masih berjalan dan sengketa dagangnya belum tuntas. Justru kasus yang belum selesai yang paling layak didiskusikan di kelas.</w:t>
+        <w:t xml:space="preserve">Sekarang kasusnya. Kebijakannya sebenarnya satu aturan saja: sejak Januari 2020, bijih nikel mentah dilarang diekspor. Mau jual nikel? Olah dulu di dalam negeri. Dan untuk masuk kawasan industri, perusahaan harus punya smelter, pabrik pengolahnya.</w:t>
+      </w:r>
+    </w:p>
+    <w:p>
+      <w:pPr>
+        <w:keepNext w:val="false"/>
+        <w:spacing w:after="110" w:before="0" w:line="300"/>
+        <w:jc w:val="both"/>
+      </w:pPr>
+      <w:r>
+        <w:rPr>
+          <w:rFonts w:ascii="Times New Roman" w:cs="Times New Roman" w:eastAsia="Times New Roman" w:hAnsi="Times New Roman"/>
+          <w:b w:val="false"/>
+          <w:bCs w:val="false"/>
+          <w:i w:val="false"/>
+          <w:iCs w:val="false"/>
+          <w:caps w:val="false"/>
+          <w:color w:val="16151F"/>
+          <w:sz w:val="21"/>
+          <w:szCs w:val="21"/>
+        </w:rPr>
+        <w:t xml:space="preserve">Garis waktunya begini: larangan pertama tahun 2014 sempat dilonggarkan, aturan finalnya terbit 2019, berlaku 2020. Tahun 2022 Indonesia digugat Uni Eropa dan kalah di WTO, organisasi perdagangan dunia. Sengketanya masih berjalan. Tahun 2025 ekspor olahan nikel tembus 40 miliar dolar.</w:t>
+      </w:r>
+    </w:p>
+    <w:p>
+      <w:pPr>
+        <w:keepNext w:val="false"/>
+        <w:spacing w:after="110" w:before="0" w:line="300"/>
+        <w:jc w:val="both"/>
+      </w:pPr>
+      <w:r>
+        <w:rPr>
+          <w:rFonts w:ascii="Times New Roman" w:cs="Times New Roman" w:eastAsia="Times New Roman" w:hAnsi="Times New Roman"/>
+          <w:b w:val="false"/>
+          <w:bCs w:val="false"/>
+          <w:i w:val="false"/>
+          <w:iCs w:val="false"/>
+          <w:caps w:val="false"/>
+          <w:color w:val="16151F"/>
+          <w:sz w:val="21"/>
+          <w:szCs w:val="21"/>
+        </w:rPr>
+        <w:t xml:space="preserve">Kenapa kasus ini menarik untuk pelajaran etika? Karena bentuknya khas: manfaatnya besar, gampang dihitung, dan jatuh ke pihak yang jelas. Bebannya sebaliknya: menyebar ke banyak orang, munculnya belakangan, dan susah dihitung. Masalah dengan bentuk seperti ini tidak bisa diadili pakai satu kriteria saja.</w:t>
+      </w:r>
+    </w:p>
+    <w:p>
+      <w:pPr>
+        <w:keepNext w:val="false"/>
+        <w:spacing w:after="110" w:before="0" w:line="300"/>
+        <w:jc w:val="both"/>
+      </w:pPr>
+      <w:r>
+        <w:rPr>
+          <w:rFonts w:ascii="Times New Roman" w:cs="Times New Roman" w:eastAsia="Times New Roman" w:hAnsi="Times New Roman"/>
+          <w:b w:val="false"/>
+          <w:bCs w:val="false"/>
+          <w:i w:val="false"/>
+          <w:iCs w:val="false"/>
+          <w:caps w:val="false"/>
+          <w:color w:val="16151F"/>
+          <w:sz w:val="21"/>
+          <w:szCs w:val="21"/>
+        </w:rPr>
+        <w:t xml:space="preserve">Oh ya, semua angka kami ambil per Agustus 2026, dan kasusnya masih berjalan, jadi angkanya bisa berubah tahun depan.</w:t>
       </w:r>
     </w:p>
     <w:tbl>
@@ -5226,7 +5158,7 @@
                 <w:sz w:val="20"/>
                 <w:szCs w:val="20"/>
               </w:rPr>
-              <w:t xml:space="preserve">Sebutkan bahwa data ditelusuri Agustus 2026, supaya angkanya jelas berbatas waktu. Serah terima ke Rohana.</w:t>
+              <w:t xml:space="preserve">Sebut batas waktu data supaya kelas tahu angkanya bertanggal. Serah terima ke Rohana.</w:t>
             </w:r>
           </w:p>
         </w:tc>
@@ -5316,91 +5248,91 @@
           <w:sz w:val="21"/>
           <w:szCs w:val="21"/>
         </w:rPr>
-        <w:t xml:space="preserve">Slide ini memuat dua kolom yang sama-sama bersandar pada data resmi.</w:t>
-      </w:r>
-    </w:p>
-    <w:p>
-      <w:pPr>
-        <w:keepNext w:val="false"/>
-        <w:spacing w:after="110" w:before="0" w:line="300"/>
-        <w:jc w:val="both"/>
-      </w:pPr>
-      <w:r>
-        <w:rPr>
-          <w:rFonts w:ascii="Times New Roman" w:cs="Times New Roman" w:eastAsia="Times New Roman" w:hAnsi="Times New Roman"/>
-          <w:b w:val="false"/>
-          <w:bCs w:val="false"/>
-          <w:i w:val="false"/>
-          <w:iCs w:val="false"/>
-          <w:caps w:val="false"/>
-          <w:color w:val="16151F"/>
-          <w:sz w:val="21"/>
-          <w:szCs w:val="21"/>
-        </w:rPr>
-        <w:t xml:space="preserve">Kolom pendukung memakai bingkai hilirisasi berdaulat. Nilai ekspor produk nikel olahan 40 miliar dolar pada 2025, naik dari 3 miliar dolar pada 2020. Investasi terkumpul di kawasan IMIP Morowali 41,5 miliar dolar sampai Desember 2025. Tenaga kerja terserap 166 ribu orang di IMIP dan IWIP, dari 35.952 orang pada 2020. Dan Indonesia menjadi simpul utama rantai pasok baterai dunia.</w:t>
-      </w:r>
-    </w:p>
-    <w:p>
-      <w:pPr>
-        <w:keepNext w:val="false"/>
-        <w:spacing w:after="110" w:before="0" w:line="300"/>
-        <w:jc w:val="both"/>
-      </w:pPr>
-      <w:r>
-        <w:rPr>
-          <w:rFonts w:ascii="Times New Roman" w:cs="Times New Roman" w:eastAsia="Times New Roman" w:hAnsi="Times New Roman"/>
-          <w:b w:val="false"/>
-          <w:bCs w:val="false"/>
-          <w:i w:val="false"/>
-          <w:iCs w:val="false"/>
-          <w:caps w:val="false"/>
-          <w:color w:val="16151F"/>
-          <w:sz w:val="21"/>
-          <w:szCs w:val="21"/>
-        </w:rPr>
-        <w:t xml:space="preserve">Kolom penentang memakai bingkai ekstraksi berbiaya sosial. Upah pokok 3 sampai 3,6 juta rupiah per bulan, di bawah upah minimum Morowali 2025 yang sebesar 3,7 juta. Tercatat 107 pekerja meninggal beserta 155 pekerja luka pada 104 kecelakaan smelter sepanjang 2019 sampai 2025. Tutupan pohon hilang 163 ribu hektare di Halmahera, dan industri nikel memegang 76 persen pembangkit listrik tenaga uap. Nilai tambah yang tinggal di Morowali hanya 4,35 persen, sementara kemiskinannya 12,58 persen.</w:t>
-      </w:r>
-    </w:p>
-    <w:p>
-      <w:pPr>
-        <w:keepNext w:val="false"/>
-        <w:spacing w:after="110" w:before="0" w:line="300"/>
-        <w:jc w:val="both"/>
-      </w:pPr>
-      <w:r>
-        <w:rPr>
-          <w:rFonts w:ascii="Times New Roman" w:cs="Times New Roman" w:eastAsia="Times New Roman" w:hAnsi="Times New Roman"/>
-          <w:b w:val="false"/>
-          <w:bCs w:val="false"/>
-          <w:i w:val="false"/>
-          <w:iCs w:val="false"/>
-          <w:caps w:val="false"/>
-          <w:color w:val="16151F"/>
-          <w:sz w:val="21"/>
-          <w:szCs w:val="21"/>
-        </w:rPr>
-        <w:t xml:space="preserve">Ada pula beban yang sama sekali tidak masuk neraca ekspor. Sungai Ake Jira tidak lagi layak dipakai warga, dan 40 persen wilayah adat O Hongana Manyawa sudah berizin tambang.</w:t>
-      </w:r>
-    </w:p>
-    <w:p>
-      <w:pPr>
-        <w:keepNext w:val="false"/>
-        <w:spacing w:after="110" w:before="0" w:line="300"/>
-        <w:jc w:val="both"/>
-      </w:pPr>
-      <w:r>
-        <w:rPr>
-          <w:rFonts w:ascii="Times New Roman" w:cs="Times New Roman" w:eastAsia="Times New Roman" w:hAnsi="Times New Roman"/>
-          <w:b w:val="false"/>
-          <w:bCs w:val="false"/>
-          <w:i w:val="false"/>
-          <w:iCs w:val="false"/>
-          <w:caps w:val="false"/>
-          <w:color w:val="16151F"/>
-          <w:sz w:val="21"/>
-          <w:szCs w:val="21"/>
-        </w:rPr>
-        <w:t xml:space="preserve">Mohon angkanya tidak diperdebatkan. Kedua kolom ini benar. Justru itu yang membuat kasus ini membutuhkan sembilan kriteria, bukan satu.</w:t>
+        <w:t xml:space="preserve">Slide ini dua kolom, dan dua-duanya benar. Itu justru intinya.</w:t>
+      </w:r>
+    </w:p>
+    <w:p>
+      <w:pPr>
+        <w:keepNext w:val="false"/>
+        <w:spacing w:after="110" w:before="0" w:line="300"/>
+        <w:jc w:val="both"/>
+      </w:pPr>
+      <w:r>
+        <w:rPr>
+          <w:rFonts w:ascii="Times New Roman" w:cs="Times New Roman" w:eastAsia="Times New Roman" w:hAnsi="Times New Roman"/>
+          <w:b w:val="false"/>
+          <w:bCs w:val="false"/>
+          <w:i w:val="false"/>
+          <w:iCs w:val="false"/>
+          <w:caps w:val="false"/>
+          <w:color w:val="16151F"/>
+          <w:sz w:val="21"/>
+          <w:szCs w:val="21"/>
+        </w:rPr>
+        <w:t xml:space="preserve">Kolom kiri, kabar baiknya. Ekspor olahan nikel naik dari 3 miliar jadi 40 miliar dolar dalam lima tahun. Investasi yang masuk ke kawasan Morowali 41,5 miliar dolar. Pekerja yang terserap 166 ribu orang, padahal tadinya 36 ribu. Dan Indonesia sekarang jadi pemain utama rantai baterai dunia.</w:t>
+      </w:r>
+    </w:p>
+    <w:p>
+      <w:pPr>
+        <w:keepNext w:val="false"/>
+        <w:spacing w:after="110" w:before="0" w:line="300"/>
+        <w:jc w:val="both"/>
+      </w:pPr>
+      <w:r>
+        <w:rPr>
+          <w:rFonts w:ascii="Times New Roman" w:cs="Times New Roman" w:eastAsia="Times New Roman" w:hAnsi="Times New Roman"/>
+          <w:b w:val="false"/>
+          <w:bCs w:val="false"/>
+          <w:i w:val="false"/>
+          <w:iCs w:val="false"/>
+          <w:caps w:val="false"/>
+          <w:color w:val="16151F"/>
+          <w:sz w:val="21"/>
+          <w:szCs w:val="21"/>
+        </w:rPr>
+        <w:t xml:space="preserve">Kolom kanan, tagihannya. Upah pokok pekerja 3 sampai 3,6 juta, masih di bawah upah minimum Morowali yang 3,7 juta. Ada 107 pekerja meninggal dan 155 luka dalam kecelakaan smelter selama enam tahun. Hutan yang hilang di Halmahera 163 ribu hektare, dan listrik kawasan ini sebagian besar dari batu bara. Dari semua nilai tambah itu, yang tinggal di Morowali cuma 4,35 persen, dan kemiskinannya masih 12,58 persen.</w:t>
+      </w:r>
+    </w:p>
+    <w:p>
+      <w:pPr>
+        <w:keepNext w:val="false"/>
+        <w:spacing w:after="110" w:before="0" w:line="300"/>
+        <w:jc w:val="both"/>
+      </w:pPr>
+      <w:r>
+        <w:rPr>
+          <w:rFonts w:ascii="Times New Roman" w:cs="Times New Roman" w:eastAsia="Times New Roman" w:hAnsi="Times New Roman"/>
+          <w:b w:val="false"/>
+          <w:bCs w:val="false"/>
+          <w:i w:val="false"/>
+          <w:iCs w:val="false"/>
+          <w:caps w:val="false"/>
+          <w:color w:val="16151F"/>
+          <w:sz w:val="21"/>
+          <w:szCs w:val="21"/>
+        </w:rPr>
+        <w:t xml:space="preserve">Ada juga beban yang tidak masuk hitungan mana pun: sungai Ake Jira sudah tidak bisa dipakai warga, dan 40 persen wilayah masyarakat adat O Hongana Manyawa sudah dikapling izin tambang.</w:t>
+      </w:r>
+    </w:p>
+    <w:p>
+      <w:pPr>
+        <w:keepNext w:val="false"/>
+        <w:spacing w:after="110" w:before="0" w:line="300"/>
+        <w:jc w:val="both"/>
+      </w:pPr>
+      <w:r>
+        <w:rPr>
+          <w:rFonts w:ascii="Times New Roman" w:cs="Times New Roman" w:eastAsia="Times New Roman" w:hAnsi="Times New Roman"/>
+          <w:b w:val="false"/>
+          <w:bCs w:val="false"/>
+          <w:i w:val="false"/>
+          <w:iCs w:val="false"/>
+          <w:caps w:val="false"/>
+          <w:color w:val="16151F"/>
+          <w:sz w:val="21"/>
+          <w:szCs w:val="21"/>
+        </w:rPr>
+        <w:t xml:space="preserve">Jadi tolong jangan adu angka. Dua kolom ini sama-sama benar. Yang berbeda adalah kacamata yang dipakai untuk menilainya. Karena itu kita butuh sembilan kacamata, bukan satu.</w:t>
       </w:r>
     </w:p>
     <w:tbl>
@@ -5477,7 +5409,7 @@
                 <w:sz w:val="20"/>
                 <w:szCs w:val="20"/>
               </w:rPr>
-              <w:t xml:space="preserve">Bacakan kolom kiri lebih dahulu sampai selesai, baru kolom kanan. Jangan berpindah bolak-balik.</w:t>
+              <w:t xml:space="preserve">Bacakan kolom kiri sampai habis dulu, baru kolom kanan. Jangan bolak-balik.</w:t>
             </w:r>
           </w:p>
         </w:tc>
@@ -5567,112 +5499,112 @@
           <w:sz w:val="21"/>
           <w:szCs w:val="21"/>
         </w:rPr>
-        <w:t xml:space="preserve">Sekarang rangkaian fakta tadi kita uji dengan lima teori modernis.</w:t>
-      </w:r>
-    </w:p>
-    <w:p>
-      <w:pPr>
-        <w:keepNext w:val="false"/>
-        <w:spacing w:after="110" w:before="0" w:line="300"/>
-        <w:jc w:val="both"/>
-      </w:pPr>
-      <w:r>
-        <w:rPr>
-          <w:rFonts w:ascii="Times New Roman" w:cs="Times New Roman" w:eastAsia="Times New Roman" w:hAnsi="Times New Roman"/>
-          <w:b w:val="false"/>
-          <w:bCs w:val="false"/>
-          <w:i w:val="false"/>
-          <w:iCs w:val="false"/>
-          <w:caps w:val="false"/>
-          <w:color w:val="16151F"/>
-          <w:sz w:val="21"/>
-          <w:szCs w:val="21"/>
-        </w:rPr>
-        <w:t xml:space="preserve">Egoism, hasilnya netral. Pada horizon pendek kebijakan ini jelas melayani kepentingan Indonesia. Namun pada horizon panjang, biaya kesehatan warga, pemulihan sungai, dan pensiun dini pembangkit batu bara belum diinternalisasi. Justru kepentingan diri yang dihitung cermat menuntut biaya tertunda itu masuk sejak awal.</w:t>
-      </w:r>
-    </w:p>
-    <w:p>
-      <w:pPr>
-        <w:keepNext w:val="false"/>
-        <w:spacing w:after="110" w:before="0" w:line="300"/>
-        <w:jc w:val="both"/>
-      </w:pPr>
-      <w:r>
-        <w:rPr>
-          <w:rFonts w:ascii="Times New Roman" w:cs="Times New Roman" w:eastAsia="Times New Roman" w:hAnsi="Times New Roman"/>
-          <w:b w:val="false"/>
-          <w:bCs w:val="false"/>
-          <w:i w:val="false"/>
-          <w:iCs w:val="false"/>
-          <w:caps w:val="false"/>
-          <w:color w:val="16151F"/>
-          <w:sz w:val="21"/>
-          <w:szCs w:val="21"/>
-        </w:rPr>
-        <w:t xml:space="preserve">Utilitarianism, hasilnya ambivalen, dan ini bagian terpenting dari slide ini. Act utilitarianism cenderung mendukung, sebab manfaat 166 ribu lapangan kerja nyata dan terukur sedangkan kerugiannya tersebar. Rule utilitarianism justru menolak, sebab bila setiap negara pemilik cadangan menempuh pengolahan bertenaga batu bara, tambahan emisinya membatalkan manfaat transisi energi yang justru menjadi pembenarnya. Keduanya utilitarianism, kesimpulannya berlawanan, dan pembedanya hanya unit analisis.</w:t>
-      </w:r>
-    </w:p>
-    <w:p>
-      <w:pPr>
-        <w:keepNext w:val="false"/>
-        <w:spacing w:after="110" w:before="0" w:line="300"/>
-        <w:jc w:val="both"/>
-      </w:pPr>
-      <w:r>
-        <w:rPr>
-          <w:rFonts w:ascii="Times New Roman" w:cs="Times New Roman" w:eastAsia="Times New Roman" w:hAnsi="Times New Roman"/>
-          <w:b w:val="false"/>
-          <w:bCs w:val="false"/>
-          <w:i w:val="false"/>
-          <w:iCs w:val="false"/>
-          <w:caps w:val="false"/>
-          <w:color w:val="16151F"/>
-          <w:sz w:val="21"/>
-          <w:szCs w:val="21"/>
-        </w:rPr>
-        <w:t xml:space="preserve">Ethics of duty, menolak. Maksimnya berbunyi, pengolahan boleh dipercepat sambil menunda standar upah, keselamatan, dan lingkungan. Bila maksim itu diuniversalkan, standarnya kehilangan daya ikat. Formulasi kedua juga gagal, sebab upah di bawah minimum dan lembur sampai 13 jam menjadikan pekerja sarana semata.</w:t>
-      </w:r>
-    </w:p>
-    <w:p>
-      <w:pPr>
-        <w:keepNext w:val="false"/>
-        <w:spacing w:after="110" w:before="0" w:line="300"/>
-        <w:jc w:val="both"/>
-      </w:pPr>
-      <w:r>
-        <w:rPr>
-          <w:rFonts w:ascii="Times New Roman" w:cs="Times New Roman" w:eastAsia="Times New Roman" w:hAnsi="Times New Roman"/>
-          <w:b w:val="false"/>
-          <w:bCs w:val="false"/>
-          <w:i w:val="false"/>
-          <w:iCs w:val="false"/>
-          <w:caps w:val="false"/>
-          <w:color w:val="16151F"/>
-          <w:sz w:val="21"/>
-          <w:szCs w:val="21"/>
-        </w:rPr>
-        <w:t xml:space="preserve">Ethics of rights, bersyarat. Hak atas pekerjaan terpenuhi bagi 166 ribu pekerja, dan sampai titik itu kebijakan ini dapat dipertahankan. Namun hak atas kondisi kerja yang adil, kesehatan, air bersih, dan tanah leluhur terlanggar bersamaan. UNGP menuntut penghormatan pada seluruh relasi bisnis, bukan hanya pada operasi sendiri.</w:t>
-      </w:r>
-    </w:p>
-    <w:p>
-      <w:pPr>
-        <w:keepNext w:val="false"/>
-        <w:spacing w:after="110" w:before="0" w:line="300"/>
-        <w:jc w:val="both"/>
-      </w:pPr>
-      <w:r>
-        <w:rPr>
-          <w:rFonts w:ascii="Times New Roman" w:cs="Times New Roman" w:eastAsia="Times New Roman" w:hAnsi="Times New Roman"/>
-          <w:b w:val="false"/>
-          <w:bCs w:val="false"/>
-          <w:i w:val="false"/>
-          <w:iCs w:val="false"/>
-          <w:caps w:val="false"/>
-          <w:color w:val="16151F"/>
-          <w:sz w:val="21"/>
-          <w:szCs w:val="21"/>
-        </w:rPr>
-        <w:t xml:space="preserve">Justice, menolak. Manfaat mengalir ke penerimaan nasional dan pemodal, sedangkan beban terkonsentrasi pada pekerja kawasan, warga hilir sungai, dan masyarakat adat. Kabupaten penghasil justru lebih miskin daripada rata-rata provinsinya, dan hanya 4,35 persen nilai tambah yang tinggal di daerah.</w:t>
+        <w:t xml:space="preserve">Sekarang fakta tadi kita uji satu per satu dengan lima teori modernis.</w:t>
+      </w:r>
+    </w:p>
+    <w:p>
+      <w:pPr>
+        <w:keepNext w:val="false"/>
+        <w:spacing w:after="110" w:before="0" w:line="300"/>
+        <w:jc w:val="both"/>
+      </w:pPr>
+      <w:r>
+        <w:rPr>
+          <w:rFonts w:ascii="Times New Roman" w:cs="Times New Roman" w:eastAsia="Times New Roman" w:hAnsi="Times New Roman"/>
+          <w:b w:val="false"/>
+          <w:bCs w:val="false"/>
+          <w:i w:val="false"/>
+          <w:iCs w:val="false"/>
+          <w:caps w:val="false"/>
+          <w:color w:val="16151F"/>
+          <w:sz w:val="21"/>
+          <w:szCs w:val="21"/>
+        </w:rPr>
+        <w:t xml:space="preserve">Egoism: hasilnya netral. Jangka pendek jelas Indonesia untung. Tapi ingat egois yang cerdas menghitung sampai jauh: biaya berobat warga, biaya membersihkan sungai, biaya menutup pembangkit batu bara, semua itu belum masuk hitungan. Biaya itu tidak hilang, cuma ditunda, dan nanti kita juga yang bayar.</w:t>
+      </w:r>
+    </w:p>
+    <w:p>
+      <w:pPr>
+        <w:keepNext w:val="false"/>
+        <w:spacing w:after="110" w:before="0" w:line="300"/>
+        <w:jc w:val="both"/>
+      </w:pPr>
+      <w:r>
+        <w:rPr>
+          <w:rFonts w:ascii="Times New Roman" w:cs="Times New Roman" w:eastAsia="Times New Roman" w:hAnsi="Times New Roman"/>
+          <w:b w:val="false"/>
+          <w:bCs w:val="false"/>
+          <w:i w:val="false"/>
+          <w:iCs w:val="false"/>
+          <w:caps w:val="false"/>
+          <w:color w:val="16151F"/>
+          <w:sz w:val="21"/>
+          <w:szCs w:val="21"/>
+        </w:rPr>
+        <w:t xml:space="preserve">Utilitarianism: hasilnya terbelah, dan ini bagian paling menarik. Kalau menilai kejadian ini saja, act, jawabannya cenderung setuju: 166 ribu orang dapat kerja itu nyata. Tapi kalau dijadikan aturan umum, rule, jawabannya menolak. Bayangkan semua negara pemilik tambang ikut mengolah pakai batu bara. Tambahan polusinya justru membatalkan alasan nikel ini dibutuhkan, yaitu kendaraan listrik yang bersih. Data sama, dua jawaban. Bedanya cuma satu kejadian atau aturan umum.</w:t>
+      </w:r>
+    </w:p>
+    <w:p>
+      <w:pPr>
+        <w:keepNext w:val="false"/>
+        <w:spacing w:after="110" w:before="0" w:line="300"/>
+        <w:jc w:val="both"/>
+      </w:pPr>
+      <w:r>
+        <w:rPr>
+          <w:rFonts w:ascii="Times New Roman" w:cs="Times New Roman" w:eastAsia="Times New Roman" w:hAnsi="Times New Roman"/>
+          <w:b w:val="false"/>
+          <w:bCs w:val="false"/>
+          <w:i w:val="false"/>
+          <w:iCs w:val="false"/>
+          <w:caps w:val="false"/>
+          <w:color w:val="16151F"/>
+          <w:sz w:val="21"/>
+          <w:szCs w:val="21"/>
+        </w:rPr>
+        <w:t xml:space="preserve">Kant: menolak. Coba tulis aturannya: boleh mempercepat pembangunan sambil menunda standar upah, keselamatan, dan lingkungan. Kalau semua orang boleh menunda dengan alasan kejar target, standar itu tidak ada artinya lagi. Gagal di uji pertama. Uji kedua juga gagal: upah di bawah minimum dan lembur sampai 13 jam artinya pekerja dipakai sebagai alat.</w:t>
+      </w:r>
+    </w:p>
+    <w:p>
+      <w:pPr>
+        <w:keepNext w:val="false"/>
+        <w:spacing w:after="110" w:before="0" w:line="300"/>
+        <w:jc w:val="both"/>
+      </w:pPr>
+      <w:r>
+        <w:rPr>
+          <w:rFonts w:ascii="Times New Roman" w:cs="Times New Roman" w:eastAsia="Times New Roman" w:hAnsi="Times New Roman"/>
+          <w:b w:val="false"/>
+          <w:bCs w:val="false"/>
+          <w:i w:val="false"/>
+          <w:iCs w:val="false"/>
+          <w:caps w:val="false"/>
+          <w:color w:val="16151F"/>
+          <w:sz w:val="21"/>
+          <w:szCs w:val="21"/>
+        </w:rPr>
+        <w:t xml:space="preserve">Hak asasi: bersyarat. Hak atas pekerjaan terpenuhi untuk 166 ribu orang, itu harus diakui. Tapi di saat yang sama hak atas kerja yang layak, kesehatan, air bersih, dan tanah adat dilanggar. Jadi kebijakan ini boleh jalan terus, dengan syarat hak yang dilanggar itu dipulihkan.</w:t>
+      </w:r>
+    </w:p>
+    <w:p>
+      <w:pPr>
+        <w:keepNext w:val="false"/>
+        <w:spacing w:after="110" w:before="0" w:line="300"/>
+        <w:jc w:val="both"/>
+      </w:pPr>
+      <w:r>
+        <w:rPr>
+          <w:rFonts w:ascii="Times New Roman" w:cs="Times New Roman" w:eastAsia="Times New Roman" w:hAnsi="Times New Roman"/>
+          <w:b w:val="false"/>
+          <w:bCs w:val="false"/>
+          <w:i w:val="false"/>
+          <w:iCs w:val="false"/>
+          <w:caps w:val="false"/>
+          <w:color w:val="16151F"/>
+          <w:sz w:val="21"/>
+          <w:szCs w:val="21"/>
+        </w:rPr>
+        <w:t xml:space="preserve">Keadilan: menolak. Enaknya mengalir ke kas negara dan pemodal, sakitnya menumpuk di pekerja, warga pinggir sungai, dan masyarakat adat. Kabupaten penghasilnya malah lebih miskin dari rata-rata provinsinya. Coba pakai uji Rawls: kalau Anda belum tahu akan lahir jadi siapa di Morowali, berani pilih susunan yang sekarang?</w:t>
       </w:r>
     </w:p>
     <w:tbl>
@@ -5749,7 +5681,7 @@
                 <w:sz w:val="20"/>
                 <w:szCs w:val="20"/>
               </w:rPr>
-              <w:t xml:space="preserve">Slide terpanjang. Jaga tempo, satu teori sekitar tiga puluh detik. Tekankan bagian act dan rule.</w:t>
+              <w:t xml:space="preserve">Slide terpanjang, jaga tempo sekitar 30 detik per teori. Bagian act dan rule paling penting.</w:t>
             </w:r>
           </w:p>
         </w:tc>
@@ -5839,91 +5771,91 @@
           <w:sz w:val="21"/>
           <w:szCs w:val="21"/>
         </w:rPr>
-        <w:t xml:space="preserve">Empat teori alternatif menilai rangkaian fakta yang sama, tetapi dari sudut yang berbeda.</w:t>
-      </w:r>
-    </w:p>
-    <w:p>
-      <w:pPr>
-        <w:keepNext w:val="false"/>
-        <w:spacing w:after="110" w:before="0" w:line="300"/>
-        <w:jc w:val="both"/>
-      </w:pPr>
-      <w:r>
-        <w:rPr>
-          <w:rFonts w:ascii="Times New Roman" w:cs="Times New Roman" w:eastAsia="Times New Roman" w:hAnsi="Times New Roman"/>
-          <w:b w:val="false"/>
-          <w:bCs w:val="false"/>
-          <w:i w:val="false"/>
-          <w:iCs w:val="false"/>
-          <w:caps w:val="false"/>
-          <w:color w:val="16151F"/>
-          <w:sz w:val="21"/>
-          <w:szCs w:val="21"/>
-        </w:rPr>
-        <w:t xml:space="preserve">Virtue ethics menolak pembandingnya. Selama ini pembandingnya adalah keadaan sebelum hilirisasi, bukan standar industri terbaik yang tersedia hari ini. Aktor yang berkarakter baik mengukur diri pada standar tertinggi yang dapat dicapai, bukan pada keadaan masa lalunya sendiri.</w:t>
-      </w:r>
-    </w:p>
-    <w:p>
-      <w:pPr>
-        <w:keepNext w:val="false"/>
-        <w:spacing w:after="110" w:before="0" w:line="300"/>
-        <w:jc w:val="both"/>
-      </w:pPr>
-      <w:r>
-        <w:rPr>
-          <w:rFonts w:ascii="Times New Roman" w:cs="Times New Roman" w:eastAsia="Times New Roman" w:hAnsi="Times New Roman"/>
-          <w:b w:val="false"/>
-          <w:bCs w:val="false"/>
-          <w:i w:val="false"/>
-          <w:iCs w:val="false"/>
-          <w:caps w:val="false"/>
-          <w:color w:val="16151F"/>
-          <w:sz w:val="21"/>
-          <w:szCs w:val="21"/>
-        </w:rPr>
-        <w:t xml:space="preserve">Ethic of care menuntut pemulihan. Warga hilir sungai dan sekitar 300 sampai 500 jiwa O Hongana Manyawa adalah pihak yang berelasi, bukan variabel biaya. Perlu digarisbawahi, ethic of care tidak menolak kebijakan ini. Yang dituntut adalah pemulihan sungai dan wilayah lindung, bukan penghentian mendadak. Ini contoh baik bahwa pluralisme tidak berarti semua teori berkata sama.</w:t>
-      </w:r>
-    </w:p>
-    <w:p>
-      <w:pPr>
-        <w:keepNext w:val="false"/>
-        <w:spacing w:after="110" w:before="0" w:line="300"/>
-        <w:jc w:val="both"/>
-      </w:pPr>
-      <w:r>
-        <w:rPr>
-          <w:rFonts w:ascii="Times New Roman" w:cs="Times New Roman" w:eastAsia="Times New Roman" w:hAnsi="Times New Roman"/>
-          <w:b w:val="false"/>
-          <w:bCs w:val="false"/>
-          <w:i w:val="false"/>
-          <w:iCs w:val="false"/>
-          <w:caps w:val="false"/>
-          <w:color w:val="16151F"/>
-          <w:sz w:val="21"/>
-          <w:szCs w:val="21"/>
-        </w:rPr>
-        <w:t xml:space="preserve">Discourse ethics menolak prosedurnya. Warga terdampak bukan pihak dalam perumusan kebijakan maupun perizinan kawasan. Syarat keterlibatan setara tidak terpenuhi, dan cacat prosedur sudah cukup untuk membatalkan keabsahan hasilnya.</w:t>
-      </w:r>
-    </w:p>
-    <w:p>
-      <w:pPr>
-        <w:keepNext w:val="false"/>
-        <w:spacing w:after="110" w:before="0" w:line="300"/>
-        <w:jc w:val="both"/>
-      </w:pPr>
-      <w:r>
-        <w:rPr>
-          <w:rFonts w:ascii="Times New Roman" w:cs="Times New Roman" w:eastAsia="Times New Roman" w:hAnsi="Times New Roman"/>
-          <w:b w:val="false"/>
-          <w:bCs w:val="false"/>
-          <w:i w:val="false"/>
-          <w:iCs w:val="false"/>
-          <w:caps w:val="false"/>
-          <w:color w:val="16151F"/>
-          <w:sz w:val="21"/>
-          <w:szCs w:val="21"/>
-        </w:rPr>
-        <w:t xml:space="preserve">Postmodern ethics membacanya secara relativistik. Hilirisasi berkonotasi kemajuan, ekstraksi berkonotasi pengurasan, padahal keduanya menamai peristiwa yang sama. Dan istilah nikel hijau dipakai bagi pengolahan yang listriknya justru bertumpu pada batu bara.</w:t>
+        <w:t xml:space="preserve">Empat teori alternatif melihat fakta yang sama dari sudut lain.</w:t>
+      </w:r>
+    </w:p>
+    <w:p>
+      <w:pPr>
+        <w:keepNext w:val="false"/>
+        <w:spacing w:after="110" w:before="0" w:line="300"/>
+        <w:jc w:val="both"/>
+      </w:pPr>
+      <w:r>
+        <w:rPr>
+          <w:rFonts w:ascii="Times New Roman" w:cs="Times New Roman" w:eastAsia="Times New Roman" w:hAnsi="Times New Roman"/>
+          <w:b w:val="false"/>
+          <w:bCs w:val="false"/>
+          <w:i w:val="false"/>
+          <w:iCs w:val="false"/>
+          <w:caps w:val="false"/>
+          <w:color w:val="16151F"/>
+          <w:sz w:val="21"/>
+          <w:szCs w:val="21"/>
+        </w:rPr>
+        <w:t xml:space="preserve">Virtue ethics menolak cara membandingkannya. Selama ini pembelaannya selalu: sekarang lebih baik daripada zaman ekspor mentah. Tapi orang yang berkarakter baik tidak membandingkan diri dengan masa lalunya sendiri. Dia membandingkan diri dengan standar terbaik yang ada hari ini. Teknologi bersih dan standar keselamatan yang lebih baik itu ada dan dipakai di tempat lain.</w:t>
+      </w:r>
+    </w:p>
+    <w:p>
+      <w:pPr>
+        <w:keepNext w:val="false"/>
+        <w:spacing w:after="110" w:before="0" w:line="300"/>
+        <w:jc w:val="both"/>
+      </w:pPr>
+      <w:r>
+        <w:rPr>
+          <w:rFonts w:ascii="Times New Roman" w:cs="Times New Roman" w:eastAsia="Times New Roman" w:hAnsi="Times New Roman"/>
+          <w:b w:val="false"/>
+          <w:bCs w:val="false"/>
+          <w:i w:val="false"/>
+          <w:iCs w:val="false"/>
+          <w:caps w:val="false"/>
+          <w:color w:val="16151F"/>
+          <w:sz w:val="21"/>
+          <w:szCs w:val="21"/>
+        </w:rPr>
+        <w:t xml:space="preserve">Ethic of care menuntut pemulihan. Warga pinggir sungai dan sekitar 300 sampai 500 jiwa masyarakat adat itu tetangga kita, bukan angka biaya. Perhatikan: teori ini tidak minta pabriknya ditutup. Yang diminta sungainya dipulihkan dan wilayah adatnya dilindungi. Ini contoh bagus bahwa sembilan teori tidak harus satu suara.</w:t>
+      </w:r>
+    </w:p>
+    <w:p>
+      <w:pPr>
+        <w:keepNext w:val="false"/>
+        <w:spacing w:after="110" w:before="0" w:line="300"/>
+        <w:jc w:val="both"/>
+      </w:pPr>
+      <w:r>
+        <w:rPr>
+          <w:rFonts w:ascii="Times New Roman" w:cs="Times New Roman" w:eastAsia="Times New Roman" w:hAnsi="Times New Roman"/>
+          <w:b w:val="false"/>
+          <w:bCs w:val="false"/>
+          <w:i w:val="false"/>
+          <w:iCs w:val="false"/>
+          <w:caps w:val="false"/>
+          <w:color w:val="16151F"/>
+          <w:sz w:val="21"/>
+          <w:szCs w:val="21"/>
+        </w:rPr>
+        <w:t xml:space="preserve">Discourse ethics menolak prosesnya. Warga terdampak tidak pernah duduk di meja saat kebijakan dan izin dibuat. Bagi teori ini, itu saja sudah cukup untuk membatalkan keabsahan hasilnya.</w:t>
+      </w:r>
+    </w:p>
+    <w:p>
+      <w:pPr>
+        <w:keepNext w:val="false"/>
+        <w:spacing w:after="110" w:before="0" w:line="300"/>
+        <w:jc w:val="both"/>
+      </w:pPr>
+      <w:r>
+        <w:rPr>
+          <w:rFonts w:ascii="Times New Roman" w:cs="Times New Roman" w:eastAsia="Times New Roman" w:hAnsi="Times New Roman"/>
+          <w:b w:val="false"/>
+          <w:bCs w:val="false"/>
+          <w:i w:val="false"/>
+          <w:iCs w:val="false"/>
+          <w:caps w:val="false"/>
+          <w:color w:val="16151F"/>
+          <w:sz w:val="21"/>
+          <w:szCs w:val="21"/>
+        </w:rPr>
+        <w:t xml:space="preserve">Postmodern ethics membongkar bahasanya. Hilirisasi terdengar maju, ekstraksi terdengar menguras, padahal barangnya sama. Dan yang paling tajam: nikel ini dijual dengan label hijau, padahal listrik pengolahnya dari batu bara.</w:t>
       </w:r>
     </w:p>
     <w:tbl>
@@ -6000,7 +5932,7 @@
                 <w:sz w:val="20"/>
                 <w:szCs w:val="20"/>
               </w:rPr>
-              <w:t xml:space="preserve">Kalimat ethic of care tidak menolak kebijakan sering menarik pertanyaan. Siapkan penjelasannya.</w:t>
+              <w:t xml:space="preserve">Kalimat teori ini tidak minta pabrik ditutup sering memancing pertanyaan. Siapkan jawabannya.</w:t>
             </w:r>
           </w:p>
         </w:tc>
@@ -6090,133 +6022,133 @@
           <w:sz w:val="21"/>
           <w:szCs w:val="21"/>
         </w:rPr>
-        <w:t xml:space="preserve">Bila kesembilan penilaian tadi dikumpulkan, hasilnya enam menolak, satu bersyarat, satu ambivalen, dan satu netral karena teorinya sendiri mengakui keterbatasannya. Tidak satu pun memberikan dukungan tanpa syarat.</w:t>
-      </w:r>
-    </w:p>
-    <w:p>
-      <w:pPr>
-        <w:keepNext w:val="false"/>
-        <w:spacing w:after="110" w:before="0" w:line="300"/>
-        <w:jc w:val="both"/>
-      </w:pPr>
-      <w:r>
-        <w:rPr>
-          <w:rFonts w:ascii="Times New Roman" w:cs="Times New Roman" w:eastAsia="Times New Roman" w:hAnsi="Times New Roman"/>
-          <w:b w:val="false"/>
-          <w:bCs w:val="false"/>
-          <w:i w:val="false"/>
-          <w:iCs w:val="false"/>
-          <w:caps w:val="false"/>
-          <w:color w:val="16151F"/>
-          <w:sz w:val="21"/>
-          <w:szCs w:val="21"/>
-        </w:rPr>
-        <w:t xml:space="preserve">Dari kesembilan penilaian itu kami menarik empat proposisi.</w:t>
-      </w:r>
-    </w:p>
-    <w:p>
-      <w:pPr>
-        <w:keepNext w:val="false"/>
-        <w:spacing w:after="110" w:before="0" w:line="300"/>
-        <w:jc w:val="both"/>
-      </w:pPr>
-      <w:r>
-        <w:rPr>
-          <w:rFonts w:ascii="Times New Roman" w:cs="Times New Roman" w:eastAsia="Times New Roman" w:hAnsi="Times New Roman"/>
-          <w:b w:val="false"/>
-          <w:bCs w:val="false"/>
-          <w:i w:val="false"/>
-          <w:iCs w:val="false"/>
-          <w:caps w:val="false"/>
-          <w:color w:val="16151F"/>
-          <w:sz w:val="21"/>
-          <w:szCs w:val="21"/>
-        </w:rPr>
-        <w:t xml:space="preserve">Pertama, perbandingan dengan masa lalu tidak bernilai normatif. Kondisi yang lebih baik daripada ekspor bijih mentah tidak dengan sendirinya memadai.</w:t>
-      </w:r>
-    </w:p>
-    <w:p>
-      <w:pPr>
-        <w:keepNext w:val="false"/>
-        <w:spacing w:after="110" w:before="0" w:line="300"/>
-        <w:jc w:val="both"/>
-      </w:pPr>
-      <w:r>
-        <w:rPr>
-          <w:rFonts w:ascii="Times New Roman" w:cs="Times New Roman" w:eastAsia="Times New Roman" w:hAnsi="Times New Roman"/>
-          <w:b w:val="false"/>
-          <w:bCs w:val="false"/>
-          <w:i w:val="false"/>
-          <w:iCs w:val="false"/>
-          <w:caps w:val="false"/>
-          <w:color w:val="16151F"/>
-          <w:sz w:val="21"/>
-          <w:szCs w:val="21"/>
-        </w:rPr>
-        <w:t xml:space="preserve">Kedua, klaim hijau gugur pada sumber energinya. Pengolahan yang bertumpu pada pembangkit batu bara di dalam kawasan tidak dapat disebut hijau.</w:t>
-      </w:r>
-    </w:p>
-    <w:p>
-      <w:pPr>
-        <w:keepNext w:val="false"/>
-        <w:spacing w:after="110" w:before="0" w:line="300"/>
-        <w:jc w:val="both"/>
-      </w:pPr>
-      <w:r>
-        <w:rPr>
-          <w:rFonts w:ascii="Times New Roman" w:cs="Times New Roman" w:eastAsia="Times New Roman" w:hAnsi="Times New Roman"/>
-          <w:b w:val="false"/>
-          <w:bCs w:val="false"/>
-          <w:i w:val="false"/>
-          <w:iCs w:val="false"/>
-          <w:caps w:val="false"/>
-          <w:color w:val="16151F"/>
-          <w:sz w:val="21"/>
-          <w:szCs w:val="21"/>
-        </w:rPr>
-        <w:t xml:space="preserve">Ketiga, distribusi manfaat dan bebannya timpang. Hanya 4,35 persen nilai tambah tinggal di daerah, sementara kabupaten penghasil lebih miskin daripada rata-rata provinsinya.</w:t>
-      </w:r>
-    </w:p>
-    <w:p>
-      <w:pPr>
-        <w:keepNext w:val="false"/>
-        <w:spacing w:after="110" w:before="0" w:line="300"/>
-        <w:jc w:val="both"/>
-      </w:pPr>
-      <w:r>
-        <w:rPr>
-          <w:rFonts w:ascii="Times New Roman" w:cs="Times New Roman" w:eastAsia="Times New Roman" w:hAnsi="Times New Roman"/>
-          <w:b w:val="false"/>
-          <w:bCs w:val="false"/>
-          <w:i w:val="false"/>
-          <w:iCs w:val="false"/>
-          <w:caps w:val="false"/>
-          <w:color w:val="16151F"/>
-          <w:sz w:val="21"/>
-          <w:szCs w:val="21"/>
-        </w:rPr>
-        <w:t xml:space="preserve">Keempat, prosesnya cacat sejak perumusan. Warga terdampak tidak menjadi pihak dalam perizinan dan perencanaan kawasan.</w:t>
-      </w:r>
-    </w:p>
-    <w:p>
-      <w:pPr>
-        <w:keepNext w:val="false"/>
-        <w:spacing w:after="110" w:before="0" w:line="300"/>
-        <w:jc w:val="both"/>
-      </w:pPr>
-      <w:r>
-        <w:rPr>
-          <w:rFonts w:ascii="Times New Roman" w:cs="Times New Roman" w:eastAsia="Times New Roman" w:hAnsi="Times New Roman"/>
-          <w:b w:val="false"/>
-          <w:bCs w:val="false"/>
-          <w:i w:val="false"/>
-          <w:iCs w:val="false"/>
-          <w:caps w:val="false"/>
-          <w:color w:val="16151F"/>
-          <w:sz w:val="21"/>
-          <w:szCs w:val="21"/>
-        </w:rPr>
-        <w:t xml:space="preserve">Satu hal yang perlu ditegaskan. Penolakan atas klaim nikel hijau tidak setara dengan penolakan atas hilirisasi. Keduanya persoalan yang terpisah.</w:t>
+        <w:t xml:space="preserve">Kalau sembilan penilaian tadi kita kumpulkan: enam menolak, satu setuju dengan syarat, satu terbelah, dan satu netral. Tidak ada satu pun yang setuju tanpa syarat.</w:t>
+      </w:r>
+    </w:p>
+    <w:p>
+      <w:pPr>
+        <w:keepNext w:val="false"/>
+        <w:spacing w:after="110" w:before="0" w:line="300"/>
+        <w:jc w:val="both"/>
+      </w:pPr>
+      <w:r>
+        <w:rPr>
+          <w:rFonts w:ascii="Times New Roman" w:cs="Times New Roman" w:eastAsia="Times New Roman" w:hAnsi="Times New Roman"/>
+          <w:b w:val="false"/>
+          <w:bCs w:val="false"/>
+          <w:i w:val="false"/>
+          <w:iCs w:val="false"/>
+          <w:caps w:val="false"/>
+          <w:color w:val="16151F"/>
+          <w:sz w:val="21"/>
+          <w:szCs w:val="21"/>
+        </w:rPr>
+        <w:t xml:space="preserve">Dari situ kami tarik empat kesimpulan antara.</w:t>
+      </w:r>
+    </w:p>
+    <w:p>
+      <w:pPr>
+        <w:keepNext w:val="false"/>
+        <w:spacing w:after="110" w:before="0" w:line="300"/>
+        <w:jc w:val="both"/>
+      </w:pPr>
+      <w:r>
+        <w:rPr>
+          <w:rFonts w:ascii="Times New Roman" w:cs="Times New Roman" w:eastAsia="Times New Roman" w:hAnsi="Times New Roman"/>
+          <w:b w:val="false"/>
+          <w:bCs w:val="false"/>
+          <w:i w:val="false"/>
+          <w:iCs w:val="false"/>
+          <w:caps w:val="false"/>
+          <w:color w:val="16151F"/>
+          <w:sz w:val="21"/>
+          <w:szCs w:val="21"/>
+        </w:rPr>
+        <w:t xml:space="preserve">Pertama, lebih baik dari dulu itu bukan ukuran. Ukurannya standar terbaik hari ini.</w:t>
+      </w:r>
+    </w:p>
+    <w:p>
+      <w:pPr>
+        <w:keepNext w:val="false"/>
+        <w:spacing w:after="110" w:before="0" w:line="300"/>
+        <w:jc w:val="both"/>
+      </w:pPr>
+      <w:r>
+        <w:rPr>
+          <w:rFonts w:ascii="Times New Roman" w:cs="Times New Roman" w:eastAsia="Times New Roman" w:hAnsi="Times New Roman"/>
+          <w:b w:val="false"/>
+          <w:bCs w:val="false"/>
+          <w:i w:val="false"/>
+          <w:iCs w:val="false"/>
+          <w:caps w:val="false"/>
+          <w:color w:val="16151F"/>
+          <w:sz w:val="21"/>
+          <w:szCs w:val="21"/>
+        </w:rPr>
+        <w:t xml:space="preserve">Kedua, label hijau gugur di sumber listriknya. Pengolahan bertenaga batu bara tidak bisa disebut hijau.</w:t>
+      </w:r>
+    </w:p>
+    <w:p>
+      <w:pPr>
+        <w:keepNext w:val="false"/>
+        <w:spacing w:after="110" w:before="0" w:line="300"/>
+        <w:jc w:val="both"/>
+      </w:pPr>
+      <w:r>
+        <w:rPr>
+          <w:rFonts w:ascii="Times New Roman" w:cs="Times New Roman" w:eastAsia="Times New Roman" w:hAnsi="Times New Roman"/>
+          <w:b w:val="false"/>
+          <w:bCs w:val="false"/>
+          <w:i w:val="false"/>
+          <w:iCs w:val="false"/>
+          <w:caps w:val="false"/>
+          <w:color w:val="16151F"/>
+          <w:sz w:val="21"/>
+          <w:szCs w:val="21"/>
+        </w:rPr>
+        <w:t xml:space="preserve">Ketiga, pembagiannya timpang. Nilai tambah yang tinggal di daerah cuma 4,35 persen, dan daerah penghasilnya justru lebih miskin.</w:t>
+      </w:r>
+    </w:p>
+    <w:p>
+      <w:pPr>
+        <w:keepNext w:val="false"/>
+        <w:spacing w:after="110" w:before="0" w:line="300"/>
+        <w:jc w:val="both"/>
+      </w:pPr>
+      <w:r>
+        <w:rPr>
+          <w:rFonts w:ascii="Times New Roman" w:cs="Times New Roman" w:eastAsia="Times New Roman" w:hAnsi="Times New Roman"/>
+          <w:b w:val="false"/>
+          <w:bCs w:val="false"/>
+          <w:i w:val="false"/>
+          <w:iCs w:val="false"/>
+          <w:caps w:val="false"/>
+          <w:color w:val="16151F"/>
+          <w:sz w:val="21"/>
+          <w:szCs w:val="21"/>
+        </w:rPr>
+        <w:t xml:space="preserve">Keempat, prosesnya cacat dari awal, karena warga terdampak tidak pernah dilibatkan.</w:t>
+      </w:r>
+    </w:p>
+    <w:p>
+      <w:pPr>
+        <w:keepNext w:val="false"/>
+        <w:spacing w:after="110" w:before="0" w:line="300"/>
+        <w:jc w:val="both"/>
+      </w:pPr>
+      <w:r>
+        <w:rPr>
+          <w:rFonts w:ascii="Times New Roman" w:cs="Times New Roman" w:eastAsia="Times New Roman" w:hAnsi="Times New Roman"/>
+          <w:b w:val="false"/>
+          <w:bCs w:val="false"/>
+          <w:i w:val="false"/>
+          <w:iCs w:val="false"/>
+          <w:caps w:val="false"/>
+          <w:color w:val="16151F"/>
+          <w:sz w:val="21"/>
+          <w:szCs w:val="21"/>
+        </w:rPr>
+        <w:t xml:space="preserve">Satu hal yang perlu digarisbawahi supaya tidak salah tangkap: yang kami tolak itu klaim bahwa kebijakan ini sudah etis. Kebijakan hilirisasinya sendiri tidak kami minta dihentikan. Dua hal itu berbeda.</w:t>
       </w:r>
     </w:p>
     <w:tbl>
@@ -6383,112 +6315,112 @@
           <w:sz w:val="21"/>
           <w:szCs w:val="21"/>
         </w:rPr>
-        <w:t xml:space="preserve">Ada tiga temuan dari pengujian ini.</w:t>
-      </w:r>
-    </w:p>
-    <w:p>
-      <w:pPr>
-        <w:keepNext w:val="false"/>
-        <w:spacing w:after="110" w:before="0" w:line="300"/>
-        <w:jc w:val="both"/>
-      </w:pPr>
-      <w:r>
-        <w:rPr>
-          <w:rFonts w:ascii="Times New Roman" w:cs="Times New Roman" w:eastAsia="Times New Roman" w:hAnsi="Times New Roman"/>
-          <w:b w:val="false"/>
-          <w:bCs w:val="false"/>
-          <w:i w:val="false"/>
-          <w:iCs w:val="false"/>
-          <w:caps w:val="false"/>
-          <w:color w:val="16151F"/>
-          <w:sz w:val="21"/>
-          <w:szCs w:val="21"/>
-        </w:rPr>
-        <w:t xml:space="preserve">Satu, konvergensi, bukan kesepakatan. Sembilan teori berangkat dari premis yang berbeda, namun mayoritasnya bermuara pada arah yang sama. Inilah bukti terkuat bagi pluralisme yang diajukan Crane dan Matten.</w:t>
-      </w:r>
-    </w:p>
-    <w:p>
-      <w:pPr>
-        <w:keepNext w:val="false"/>
-        <w:spacing w:after="110" w:before="0" w:line="300"/>
-        <w:jc w:val="both"/>
-      </w:pPr>
-      <w:r>
-        <w:rPr>
-          <w:rFonts w:ascii="Times New Roman" w:cs="Times New Roman" w:eastAsia="Times New Roman" w:hAnsi="Times New Roman"/>
-          <w:b w:val="false"/>
-          <w:bCs w:val="false"/>
-          <w:i w:val="false"/>
-          <w:iCs w:val="false"/>
-          <w:caps w:val="false"/>
-          <w:color w:val="16151F"/>
-          <w:sz w:val="21"/>
-          <w:szCs w:val="21"/>
-        </w:rPr>
-        <w:t xml:space="preserve">Dua, yang gugur adalah klaim etisnya, bukan kebijakannya. Upah, keselamatan, lingkungan, dan sumber energinya seluruhnya tetap terbuka untuk diperbaiki.</w:t>
-      </w:r>
-    </w:p>
-    <w:p>
-      <w:pPr>
-        <w:keepNext w:val="false"/>
-        <w:spacing w:after="110" w:before="0" w:line="300"/>
-        <w:jc w:val="both"/>
-      </w:pPr>
-      <w:r>
-        <w:rPr>
-          <w:rFonts w:ascii="Times New Roman" w:cs="Times New Roman" w:eastAsia="Times New Roman" w:hAnsi="Times New Roman"/>
-          <w:b w:val="false"/>
-          <w:bCs w:val="false"/>
-          <w:i w:val="false"/>
-          <w:iCs w:val="false"/>
-          <w:caps w:val="false"/>
-          <w:color w:val="16151F"/>
-          <w:sz w:val="21"/>
-          <w:szCs w:val="21"/>
-        </w:rPr>
-        <w:t xml:space="preserve">Tiga, kasusnya masih berlangsung. Kebijakannya masih berjalan, sengketa dagangnya belum tuntas, dan angkanya berubah tiap tahun.</w:t>
-      </w:r>
-    </w:p>
-    <w:p>
-      <w:pPr>
-        <w:keepNext w:val="false"/>
-        <w:spacing w:after="110" w:before="0" w:line="300"/>
-        <w:jc w:val="both"/>
-      </w:pPr>
-      <w:r>
-        <w:rPr>
-          <w:rFonts w:ascii="Times New Roman" w:cs="Times New Roman" w:eastAsia="Times New Roman" w:hAnsi="Times New Roman"/>
-          <w:b w:val="false"/>
-          <w:bCs w:val="false"/>
-          <w:i w:val="false"/>
-          <w:iCs w:val="false"/>
-          <w:caps w:val="false"/>
-          <w:color w:val="16151F"/>
-          <w:sz w:val="21"/>
-          <w:szCs w:val="21"/>
-        </w:rPr>
-        <w:t xml:space="preserve">Implikasi manajerialnya ada tiga. Pertama, internalisasi biaya tertunda. Biaya kesehatan warga, pemulihan sungai, dan pensiun dini pembangkit masuk neraca sejak tahap perencanaan. Kedua, pelibatan pihak yang absen. Pekerja, warga hilir, dan masyarakat adat diberi keterwakilan formal dalam panitia keselamatan dan perizinan. Ketiga, pengujian multiteori. Klaim yang lolos utilitarianism kerap gugur pada keadilan distributif dan discourse ethics.</w:t>
-      </w:r>
-    </w:p>
-    <w:p>
-      <w:pPr>
-        <w:keepNext w:val="false"/>
-        <w:spacing w:after="110" w:before="0" w:line="300"/>
-        <w:jc w:val="both"/>
-      </w:pPr>
-      <w:r>
-        <w:rPr>
-          <w:rFonts w:ascii="Times New Roman" w:cs="Times New Roman" w:eastAsia="Times New Roman" w:hAnsi="Times New Roman"/>
-          <w:b w:val="false"/>
-          <w:bCs w:val="false"/>
-          <w:i w:val="false"/>
-          <w:iCs w:val="false"/>
-          <w:caps w:val="false"/>
-          <w:color w:val="16151F"/>
-          <w:sz w:val="21"/>
-          <w:szCs w:val="21"/>
-        </w:rPr>
-        <w:t xml:space="preserve">Kami tutup dengan satu kalimat. Manfaat yang terukur selalu lebih mudah dipertahankan daripada beban yang tersebar. Justru karena itu, beban yang tersebar perlu dihitung lebih dahulu.</w:t>
+        <w:t xml:space="preserve">Kami tutup dengan tiga temuan dan tiga saran.</w:t>
+      </w:r>
+    </w:p>
+    <w:p>
+      <w:pPr>
+        <w:keepNext w:val="false"/>
+        <w:spacing w:after="110" w:before="0" w:line="300"/>
+        <w:jc w:val="both"/>
+      </w:pPr>
+      <w:r>
+        <w:rPr>
+          <w:rFonts w:ascii="Times New Roman" w:cs="Times New Roman" w:eastAsia="Times New Roman" w:hAnsi="Times New Roman"/>
+          <w:b w:val="false"/>
+          <w:bCs w:val="false"/>
+          <w:i w:val="false"/>
+          <w:iCs w:val="false"/>
+          <w:caps w:val="false"/>
+          <w:color w:val="16151F"/>
+          <w:sz w:val="21"/>
+          <w:szCs w:val="21"/>
+        </w:rPr>
+        <w:t xml:space="preserve">Temuan satu: sembilan teori yang asumsinya berbeda-beda ternyata mengarah ke kesimpulan yang sama. Justru itu bukti terkuat. Kalau sembilan kacamata yang berbeda melihat masalah yang sama, masalahnya nyata.</w:t>
+      </w:r>
+    </w:p>
+    <w:p>
+      <w:pPr>
+        <w:keepNext w:val="false"/>
+        <w:spacing w:after="110" w:before="0" w:line="300"/>
+        <w:jc w:val="both"/>
+      </w:pPr>
+      <w:r>
+        <w:rPr>
+          <w:rFonts w:ascii="Times New Roman" w:cs="Times New Roman" w:eastAsia="Times New Roman" w:hAnsi="Times New Roman"/>
+          <w:b w:val="false"/>
+          <w:bCs w:val="false"/>
+          <w:i w:val="false"/>
+          <w:iCs w:val="false"/>
+          <w:caps w:val="false"/>
+          <w:color w:val="16151F"/>
+          <w:sz w:val="21"/>
+          <w:szCs w:val="21"/>
+        </w:rPr>
+        <w:t xml:space="preserve">Temuan dua: yang gugur klaim etisnya, bukan kebijakannya. Upah, keselamatan, lingkungan, dan sumber listriknya semua masih bisa diperbaiki.</w:t>
+      </w:r>
+    </w:p>
+    <w:p>
+      <w:pPr>
+        <w:keepNext w:val="false"/>
+        <w:spacing w:after="110" w:before="0" w:line="300"/>
+        <w:jc w:val="both"/>
+      </w:pPr>
+      <w:r>
+        <w:rPr>
+          <w:rFonts w:ascii="Times New Roman" w:cs="Times New Roman" w:eastAsia="Times New Roman" w:hAnsi="Times New Roman"/>
+          <w:b w:val="false"/>
+          <w:bCs w:val="false"/>
+          <w:i w:val="false"/>
+          <w:iCs w:val="false"/>
+          <w:caps w:val="false"/>
+          <w:color w:val="16151F"/>
+          <w:sz w:val="21"/>
+          <w:szCs w:val="21"/>
+        </w:rPr>
+        <w:t xml:space="preserve">Temuan tiga: kasus ini belum selesai, angkanya masih bergerak. Justru karena belum selesai, diskusi kita hari ini masih bisa berarti.</w:t>
+      </w:r>
+    </w:p>
+    <w:p>
+      <w:pPr>
+        <w:keepNext w:val="false"/>
+        <w:spacing w:after="110" w:before="0" w:line="300"/>
+        <w:jc w:val="both"/>
+      </w:pPr>
+      <w:r>
+        <w:rPr>
+          <w:rFonts w:ascii="Times New Roman" w:cs="Times New Roman" w:eastAsia="Times New Roman" w:hAnsi="Times New Roman"/>
+          <w:b w:val="false"/>
+          <w:bCs w:val="false"/>
+          <w:i w:val="false"/>
+          <w:iCs w:val="false"/>
+          <w:caps w:val="false"/>
+          <w:color w:val="16151F"/>
+          <w:sz w:val="21"/>
+          <w:szCs w:val="21"/>
+        </w:rPr>
+        <w:t xml:space="preserve">Lalu apa yang bisa dilakukan manajemen? Tiga hal. Satu, masukkan biaya yang tertunda itu ke perencanaan sejak awal: biaya kesehatan warga, pemulihan sungai, dan penutupan pembangkit. Dua, beri kursi untuk pihak yang selama ini absen: pekerja, warga, dan masyarakat adat, di panitia keselamatan dan proses perizinan. Tiga, uji setiap klaim dengan lebih dari satu teori, karena klaim yang lolos hitung-hitungan manfaat sering gugur di keadilan dan proses.</w:t>
+      </w:r>
+    </w:p>
+    <w:p>
+      <w:pPr>
+        <w:keepNext w:val="false"/>
+        <w:spacing w:after="110" w:before="0" w:line="300"/>
+        <w:jc w:val="both"/>
+      </w:pPr>
+      <w:r>
+        <w:rPr>
+          <w:rFonts w:ascii="Times New Roman" w:cs="Times New Roman" w:eastAsia="Times New Roman" w:hAnsi="Times New Roman"/>
+          <w:b w:val="false"/>
+          <w:bCs w:val="false"/>
+          <w:i w:val="false"/>
+          <w:iCs w:val="false"/>
+          <w:caps w:val="false"/>
+          <w:color w:val="16151F"/>
+          <w:sz w:val="21"/>
+          <w:szCs w:val="21"/>
+        </w:rPr>
+        <w:t xml:space="preserve">Kalimat penutup dari kami: manfaat yang gampang dihitung selalu lebih mudah dibela daripada beban yang menyebar. Justru karena itu, beban yang menyebar harus dihitung lebih dulu.</w:t>
       </w:r>
     </w:p>
     <w:tbl>
@@ -6565,7 +6497,7 @@
                 <w:sz w:val="20"/>
                 <w:szCs w:val="20"/>
               </w:rPr>
-              <w:t xml:space="preserve">Kalimat penutup diucapkan pelan dan berhenti sejenak sebelum pindah ke slide terakhir.</w:t>
+              <w:t xml:space="preserve">Kalimat penutup diucapkan pelan, jeda sebentar, baru pindah slide.</w:t>
             </w:r>
           </w:p>
         </w:tc>
@@ -6655,7 +6587,7 @@
           <w:sz w:val="21"/>
           <w:szCs w:val="21"/>
         </w:rPr>
-        <w:t xml:space="preserve">Terima kasih atas perhatian Bapak Ibu dan teman-teman. Kami buka untuk pertanyaan dan diskusi.</w:t>
+        <w:t xml:space="preserve">Terima kasih Bapak Ibu dan teman-teman. Silakan kalau ada pertanyaan, kami buka diskusi.</w:t>
       </w:r>
     </w:p>
     <w:tbl>
@@ -6732,7 +6664,7 @@
                 <w:sz w:val="20"/>
                 <w:szCs w:val="20"/>
               </w:rPr>
-              <w:t xml:space="preserve">Ketiga anggota berdiri menghadap kelas selama sesi tanya jawab.</w:t>
+              <w:t xml:space="preserve">Ketiga anggota berdiri menghadap kelas selama tanya jawab.</w:t>
             </w:r>
           </w:p>
         </w:tc>
@@ -6785,7 +6717,7 @@
           <w:sz w:val="22"/>
           <w:szCs w:val="22"/>
         </w:rPr>
-        <w:t xml:space="preserve">Delapan pertanyaan berikut paling mungkin muncul, disusun dari yang paling sering ditanyakan pada kasus kebijakan industri. Jawabannya ditulis ringkas supaya dapat disampaikan dalam waktu kurang dari satu menit.</w:t>
+        <w:t xml:space="preserve">Delapan pertanyaan berikut yang paling mungkin muncul. Jawabannya ditulis ringkas supaya bisa disampaikan dalam waktu kurang dari satu menit.</w:t>
       </w:r>
     </w:p>
     <w:p>
@@ -6803,7 +6735,7 @@
           <w:sz w:val="21"/>
           <w:szCs w:val="21"/>
         </w:rPr>
-        <w:t xml:space="preserve">1.  Kalau enam dari sembilan teori menolak, apakah kesimpulan kelompok adalah hilirisasi harus dihentikan?</w:t>
+        <w:t xml:space="preserve">1.  Kalau enam dari sembilan teori menolak, berarti hilirisasi harus dihentikan?</w:t>
       </w:r>
     </w:p>
     <w:p>
@@ -6824,7 +6756,7 @@
           <w:sz w:val="21"/>
           <w:szCs w:val="21"/>
         </w:rPr>
-        <w:t xml:space="preserve">Tidak. Yang gugur adalah klaim bahwa kebijakan ini sudah etis, bukan kebijakan hilirisasinya. Perhatikan bahwa bentuk penolakan setiap teori berbeda. Ethics of duty menolak maksimnya, justice menolak distribusinya, discourse ethics menolak prosedurnya, dan ethic of care justru meminta pemulihan, bukan penghentian. Empat objek penolakan itu semuanya dapat diperbaiki tanpa membatalkan kebijakan.</w:t>
+        <w:t xml:space="preserve">Tidak. Yang gugur itu klaim bahwa kebijakan ini sudah etis, bukan kebijakannya. Lihat saja bentuk penolakannya: Kant menolak aturannya, keadilan menolak pembagiannya, discourse menolak prosesnya, dan ethic of care malah minta pemulihan, bukan penghentian. Semua yang ditolak itu bisa diperbaiki tanpa menghentikan kebijakan.</w:t>
       </w:r>
     </w:p>
     <w:p>
@@ -6842,7 +6774,7 @@
           <w:sz w:val="21"/>
           <w:szCs w:val="21"/>
         </w:rPr>
-        <w:t xml:space="preserve">2.  Bukankah semua industri baru memang seperti itu pada tahap awal?</w:t>
+        <w:t xml:space="preserve">2.  Bukankah semua industri baru memang begitu di awal?</w:t>
       </w:r>
     </w:p>
     <w:p>
@@ -6863,7 +6795,7 @@
           <w:sz w:val="21"/>
           <w:szCs w:val="21"/>
         </w:rPr>
-        <w:t xml:space="preserve">Argumen itu memakai masa lalu sebagai pembanding. Virtue ethics justru mempersoalkan pilihan pembanding tersebut. Pertanyaannya bukan apakah keadaan hari ini lebih baik daripada ekspor bijih mentah, melainkan apakah sudah setara dengan standar industri terbaik yang tersedia hari ini. Teknologi tungku, sistem keselamatan, dan pasokan listrik rendah karbon sudah ada dan dipakai di tempat lain.</w:t>
+        <w:t xml:space="preserve">Argumen itu membandingkan dengan masa lalu. Virtue ethics justru mempersoalkan pembandingnya. Pertanyaannya bukan apakah sekarang lebih baik dari zaman ekspor mentah, tapi apakah sudah setara dengan standar terbaik yang ada hari ini. Teknologi tungku yang lebih bersih dan sistem keselamatan yang lebih baik itu sudah ada dan dipakai di tempat lain.</w:t>
       </w:r>
     </w:p>
     <w:p>
@@ -6881,7 +6813,7 @@
           <w:sz w:val="21"/>
           <w:szCs w:val="21"/>
         </w:rPr>
-        <w:t xml:space="preserve">3.  Panel WTO sudah memutus kebijakan ini melanggar. Apakah itu berarti tidak etis?</w:t>
+        <w:t xml:space="preserve">3.  WTO sudah memutus kebijakan ini melanggar. Berarti tidak etis dong?</w:t>
       </w:r>
     </w:p>
     <w:p>
@@ -6902,7 +6834,7 @@
           <w:sz w:val="21"/>
           <w:szCs w:val="21"/>
         </w:rPr>
-        <w:t xml:space="preserve">Tidak otomatis. Legalitas dan etika dua penilaian yang berbeda, dan Bab 3 justru dibuka dengan pembedaan itu. Putusan WTO menilai kepatuhan pada aturan perdagangan, sedangkan penilaian kami menyangkut distribusi manfaat, kondisi kerja, dan keterwakilan pihak terdampak. Sebuah kebijakan bisa saja sah secara hukum dagang namun tetap bermasalah secara etis, dan sebaliknya.</w:t>
+        <w:t xml:space="preserve">Tidak otomatis. Sah menurut hukum dan benar secara etika itu dua penilaian yang berbeda. WTO menilai aturan dagang. Kami menilai pembagian manfaat, kondisi kerja, dan siapa yang diajak bicara. Sebuah kebijakan bisa kalah di pengadilan dagang tapi etis, bisa juga menang tapi bermasalah secara etika.</w:t>
       </w:r>
     </w:p>
     <w:p>
@@ -6920,7 +6852,7 @@
           <w:sz w:val="21"/>
           <w:szCs w:val="21"/>
         </w:rPr>
-        <w:t xml:space="preserve">4.  Bukankah menuntut standar Eropa pada Indonesia itu justru imperialisme kultural?</w:t>
+        <w:t xml:space="preserve">4.  Menuntut standar Eropa ke Indonesia itu bukannya imperialisme budaya?</w:t>
       </w:r>
     </w:p>
     <w:p>
@@ -6941,7 +6873,7 @@
           <w:sz w:val="21"/>
           <w:szCs w:val="21"/>
         </w:rPr>
-        <w:t xml:space="preserve">Keberatan itu memang tercatat sebagai keterbatasan nomor enam dalam bab ini. Karena itu argumen kami tidak bersandar pada standar Eropa, melainkan pada standar yang sudah diakui Indonesia sendiri, yaitu upah minimum Morowali, peraturan keselamatan kerja nasional, dan komitmen iklim Indonesia. Sen (2000) juga menunjukkan bahwa nilai seperti keselamatan dan suara warga tidak eksklusif milik satu tradisi budaya.</w:t>
+        <w:t xml:space="preserve">Keberatan itu memang tercatat sebagai kelemahan nomor enam, dan karena itu kami sengaja tidak memakai standar Eropa. Semua ukuran yang kami pakai adalah standar Indonesia sendiri: upah minimum Morowali, aturan keselamatan kerja nasional, dan komitmen iklim Indonesia. Lagi pula keselamatan kerja dan hak untuk didengar itu bukan monopoli budaya mana pun.</w:t>
       </w:r>
     </w:p>
     <w:p>
@@ -6959,7 +6891,7 @@
           <w:sz w:val="21"/>
           <w:szCs w:val="21"/>
         </w:rPr>
-        <w:t xml:space="preserve">5.  Angka 166 ribu lapangan kerja itu besar. Apakah utilitarianism tidak cukup untuk membenarkan?</w:t>
+        <w:t xml:space="preserve">5.  166 ribu lapangan kerja itu besar sekali. Apa tidak cukup jadi pembenaran?</w:t>
       </w:r>
     </w:p>
     <w:p>
@@ -6980,7 +6912,7 @@
           <w:sz w:val="21"/>
           <w:szCs w:val="21"/>
         </w:rPr>
-        <w:t xml:space="preserve">Act utilitarianism memang cenderung membenarkan. Persoalannya ada dua. Pertama, rule utilitarianism menghasilkan kesimpulan sebaliknya bila kebijakan ini diperlakukan sebagai kelas tindakan yang ditiru semua negara pemilik cadangan. Kedua, keberatan klasik terhadap utilitarianism adalah distribusi. Angka agregat yang positif dapat menyembunyikan kerugian berat pada kelompok kecil, dan di sini kelompok kecil itu adalah pekerja kawasan serta masyarakat adat.</w:t>
+        <w:t xml:space="preserve">Itu argumen utilitarian, dan memang kuat untuk versi act. Masalahnya dua. Pertama, versi rule menjawab sebaliknya: kalau semua negara meniru cara ini, polusinya membatalkan tujuan nikel itu sendiri. Kedua, angka total bisa menyembunyikan siapa yang menanggung sakitnya. Yang menikmati banyak orang, yang menanggung segelintir, dan segelintir itu pekerja kawasan dan masyarakat adat.</w:t>
       </w:r>
     </w:p>
     <w:p>
@@ -6998,7 +6930,7 @@
           <w:sz w:val="21"/>
           <w:szCs w:val="21"/>
         </w:rPr>
-        <w:t xml:space="preserve">6.  Apa yang paling realistis dilakukan manajemen dalam waktu dekat?</w:t>
+        <w:t xml:space="preserve">6.  Kalau jadi manajemen, langkah paling realistis dalam waktu dekat apa?</w:t>
       </w:r>
     </w:p>
     <w:p>
@@ -7019,7 +6951,7 @@
           <w:sz w:val="21"/>
           <w:szCs w:val="21"/>
         </w:rPr>
-        <w:t xml:space="preserve">Tiga hal pada slide 20. Memasukkan biaya kesehatan, pemulihan sungai, dan pensiun dini pembangkit ke dalam neraca sejak perencanaan. Memberi keterwakilan formal kepada pekerja, warga hilir, dan masyarakat adat dalam panitia keselamatan dan proses perizinan. Serta menguji setiap klaim keberlanjutan dengan lebih dari satu teori, karena klaim yang lolos utilitarianism kerap gugur pada keadilan distributif dan discourse ethics.</w:t>
+        <w:t xml:space="preserve">Tiga hal di slide 20. Masukkan biaya kesehatan warga, pemulihan sungai, dan penutupan pembangkit ke neraca sejak perencanaan. Beri keterwakilan resmi untuk pekerja, warga, dan masyarakat adat di panitia keselamatan dan perizinan. Dan uji setiap klaim keberlanjutan dengan lebih dari satu teori sebelum dipublikasikan.</w:t>
       </w:r>
     </w:p>
     <w:p>
@@ -7037,7 +6969,7 @@
           <w:sz w:val="21"/>
           <w:szCs w:val="21"/>
         </w:rPr>
-        <w:t xml:space="preserve">7.  Mengapa perlu sembilan teori, tidak cukup satu?</w:t>
+        <w:t xml:space="preserve">7.  Kenapa harus sembilan teori? Satu saja tidak cukup?</w:t>
       </w:r>
     </w:p>
     <w:p>
@@ -7058,7 +6990,7 @@
           <w:sz w:val="21"/>
           <w:szCs w:val="21"/>
         </w:rPr>
-        <w:t xml:space="preserve">Karena struktur kasusnya. Manfaatnya terukur dan terkonsentrasi, bebannya tersebar dan tertunda. Kriteria tunggal cenderung hanya menangkap salah satu sisi. Justru ketika sembilan teori dengan premis berbeda bermuara pada arah yang sama, kesimpulannya menjadi jauh lebih kuat daripada kesimpulan satu teori.</w:t>
+        <w:t xml:space="preserve">Karena bentuk kasusnya: manfaat menumpuk di satu sisi, beban menyebar di sisi lain. Satu kriteria hanya menangkap satu sisi. Kekuatan analisis ini justru di konvergensinya: sembilan sudut pandang yang asumsinya berbeda-beda ternyata menunjuk arah yang sama, dan itu jauh lebih meyakinkan daripada satu teori.</w:t>
       </w:r>
     </w:p>
     <w:p>
@@ -7076,7 +7008,7 @@
           <w:sz w:val="21"/>
           <w:szCs w:val="21"/>
         </w:rPr>
-        <w:t xml:space="preserve">8.  Dari mana angka-angka pada bagian kasus diambil?</w:t>
+        <w:t xml:space="preserve">8.  Angka-angkanya dari mana?</w:t>
       </w:r>
     </w:p>
     <w:p>
@@ -7097,7 +7029,7 @@
           <w:sz w:val="21"/>
           <w:szCs w:val="21"/>
         </w:rPr>
-        <w:t xml:space="preserve">Dari pengelola kawasan IMIP dan IWIP, Badan Pusat Statistik, dan dokumen putusan panel WTO, ditelusuri pada Agustus 2026. Perlu kami sampaikan bahwa kasus ini masih berjalan, sehingga sebagian angka akan berubah pada tahun berikutnya.</w:t>
+        <w:t xml:space="preserve">Dari pengelola kawasan IMIP dan IWIP, Badan Pusat Statistik, dan dokumen putusan panel WTO, kami telusuri per Agustus 2026. Kasusnya masih berjalan, jadi sebagian angka akan berubah tahun depan.</w:t>
       </w:r>
     </w:p>
     <w:p>
@@ -7139,7 +7071,7 @@
           <w:sz w:val="22"/>
           <w:szCs w:val="22"/>
         </w:rPr>
-        <w:t xml:space="preserve">Angka pada tabel ini muncul pada slide 15 sampai 19. Simpan sebagai lembar contekan supaya tidak perlu kembali ke slide ketika menjawab pertanyaan.</w:t>
+        <w:t xml:space="preserve">Angka pada tabel ini muncul di slide 15 sampai 19. Simpan sebagai lembar contekan supaya tidak perlu kembali ke slide saat menjawab pertanyaan.</w:t>
       </w:r>
     </w:p>
     <w:tbl>
@@ -7323,7 +7255,7 @@
                 <w:sz w:val="19"/>
                 <w:szCs w:val="19"/>
               </w:rPr>
-              <w:t xml:space="preserve">Nilai ekspor produk nikel olahan pada 2025, naik dari 3 miliar dolar pada 2020</w:t>
+              <w:t xml:space="preserve">Ekspor produk nikel olahan pada 2025, naik dari 3 miliar dolar pada 2020</w:t>
             </w:r>
           </w:p>
         </w:tc>
@@ -7406,7 +7338,7 @@
                 <w:sz w:val="19"/>
                 <w:szCs w:val="19"/>
               </w:rPr>
-              <w:t xml:space="preserve">Investasi terkumpul di kawasan IMIP Morowali sampai Desember 2025</w:t>
+              <w:t xml:space="preserve">Investasi yang terkumpul di kawasan IMIP Morowali sampai Desember 2025</w:t>
             </w:r>
           </w:p>
         </w:tc>
@@ -7821,7 +7753,7 @@
                 <w:sz w:val="19"/>
                 <w:szCs w:val="19"/>
               </w:rPr>
-              <w:t xml:space="preserve">Porsi pembangkit listrik tenaga uap yang dipegang industri nikel</w:t>
+              <w:t xml:space="preserve">Porsi pembangkit listrik batu bara yang dipegang industri nikel</w:t>
             </w:r>
           </w:p>
         </w:tc>
@@ -7987,7 +7919,7 @@
                 <w:sz w:val="19"/>
                 <w:szCs w:val="19"/>
               </w:rPr>
-              <w:t xml:space="preserve">Durasi lembur yang tercatat pada kawasan pengolahan</w:t>
+              <w:t xml:space="preserve">Durasi lembur yang tercatat di kawasan pengolahan</w:t>
             </w:r>
           </w:p>
         </w:tc>
@@ -8070,7 +8002,7 @@
                 <w:sz w:val="19"/>
                 <w:szCs w:val="19"/>
               </w:rPr>
-              <w:t xml:space="preserve">Perkiraan populasi O Hongana Manyawa yang terdampak</w:t>
+              <w:t xml:space="preserve">Perkiraan warga O Hongana Manyawa yang terdampak</w:t>
             </w:r>
           </w:p>
         </w:tc>
@@ -8236,7 +8168,7 @@
                 <w:sz w:val="19"/>
                 <w:szCs w:val="19"/>
               </w:rPr>
-              <w:t xml:space="preserve">Panel WTO memutus kebijakan larangan ekspor melanggar aturan perdagangan</w:t>
+              <w:t xml:space="preserve">Panel WTO memutus larangan ekspor melanggar aturan perdagangan</w:t>
             </w:r>
           </w:p>
         </w:tc>
@@ -8324,7 +8256,7 @@
                 <w:sz w:val="20"/>
                 <w:szCs w:val="20"/>
               </w:rPr>
-              <w:t xml:space="preserve">Seluruh angka ditelusuri pada Agustus 2026 dari pengelola kawasan IMIP dan IWIP, Badan Pusat Statistik, serta dokumen putusan panel WTO. Kasus ini masih berjalan, sehingga sebagian angka akan berubah pada tahun berikutnya. Sebutkan batas waktu ini bila ada yang menanyakan sumber.</w:t>
+              <w:t xml:space="preserve">Seluruh angka ditelusuri pada Agustus 2026 dari pengelola kawasan IMIP dan IWIP, Badan Pusat Statistik, serta dokumen putusan panel WTO. Kasus ini masih berjalan, jadi sebagian angka akan berubah pada tahun berikutnya. Sebutkan batas waktu ini bila ada yang menanyakan sumber.</w:t>
             </w:r>
           </w:p>
         </w:tc>

</xml_diff>